<commit_message>
Distill the Oct 12 broadcasts into a core insight section.
The front of the note now keeps seven judgments, five position rules, and this week's confirmation order, with the sourced chapters left behind them.

Co-authored-by: choijunh-cloud <choijunh-cloud@users.noreply.github.com>
</commit_message>
<xml_diff>
--- a/lectures/10월 12일 금리와 국장 (CPI, 삼성전자, 장비, 마린솔루션).docx
+++ b/lectures/10월 12일 금리와 국장 (CPI, 삼성전자, 장비, 마린솔루션).docx
@@ -342,7 +342,7 @@
                 <w:color w:val="1A1A1A"/>
                 <w:sz w:val="19"/>
               </w:rPr>
-              <w:t>1</w:t>
+              <w:t>핵심</w:t>
             </w:r>
           </w:p>
         </w:tc>
@@ -371,7 +371,7 @@
                 <w:color w:val="1A1A1A"/>
                 <w:sz w:val="19"/>
               </w:rPr>
-              <w:t>장기금리</w:t>
+              <w:t>투자 인사이트</w:t>
             </w:r>
           </w:p>
         </w:tc>
@@ -400,7 +400,7 @@
                 <w:color w:val="1A1A1A"/>
                 <w:sz w:val="19"/>
               </w:rPr>
-              <w:t>중동·해외매도·회사채. 채권이 싼 것과 주식이 받는 할인</w:t>
+              <w:t>할인율, 정책, 채권, 국장, 삼성, 장비, 시계가 다른 자리</w:t>
             </w:r>
           </w:p>
         </w:tc>
@@ -434,7 +434,7 @@
                 <w:color w:val="1A1A1A"/>
                 <w:sz w:val="19"/>
               </w:rPr>
-              <w:t>2</w:t>
+              <w:t>1</w:t>
             </w:r>
           </w:p>
         </w:tc>
@@ -463,7 +463,7 @@
                 <w:color w:val="1A1A1A"/>
                 <w:sz w:val="19"/>
               </w:rPr>
-              <w:t>CPI · 연준</w:t>
+              <w:t>장기금리</w:t>
             </w:r>
           </w:p>
         </w:tc>
@@ -492,7 +492,7 @@
                 <w:color w:val="1A1A1A"/>
                 <w:sz w:val="19"/>
               </w:rPr>
-              <w:t>8월 물가, 9월 결과 세 갈래, 인상/동결, 트위스트와 YCC</w:t>
+              <w:t>중동·해외매도·회사채. 채권이 싼 것과 주식이 받는 할인</w:t>
             </w:r>
           </w:p>
         </w:tc>
@@ -526,7 +526,7 @@
                 <w:color w:val="1A1A1A"/>
                 <w:sz w:val="19"/>
               </w:rPr>
-              <w:t>3</w:t>
+              <w:t>2</w:t>
             </w:r>
           </w:p>
         </w:tc>
@@ -555,7 +555,7 @@
                 <w:color w:val="1A1A1A"/>
                 <w:sz w:val="19"/>
               </w:rPr>
-              <w:t>국장 대응</w:t>
+              <w:t>CPI · 연준</w:t>
             </w:r>
           </w:p>
         </w:tc>
@@ -584,7 +584,7 @@
                 <w:color w:val="1A1A1A"/>
                 <w:sz w:val="19"/>
               </w:rPr>
-              <w:t>6,400 이탈의 주체, 되돌림, 물타기와 현금의 차이</w:t>
+              <w:t>8월 물가, 9월 결과 세 갈래, 인상/동결, 트위스트와 YCC</w:t>
             </w:r>
           </w:p>
         </w:tc>
@@ -618,7 +618,7 @@
                 <w:color w:val="1A1A1A"/>
                 <w:sz w:val="19"/>
               </w:rPr>
-              <w:t>4</w:t>
+              <w:t>3</w:t>
             </w:r>
           </w:p>
         </w:tc>
@@ -647,7 +647,7 @@
                 <w:color w:val="1A1A1A"/>
                 <w:sz w:val="19"/>
               </w:rPr>
-              <w:t>삼성전자</w:t>
+              <w:t>국장 대응</w:t>
             </w:r>
           </w:p>
         </w:tc>
@@ -676,7 +676,7 @@
                 <w:color w:val="1A1A1A"/>
                 <w:sz w:val="19"/>
               </w:rPr>
-              <w:t>110조 원 이익, 3배 PER, 금산법, HBM4 점유율</w:t>
+              <w:t>6,400 이탈의 주체, 되돌림, 물타기와 현금의 차이</w:t>
             </w:r>
           </w:p>
         </w:tc>
@@ -710,7 +710,7 @@
                 <w:color w:val="1A1A1A"/>
                 <w:sz w:val="19"/>
               </w:rPr>
-              <w:t>5</w:t>
+              <w:t>4</w:t>
             </w:r>
           </w:p>
         </w:tc>
@@ -739,7 +739,7 @@
                 <w:color w:val="1A1A1A"/>
                 <w:sz w:val="19"/>
               </w:rPr>
-              <w:t>장비 · 솔리다임</w:t>
+              <w:t>삼성전자</w:t>
             </w:r>
           </w:p>
         </w:tc>
@@ -768,7 +768,7 @@
                 <w:color w:val="1A1A1A"/>
                 <w:sz w:val="19"/>
               </w:rPr>
-              <w:t>글로벌 4사 수주와 국내 소부장 온도차</w:t>
+              <w:t>110조 원 이익, 3배 PER, 금산법, HBM4 점유율</w:t>
             </w:r>
           </w:p>
         </w:tc>
@@ -802,7 +802,7 @@
                 <w:color w:val="1A1A1A"/>
                 <w:sz w:val="19"/>
               </w:rPr>
-              <w:t>6</w:t>
+              <w:t>5</w:t>
             </w:r>
           </w:p>
         </w:tc>
@@ -831,7 +831,7 @@
                 <w:color w:val="1A1A1A"/>
                 <w:sz w:val="19"/>
               </w:rPr>
-              <w:t>마린솔루션</w:t>
+              <w:t>장비 · 솔리다임</w:t>
             </w:r>
           </w:p>
         </w:tc>
@@ -860,7 +860,7 @@
                 <w:color w:val="1A1A1A"/>
                 <w:sz w:val="19"/>
               </w:rPr>
-              <w:t>Goltens 15배, 벙커링 BEP, AM 마진, 27년 PER 23배</w:t>
+              <w:t>글로벌 4사 수주와 국내 소부장 온도차</w:t>
             </w:r>
           </w:p>
         </w:tc>
@@ -894,7 +894,7 @@
                 <w:color w:val="1A1A1A"/>
                 <w:sz w:val="19"/>
               </w:rPr>
-              <w:t>7</w:t>
+              <w:t>6</w:t>
             </w:r>
           </w:p>
         </w:tc>
@@ -923,7 +923,7 @@
                 <w:color w:val="1A1A1A"/>
                 <w:sz w:val="19"/>
               </w:rPr>
-              <w:t>종목 원칙</w:t>
+              <w:t>마린솔루션</w:t>
             </w:r>
           </w:p>
         </w:tc>
@@ -931,6 +931,98 @@
           <w:tcPr>
             <w:tcW w:type="dxa" w:w="6917"/>
             <w:shd w:val="clear" w:color="auto" w:fill="FFFFFF"/>
+            <w:tcMar>
+              <w:top w:w="60" w:type="dxa"/>
+              <w:left w:w="80" w:type="dxa"/>
+              <w:bottom w:w="60" w:type="dxa"/>
+              <w:right w:w="80" w:type="dxa"/>
+            </w:tcMar>
+          </w:tcPr>
+          <w:p>
+            <w:pPr>
+              <w:spacing w:before="0" w:after="0" w:line="269" w:lineRule="auto"/>
+              <w:jc w:val="center"/>
+            </w:pPr>
+            <w:r/>
+            <w:r>
+              <w:rPr>
+                <w:rFonts w:ascii="맑은 고딕" w:hAnsi="맑은 고딕" w:eastAsia="맑은 고딕"/>
+                <w:b w:val="0"/>
+                <w:i w:val="0"/>
+                <w:color w:val="1A1A1A"/>
+                <w:sz w:val="19"/>
+              </w:rPr>
+              <w:t>Goltens 15배, 벙커링 BEP, AM 마진, 27년 PER 23배</w:t>
+            </w:r>
+          </w:p>
+        </w:tc>
+      </w:tr>
+      <w:tr>
+        <w:trPr>
+          <w:cantSplit/>
+        </w:trPr>
+        <w:tc>
+          <w:tcPr>
+            <w:tcW w:type="dxa" w:w="1020"/>
+            <w:shd w:val="clear" w:color="auto" w:fill="F7F9FC"/>
+            <w:tcMar>
+              <w:top w:w="60" w:type="dxa"/>
+              <w:left w:w="80" w:type="dxa"/>
+              <w:bottom w:w="60" w:type="dxa"/>
+              <w:right w:w="80" w:type="dxa"/>
+            </w:tcMar>
+          </w:tcPr>
+          <w:p>
+            <w:pPr>
+              <w:spacing w:before="0" w:after="0" w:line="269" w:lineRule="auto"/>
+              <w:jc w:val="left"/>
+            </w:pPr>
+            <w:r/>
+            <w:r>
+              <w:rPr>
+                <w:rFonts w:ascii="맑은 고딕" w:hAnsi="맑은 고딕" w:eastAsia="맑은 고딕"/>
+                <w:b/>
+                <w:i w:val="0"/>
+                <w:color w:val="1A1A1A"/>
+                <w:sz w:val="19"/>
+              </w:rPr>
+              <w:t>7</w:t>
+            </w:r>
+          </w:p>
+        </w:tc>
+        <w:tc>
+          <w:tcPr>
+            <w:tcW w:type="dxa" w:w="2041"/>
+            <w:shd w:val="clear" w:color="auto" w:fill="F7F9FC"/>
+            <w:tcMar>
+              <w:top w:w="60" w:type="dxa"/>
+              <w:left w:w="80" w:type="dxa"/>
+              <w:bottom w:w="60" w:type="dxa"/>
+              <w:right w:w="80" w:type="dxa"/>
+            </w:tcMar>
+          </w:tcPr>
+          <w:p>
+            <w:pPr>
+              <w:spacing w:before="0" w:after="0" w:line="269" w:lineRule="auto"/>
+              <w:jc w:val="center"/>
+            </w:pPr>
+            <w:r/>
+            <w:r>
+              <w:rPr>
+                <w:rFonts w:ascii="맑은 고딕" w:hAnsi="맑은 고딕" w:eastAsia="맑은 고딕"/>
+                <w:b w:val="0"/>
+                <w:i w:val="0"/>
+                <w:color w:val="1A1A1A"/>
+                <w:sz w:val="19"/>
+              </w:rPr>
+              <w:t>종목 원칙</w:t>
+            </w:r>
+          </w:p>
+        </w:tc>
+        <w:tc>
+          <w:tcPr>
+            <w:tcW w:type="dxa" w:w="6917"/>
+            <w:shd w:val="clear" w:color="auto" w:fill="F7F9FC"/>
             <w:tcMar>
               <w:top w:w="60" w:type="dxa"/>
               <w:left w:w="80" w:type="dxa"/>
@@ -992,7 +1084,1661 @@
           <w:color w:val="1A1A1A"/>
           <w:sz w:val="22"/>
         </w:rPr>
-        <w:t>오늘은 종목을 늘리는 날이 아니라 금리를 읽는 날입니다. 일본은 스포츠의 날로 쉬고, 미국은 주식이 열리더라도 채권·외환이 쉬는 날입니다. 그 공백에서 코스피가 박스 하단을 깨고 종가를 저가에 찍었습니다. 먼저 장기금리가 왜 여기까지 왔는지, CPI가 10월 연준을 어떻게 가르는지, 그다음 삼성전자와 장비, 마지막에 조선 노출을 서비스로 갖고 싶은 자리인 HD현대마린솔루션을 보겠습니다.</w:t>
+        <w:t>오늘은 종목을 늘리는 날이 아니라 금리를 읽는 날입니다. 일본은 스포츠의 날로 쉬고, 미국은 주식이 열리더라도 채권·외환이 쉬는 날입니다. 그 공백에서 코스피가 박스 하단을 깨고 종가를 저가에 찍었습니다. 앞의 증류가 오늘의 판단이고, 뒤의 파트는 그 판단의 근거입니다.</w:t>
+      </w:r>
+    </w:p>
+    <w:p>
+      <w:pPr>
+        <w:spacing w:before="280" w:after="160" w:line="264" w:lineRule="auto"/>
+        <w:pBdr>
+          <w:bottom w:val="single" w:sz="12" w:space="4" w:color="0F2043"/>
+        </w:pBdr>
+        <w:keepNext/>
+      </w:pPr>
+      <w:r>
+        <w:rPr>
+          <w:rFonts w:ascii="맑은 고딕" w:hAnsi="맑은 고딕" w:eastAsia="맑은 고딕"/>
+          <w:b/>
+          <w:i w:val="0"/>
+          <w:color w:val="B8943A"/>
+          <w:sz w:val="32"/>
+        </w:rPr>
+        <w:t xml:space="preserve">핵심  </w:t>
+      </w:r>
+      <w:r>
+        <w:rPr>
+          <w:rFonts w:ascii="맑은 고딕" w:hAnsi="맑은 고딕" w:eastAsia="맑은 고딕"/>
+          <w:b/>
+          <w:i w:val="0"/>
+          <w:color w:val="0F2043"/>
+          <w:sz w:val="32"/>
+        </w:rPr>
+        <w:t>증류한 투자 인사이트</w:t>
+      </w:r>
+    </w:p>
+    <w:tbl>
+      <w:tblPr>
+        <w:tblW w:type="auto" w:w="0"/>
+        <w:jc w:val="center"/>
+        <w:tblLayout w:type="autofit"/>
+        <w:tblLook w:firstColumn="1" w:firstRow="1" w:lastColumn="0" w:lastRow="0" w:noHBand="0" w:noVBand="1" w:val="04A0"/>
+      </w:tblPr>
+      <w:tblGrid>
+        <w:gridCol w:w="10092"/>
+      </w:tblGrid>
+      <w:tr>
+        <w:trPr>
+          <w:cantSplit/>
+        </w:trPr>
+        <w:tc>
+          <w:tcPr>
+            <w:tcW w:type="dxa" w:w="10092"/>
+            <w:shd w:val="clear" w:color="auto" w:fill="EEF2F8"/>
+            <w:tcBorders>
+              <w:top w:val="nil"/>
+              <w:left w:val="single" w:sz="28" w:space="0" w:color="0F2043"/>
+              <w:bottom w:val="nil"/>
+              <w:right w:val="nil"/>
+            </w:tcBorders>
+            <w:tcMar>
+              <w:top w:w="80" w:type="dxa"/>
+              <w:left w:w="120" w:type="dxa"/>
+              <w:bottom w:w="80" w:type="dxa"/>
+              <w:right w:w="120" w:type="dxa"/>
+            </w:tcMar>
+          </w:tcPr>
+          <w:p>
+            <w:pPr>
+              <w:spacing w:after="40" w:before="0"/>
+            </w:pPr>
+            <w:r/>
+            <w:r>
+              <w:rPr>
+                <w:rFonts w:ascii="맑은 고딕" w:hAnsi="맑은 고딕" w:eastAsia="맑은 고딕"/>
+                <w:b/>
+                <w:i w:val="0"/>
+                <w:color w:val="0F2043"/>
+                <w:sz w:val="20"/>
+              </w:rPr>
+              <w:t>한 줄</w:t>
+            </w:r>
+          </w:p>
+          <w:p>
+            <w:pPr>
+              <w:spacing w:after="20" w:before="0" w:line="276" w:lineRule="auto"/>
+            </w:pPr>
+            <w:r>
+              <w:rPr>
+                <w:rFonts w:ascii="맑은 고딕" w:hAnsi="맑은 고딕" w:eastAsia="맑은 고딕"/>
+                <w:b w:val="0"/>
+                <w:i w:val="0"/>
+                <w:color w:val="1A1A1A"/>
+                <w:sz w:val="21"/>
+              </w:rPr>
+              <w:t>오늘의 가격은 실적이 정하지 않습니다. 장기금리가 단기보다 더 오르는 기울기, 그리고 그 기울기가 한국 수급을 말리는 방식이 가격을 정합니다.</w:t>
+            </w:r>
+          </w:p>
+          <w:p>
+            <w:pPr>
+              <w:spacing w:after="20" w:before="0" w:line="276" w:lineRule="auto"/>
+            </w:pPr>
+            <w:r>
+              <w:rPr>
+                <w:rFonts w:ascii="맑은 고딕" w:hAnsi="맑은 고딕" w:eastAsia="맑은 고딕"/>
+                <w:b w:val="0"/>
+                <w:i w:val="0"/>
+                <w:color w:val="1A1A1A"/>
+                <w:sz w:val="21"/>
+              </w:rPr>
+              <w:t>아래 일곱 줄은 당일 방송의 판단만 남긴 것입니다. 숫자의 출처와 시각이 갈리는 지점은 뒤 파트에 있습니다.</w:t>
+            </w:r>
+          </w:p>
+        </w:tc>
+      </w:tr>
+    </w:tbl>
+    <w:p>
+      <w:pPr>
+        <w:spacing w:after="120"/>
+      </w:pPr>
+    </w:p>
+    <w:p>
+      <w:pPr>
+        <w:spacing w:before="200" w:after="80"/>
+        <w:keepNext/>
+      </w:pPr>
+      <w:r>
+        <w:rPr>
+          <w:rFonts w:ascii="맑은 고딕" w:hAnsi="맑은 고딕" w:eastAsia="맑은 고딕"/>
+          <w:b/>
+          <w:i w:val="0"/>
+          <w:color w:val="1E407C"/>
+          <w:sz w:val="26"/>
+        </w:rPr>
+        <w:t>일곱 판단</w:t>
+      </w:r>
+    </w:p>
+    <w:tbl>
+      <w:tblPr>
+        <w:tblW w:type="auto" w:w="0"/>
+        <w:jc w:val="center"/>
+        <w:tblLayout w:type="autofit"/>
+        <w:tblLook w:firstColumn="1" w:firstRow="1" w:lastColumn="0" w:lastRow="0" w:noHBand="0" w:noVBand="1" w:val="04A0"/>
+        <w:tblBorders>
+          <w:top w:val="single" w:sz="4" w:space="0" w:color="D5DCE6"/>
+          <w:left w:val="single" w:sz="4" w:space="0" w:color="D5DCE6"/>
+          <w:bottom w:val="single" w:sz="4" w:space="0" w:color="D5DCE6"/>
+          <w:right w:val="single" w:sz="4" w:space="0" w:color="D5DCE6"/>
+          <w:insideH w:val="single" w:sz="4" w:space="0" w:color="D5DCE6"/>
+          <w:insideV w:val="single" w:sz="4" w:space="0" w:color="D5DCE6"/>
+        </w:tblBorders>
+      </w:tblPr>
+      <w:tblGrid>
+        <w:gridCol w:w="3364"/>
+        <w:gridCol w:w="3364"/>
+        <w:gridCol w:w="3364"/>
+      </w:tblGrid>
+      <w:tr>
+        <w:trPr>
+          <w:cantSplit/>
+        </w:trPr>
+        <w:tc>
+          <w:tcPr>
+            <w:tcW w:type="dxa" w:w="1814"/>
+            <w:shd w:val="clear" w:color="auto" w:fill="0F2043"/>
+            <w:tcMar>
+              <w:top w:w="60" w:type="dxa"/>
+              <w:left w:w="80" w:type="dxa"/>
+              <w:bottom w:w="60" w:type="dxa"/>
+              <w:right w:w="80" w:type="dxa"/>
+            </w:tcMar>
+          </w:tcPr>
+          <w:p>
+            <w:pPr>
+              <w:spacing w:before="0" w:after="0" w:line="269" w:lineRule="auto"/>
+              <w:jc w:val="center"/>
+              <w:keepNext/>
+            </w:pPr>
+            <w:r/>
+            <w:r>
+              <w:rPr>
+                <w:rFonts w:ascii="맑은 고딕" w:hAnsi="맑은 고딕" w:eastAsia="맑은 고딕"/>
+                <w:b/>
+                <w:i w:val="0"/>
+                <w:color w:val="FFFFFF"/>
+                <w:sz w:val="19"/>
+              </w:rPr>
+              <w:t>판단</w:t>
+            </w:r>
+          </w:p>
+        </w:tc>
+        <w:tc>
+          <w:tcPr>
+            <w:tcW w:type="dxa" w:w="4195"/>
+            <w:shd w:val="clear" w:color="auto" w:fill="0F2043"/>
+            <w:tcMar>
+              <w:top w:w="60" w:type="dxa"/>
+              <w:left w:w="80" w:type="dxa"/>
+              <w:bottom w:w="60" w:type="dxa"/>
+              <w:right w:w="80" w:type="dxa"/>
+            </w:tcMar>
+          </w:tcPr>
+          <w:p>
+            <w:pPr>
+              <w:spacing w:before="0" w:after="0" w:line="269" w:lineRule="auto"/>
+              <w:jc w:val="center"/>
+              <w:keepNext/>
+            </w:pPr>
+            <w:r/>
+            <w:r>
+              <w:rPr>
+                <w:rFonts w:ascii="맑은 고딕" w:hAnsi="맑은 고딕" w:eastAsia="맑은 고딕"/>
+                <w:b/>
+                <w:i w:val="0"/>
+                <w:color w:val="FFFFFF"/>
+                <w:sz w:val="19"/>
+              </w:rPr>
+              <w:t>핵심</w:t>
+            </w:r>
+          </w:p>
+        </w:tc>
+        <w:tc>
+          <w:tcPr>
+            <w:tcW w:type="dxa" w:w="3969"/>
+            <w:shd w:val="clear" w:color="auto" w:fill="0F2043"/>
+            <w:tcMar>
+              <w:top w:w="60" w:type="dxa"/>
+              <w:left w:w="80" w:type="dxa"/>
+              <w:bottom w:w="60" w:type="dxa"/>
+              <w:right w:w="80" w:type="dxa"/>
+            </w:tcMar>
+          </w:tcPr>
+          <w:p>
+            <w:pPr>
+              <w:spacing w:before="0" w:after="0" w:line="269" w:lineRule="auto"/>
+              <w:jc w:val="center"/>
+              <w:keepNext/>
+            </w:pPr>
+            <w:r/>
+            <w:r>
+              <w:rPr>
+                <w:rFonts w:ascii="맑은 고딕" w:hAnsi="맑은 고딕" w:eastAsia="맑은 고딕"/>
+                <w:b/>
+                <w:i w:val="0"/>
+                <w:color w:val="FFFFFF"/>
+                <w:sz w:val="19"/>
+              </w:rPr>
+              <w:t>포지션에 대한 함의</w:t>
+            </w:r>
+          </w:p>
+        </w:tc>
+      </w:tr>
+      <w:tr>
+        <w:trPr>
+          <w:cantSplit/>
+        </w:trPr>
+        <w:tc>
+          <w:tcPr>
+            <w:tcW w:type="dxa" w:w="1814"/>
+            <w:shd w:val="clear" w:color="auto" w:fill="FFFFFF"/>
+            <w:tcMar>
+              <w:top w:w="60" w:type="dxa"/>
+              <w:left w:w="80" w:type="dxa"/>
+              <w:bottom w:w="60" w:type="dxa"/>
+              <w:right w:w="80" w:type="dxa"/>
+            </w:tcMar>
+          </w:tcPr>
+          <w:p>
+            <w:pPr>
+              <w:spacing w:before="0" w:after="0" w:line="269" w:lineRule="auto"/>
+              <w:jc w:val="left"/>
+            </w:pPr>
+            <w:r/>
+            <w:r>
+              <w:rPr>
+                <w:rFonts w:ascii="맑은 고딕" w:hAnsi="맑은 고딕" w:eastAsia="맑은 고딕"/>
+                <w:b/>
+                <w:i w:val="0"/>
+                <w:color w:val="1A1A1A"/>
+                <w:sz w:val="19"/>
+              </w:rPr>
+              <w:t>할인율</w:t>
+            </w:r>
+          </w:p>
+        </w:tc>
+        <w:tc>
+          <w:tcPr>
+            <w:tcW w:type="dxa" w:w="4195"/>
+            <w:shd w:val="clear" w:color="auto" w:fill="FFFFFF"/>
+            <w:tcMar>
+              <w:top w:w="60" w:type="dxa"/>
+              <w:left w:w="80" w:type="dxa"/>
+              <w:bottom w:w="60" w:type="dxa"/>
+              <w:right w:w="80" w:type="dxa"/>
+            </w:tcMar>
+          </w:tcPr>
+          <w:p>
+            <w:pPr>
+              <w:spacing w:before="0" w:after="0" w:line="269" w:lineRule="auto"/>
+              <w:jc w:val="center"/>
+            </w:pPr>
+            <w:r/>
+            <w:r>
+              <w:rPr>
+                <w:rFonts w:ascii="맑은 고딕" w:hAnsi="맑은 고딕" w:eastAsia="맑은 고딕"/>
+                <w:b w:val="0"/>
+                <w:i w:val="0"/>
+                <w:color w:val="1A1A1A"/>
+                <w:sz w:val="19"/>
+              </w:rPr>
+              <w:t>베어 스티프닝. 9월 CPI가 예상과 맞아도 10년·30년물은 오를 수 있음</w:t>
+            </w:r>
+          </w:p>
+        </w:tc>
+        <w:tc>
+          <w:tcPr>
+            <w:tcW w:type="dxa" w:w="3969"/>
+            <w:shd w:val="clear" w:color="auto" w:fill="FFFFFF"/>
+            <w:tcMar>
+              <w:top w:w="60" w:type="dxa"/>
+              <w:left w:w="80" w:type="dxa"/>
+              <w:bottom w:w="60" w:type="dxa"/>
+              <w:right w:w="80" w:type="dxa"/>
+            </w:tcMar>
+          </w:tcPr>
+          <w:p>
+            <w:pPr>
+              <w:spacing w:before="0" w:after="0" w:line="269" w:lineRule="auto"/>
+              <w:jc w:val="center"/>
+            </w:pPr>
+            <w:r/>
+            <w:r>
+              <w:rPr>
+                <w:rFonts w:ascii="맑은 고딕" w:hAnsi="맑은 고딕" w:eastAsia="맑은 고딕"/>
+                <w:b w:val="0"/>
+                <w:i w:val="0"/>
+                <w:color w:val="1A1A1A"/>
+                <w:sz w:val="19"/>
+              </w:rPr>
+              <w:t>헤드라인보다 10년물 기울기. 한국은 그 기울기를 삼성·하이닉스 비중으로 맞음</w:t>
+            </w:r>
+          </w:p>
+        </w:tc>
+      </w:tr>
+      <w:tr>
+        <w:trPr>
+          <w:cantSplit/>
+        </w:trPr>
+        <w:tc>
+          <w:tcPr>
+            <w:tcW w:type="dxa" w:w="1814"/>
+            <w:shd w:val="clear" w:color="auto" w:fill="F7F9FC"/>
+            <w:tcMar>
+              <w:top w:w="60" w:type="dxa"/>
+              <w:left w:w="80" w:type="dxa"/>
+              <w:bottom w:w="60" w:type="dxa"/>
+              <w:right w:w="80" w:type="dxa"/>
+            </w:tcMar>
+          </w:tcPr>
+          <w:p>
+            <w:pPr>
+              <w:spacing w:before="0" w:after="0" w:line="269" w:lineRule="auto"/>
+              <w:jc w:val="left"/>
+            </w:pPr>
+            <w:r/>
+            <w:r>
+              <w:rPr>
+                <w:rFonts w:ascii="맑은 고딕" w:hAnsi="맑은 고딕" w:eastAsia="맑은 고딕"/>
+                <w:b/>
+                <w:i w:val="0"/>
+                <w:color w:val="1A1A1A"/>
+                <w:sz w:val="19"/>
+              </w:rPr>
+              <w:t>정책 카드</w:t>
+            </w:r>
+          </w:p>
+        </w:tc>
+        <w:tc>
+          <w:tcPr>
+            <w:tcW w:type="dxa" w:w="4195"/>
+            <w:shd w:val="clear" w:color="auto" w:fill="F7F9FC"/>
+            <w:tcMar>
+              <w:top w:w="60" w:type="dxa"/>
+              <w:left w:w="80" w:type="dxa"/>
+              <w:bottom w:w="60" w:type="dxa"/>
+              <w:right w:w="80" w:type="dxa"/>
+            </w:tcMar>
+          </w:tcPr>
+          <w:p>
+            <w:pPr>
+              <w:spacing w:before="0" w:after="0" w:line="269" w:lineRule="auto"/>
+              <w:jc w:val="center"/>
+            </w:pPr>
+            <w:r/>
+            <w:r>
+              <w:rPr>
+                <w:rFonts w:ascii="맑은 고딕" w:hAnsi="맑은 고딕" w:eastAsia="맑은 고딕"/>
+                <w:b w:val="0"/>
+                <w:i w:val="0"/>
+                <w:color w:val="1A1A1A"/>
+                <w:sz w:val="19"/>
+              </w:rPr>
+              <w:t>바이백 월 약 600억 달러는 7월 해외 매도 1,200억 달러보다 작음. 순서는 바이백, SLR, 오퍼레이션 트위스트. YCC는 릭 라이더 본인 워딩이 아님</w:t>
+            </w:r>
+          </w:p>
+        </w:tc>
+        <w:tc>
+          <w:tcPr>
+            <w:tcW w:type="dxa" w:w="3969"/>
+            <w:shd w:val="clear" w:color="auto" w:fill="F7F9FC"/>
+            <w:tcMar>
+              <w:top w:w="60" w:type="dxa"/>
+              <w:left w:w="80" w:type="dxa"/>
+              <w:bottom w:w="60" w:type="dxa"/>
+              <w:right w:w="80" w:type="dxa"/>
+            </w:tcMar>
+          </w:tcPr>
+          <w:p>
+            <w:pPr>
+              <w:spacing w:before="0" w:after="0" w:line="269" w:lineRule="auto"/>
+              <w:jc w:val="center"/>
+            </w:pPr>
+            <w:r/>
+            <w:r>
+              <w:rPr>
+                <w:rFonts w:ascii="맑은 고딕" w:hAnsi="맑은 고딕" w:eastAsia="맑은 고딕"/>
+                <w:b w:val="0"/>
+                <w:i w:val="0"/>
+                <w:color w:val="1A1A1A"/>
+                <w:sz w:val="19"/>
+              </w:rPr>
+              <w:t>극단 금리를 기본값으로 두지 않음. 10년 5.5% 전에는 말이 카드</w:t>
+            </w:r>
+          </w:p>
+        </w:tc>
+      </w:tr>
+      <w:tr>
+        <w:trPr>
+          <w:cantSplit/>
+        </w:trPr>
+        <w:tc>
+          <w:tcPr>
+            <w:tcW w:type="dxa" w:w="1814"/>
+            <w:shd w:val="clear" w:color="auto" w:fill="FFFFFF"/>
+            <w:tcMar>
+              <w:top w:w="60" w:type="dxa"/>
+              <w:left w:w="80" w:type="dxa"/>
+              <w:bottom w:w="60" w:type="dxa"/>
+              <w:right w:w="80" w:type="dxa"/>
+            </w:tcMar>
+          </w:tcPr>
+          <w:p>
+            <w:pPr>
+              <w:spacing w:before="0" w:after="0" w:line="269" w:lineRule="auto"/>
+              <w:jc w:val="left"/>
+            </w:pPr>
+            <w:r/>
+            <w:r>
+              <w:rPr>
+                <w:rFonts w:ascii="맑은 고딕" w:hAnsi="맑은 고딕" w:eastAsia="맑은 고딕"/>
+                <w:b/>
+                <w:i w:val="0"/>
+                <w:color w:val="1A1A1A"/>
+                <w:sz w:val="19"/>
+              </w:rPr>
+              <w:t>채권</w:t>
+            </w:r>
+          </w:p>
+        </w:tc>
+        <w:tc>
+          <w:tcPr>
+            <w:tcW w:type="dxa" w:w="4195"/>
+            <w:shd w:val="clear" w:color="auto" w:fill="FFFFFF"/>
+            <w:tcMar>
+              <w:top w:w="60" w:type="dxa"/>
+              <w:left w:w="80" w:type="dxa"/>
+              <w:bottom w:w="60" w:type="dxa"/>
+              <w:right w:w="80" w:type="dxa"/>
+            </w:tcMar>
+          </w:tcPr>
+          <w:p>
+            <w:pPr>
+              <w:spacing w:before="0" w:after="0" w:line="269" w:lineRule="auto"/>
+              <w:jc w:val="center"/>
+            </w:pPr>
+            <w:r/>
+            <w:r>
+              <w:rPr>
+                <w:rFonts w:ascii="맑은 고딕" w:hAnsi="맑은 고딕" w:eastAsia="맑은 고딕"/>
+                <w:b w:val="0"/>
+                <w:i w:val="0"/>
+                <w:color w:val="1A1A1A"/>
+                <w:sz w:val="19"/>
+              </w:rPr>
+              <w:t>1시그마(약 30bp) 밖 급등은 이후 되밀린 사례가 많음. 15년물 10년 롤링 마이너스는 1936년 이후 두 번</w:t>
+            </w:r>
+          </w:p>
+        </w:tc>
+        <w:tc>
+          <w:tcPr>
+            <w:tcW w:type="dxa" w:w="3969"/>
+            <w:shd w:val="clear" w:color="auto" w:fill="FFFFFF"/>
+            <w:tcMar>
+              <w:top w:w="60" w:type="dxa"/>
+              <w:left w:w="80" w:type="dxa"/>
+              <w:bottom w:w="60" w:type="dxa"/>
+              <w:right w:w="80" w:type="dxa"/>
+            </w:tcMar>
+          </w:tcPr>
+          <w:p>
+            <w:pPr>
+              <w:spacing w:before="0" w:after="0" w:line="269" w:lineRule="auto"/>
+              <w:jc w:val="center"/>
+            </w:pPr>
+            <w:r/>
+            <w:r>
+              <w:rPr>
+                <w:rFonts w:ascii="맑은 고딕" w:hAnsi="맑은 고딕" w:eastAsia="맑은 고딕"/>
+                <w:b w:val="0"/>
+                <w:i w:val="0"/>
+                <w:color w:val="1A1A1A"/>
+                <w:sz w:val="19"/>
+              </w:rPr>
+              <w:t>살 수 있는 영역. 전량 매수 문장 아님. 채권 자금과 주식 자금의 성격은 다름</w:t>
+            </w:r>
+          </w:p>
+        </w:tc>
+      </w:tr>
+      <w:tr>
+        <w:trPr>
+          <w:cantSplit/>
+        </w:trPr>
+        <w:tc>
+          <w:tcPr>
+            <w:tcW w:type="dxa" w:w="1814"/>
+            <w:shd w:val="clear" w:color="auto" w:fill="F7F9FC"/>
+            <w:tcMar>
+              <w:top w:w="60" w:type="dxa"/>
+              <w:left w:w="80" w:type="dxa"/>
+              <w:bottom w:w="60" w:type="dxa"/>
+              <w:right w:w="80" w:type="dxa"/>
+            </w:tcMar>
+          </w:tcPr>
+          <w:p>
+            <w:pPr>
+              <w:spacing w:before="0" w:after="0" w:line="269" w:lineRule="auto"/>
+              <w:jc w:val="left"/>
+            </w:pPr>
+            <w:r/>
+            <w:r>
+              <w:rPr>
+                <w:rFonts w:ascii="맑은 고딕" w:hAnsi="맑은 고딕" w:eastAsia="맑은 고딕"/>
+                <w:b/>
+                <w:i w:val="0"/>
+                <w:color w:val="1A1A1A"/>
+                <w:sz w:val="19"/>
+              </w:rPr>
+              <w:t>국장</w:t>
+            </w:r>
+          </w:p>
+        </w:tc>
+        <w:tc>
+          <w:tcPr>
+            <w:tcW w:type="dxa" w:w="4195"/>
+            <w:shd w:val="clear" w:color="auto" w:fill="F7F9FC"/>
+            <w:tcMar>
+              <w:top w:w="60" w:type="dxa"/>
+              <w:left w:w="80" w:type="dxa"/>
+              <w:bottom w:w="60" w:type="dxa"/>
+              <w:right w:w="80" w:type="dxa"/>
+            </w:tcMar>
+          </w:tcPr>
+          <w:p>
+            <w:pPr>
+              <w:spacing w:before="0" w:after="0" w:line="269" w:lineRule="auto"/>
+              <w:jc w:val="center"/>
+            </w:pPr>
+            <w:r/>
+            <w:r>
+              <w:rPr>
+                <w:rFonts w:ascii="맑은 고딕" w:hAnsi="맑은 고딕" w:eastAsia="맑은 고딕"/>
+                <w:b w:val="0"/>
+                <w:i w:val="0"/>
+                <w:color w:val="1A1A1A"/>
+                <w:sz w:val="19"/>
+              </w:rPr>
+              <w:t>6,400 이탈, 종가=저가. 코스피 약 -3.6%, 코스닥 약 -4.8%. 외국인은 영국계 매도와 미국계 매수가 공존</w:t>
+            </w:r>
+          </w:p>
+        </w:tc>
+        <w:tc>
+          <w:tcPr>
+            <w:tcW w:type="dxa" w:w="3969"/>
+            <w:shd w:val="clear" w:color="auto" w:fill="F7F9FC"/>
+            <w:tcMar>
+              <w:top w:w="60" w:type="dxa"/>
+              <w:left w:w="80" w:type="dxa"/>
+              <w:bottom w:w="60" w:type="dxa"/>
+              <w:right w:w="80" w:type="dxa"/>
+            </w:tcMar>
+          </w:tcPr>
+          <w:p>
+            <w:pPr>
+              <w:spacing w:before="0" w:after="0" w:line="269" w:lineRule="auto"/>
+              <w:jc w:val="center"/>
+            </w:pPr>
+            <w:r/>
+            <w:r>
+              <w:rPr>
+                <w:rFonts w:ascii="맑은 고딕" w:hAnsi="맑은 고딕" w:eastAsia="맑은 고딕"/>
+                <w:b w:val="0"/>
+                <w:i w:val="0"/>
+                <w:color w:val="1A1A1A"/>
+                <w:sz w:val="19"/>
+              </w:rPr>
+              <w:t>당일 손절·물타기는 보류. 미리 비운 현금만 주 후반 종가에 지수로 분할. 코스닥은 매수 제외. 열어 둔 아래는 5,900</w:t>
+            </w:r>
+          </w:p>
+        </w:tc>
+      </w:tr>
+      <w:tr>
+        <w:trPr>
+          <w:cantSplit/>
+        </w:trPr>
+        <w:tc>
+          <w:tcPr>
+            <w:tcW w:type="dxa" w:w="1814"/>
+            <w:shd w:val="clear" w:color="auto" w:fill="FFFFFF"/>
+            <w:tcMar>
+              <w:top w:w="60" w:type="dxa"/>
+              <w:left w:w="80" w:type="dxa"/>
+              <w:bottom w:w="60" w:type="dxa"/>
+              <w:right w:w="80" w:type="dxa"/>
+            </w:tcMar>
+          </w:tcPr>
+          <w:p>
+            <w:pPr>
+              <w:spacing w:before="0" w:after="0" w:line="269" w:lineRule="auto"/>
+              <w:jc w:val="left"/>
+            </w:pPr>
+            <w:r/>
+            <w:r>
+              <w:rPr>
+                <w:rFonts w:ascii="맑은 고딕" w:hAnsi="맑은 고딕" w:eastAsia="맑은 고딕"/>
+                <w:b/>
+                <w:i w:val="0"/>
+                <w:color w:val="1A1A1A"/>
+                <w:sz w:val="19"/>
+              </w:rPr>
+              <w:t>삼성·하이닉스</w:t>
+            </w:r>
+          </w:p>
+        </w:tc>
+        <w:tc>
+          <w:tcPr>
+            <w:tcW w:type="dxa" w:w="4195"/>
+            <w:shd w:val="clear" w:color="auto" w:fill="FFFFFF"/>
+            <w:tcMar>
+              <w:top w:w="60" w:type="dxa"/>
+              <w:left w:w="80" w:type="dxa"/>
+              <w:bottom w:w="60" w:type="dxa"/>
+              <w:right w:w="80" w:type="dxa"/>
+            </w:tcMar>
+          </w:tcPr>
+          <w:p>
+            <w:pPr>
+              <w:spacing w:before="0" w:after="0" w:line="269" w:lineRule="auto"/>
+              <w:jc w:val="center"/>
+            </w:pPr>
+            <w:r/>
+            <w:r>
+              <w:rPr>
+                <w:rFonts w:ascii="맑은 고딕" w:hAnsi="맑은 고딕" w:eastAsia="맑은 고딕"/>
+                <w:b w:val="0"/>
+                <w:i w:val="0"/>
+                <w:color w:val="1A1A1A"/>
+                <w:sz w:val="19"/>
+              </w:rPr>
+              <w:t>3분기 약 110조 원, 내년 PER 3.0~3.1배, PBR 1.4배. 금산법으로 소각이 막히고 15조 원은 직원 배정. 24.5만 원은 자동 지지가 아님</w:t>
+            </w:r>
+          </w:p>
+        </w:tc>
+        <w:tc>
+          <w:tcPr>
+            <w:tcW w:type="dxa" w:w="3969"/>
+            <w:shd w:val="clear" w:color="auto" w:fill="FFFFFF"/>
+            <w:tcMar>
+              <w:top w:w="60" w:type="dxa"/>
+              <w:left w:w="80" w:type="dxa"/>
+              <w:bottom w:w="60" w:type="dxa"/>
+              <w:right w:w="80" w:type="dxa"/>
+            </w:tcMar>
+          </w:tcPr>
+          <w:p>
+            <w:pPr>
+              <w:spacing w:before="0" w:after="0" w:line="269" w:lineRule="auto"/>
+              <w:jc w:val="center"/>
+            </w:pPr>
+            <w:r/>
+            <w:r>
+              <w:rPr>
+                <w:rFonts w:ascii="맑은 고딕" w:hAnsi="맑은 고딕" w:eastAsia="맑은 고딕"/>
+                <w:b w:val="0"/>
+                <w:i w:val="0"/>
+                <w:color w:val="1A1A1A"/>
+                <w:sz w:val="19"/>
+              </w:rPr>
+              <w:t>만든 비중은 유지. 신규는 현금만, 이탈 시 22~23만 원은 스케줄. 밸류와 점유율은 삼성, 하이닉스 매출도 성장</w:t>
+            </w:r>
+          </w:p>
+        </w:tc>
+      </w:tr>
+      <w:tr>
+        <w:trPr>
+          <w:cantSplit/>
+        </w:trPr>
+        <w:tc>
+          <w:tcPr>
+            <w:tcW w:type="dxa" w:w="1814"/>
+            <w:shd w:val="clear" w:color="auto" w:fill="F7F9FC"/>
+            <w:tcMar>
+              <w:top w:w="60" w:type="dxa"/>
+              <w:left w:w="80" w:type="dxa"/>
+              <w:bottom w:w="60" w:type="dxa"/>
+              <w:right w:w="80" w:type="dxa"/>
+            </w:tcMar>
+          </w:tcPr>
+          <w:p>
+            <w:pPr>
+              <w:spacing w:before="0" w:after="0" w:line="269" w:lineRule="auto"/>
+              <w:jc w:val="left"/>
+            </w:pPr>
+            <w:r/>
+            <w:r>
+              <w:rPr>
+                <w:rFonts w:ascii="맑은 고딕" w:hAnsi="맑은 고딕" w:eastAsia="맑은 고딕"/>
+                <w:b/>
+                <w:i w:val="0"/>
+                <w:color w:val="1A1A1A"/>
+                <w:sz w:val="19"/>
+              </w:rPr>
+              <w:t>장비</w:t>
+            </w:r>
+          </w:p>
+        </w:tc>
+        <w:tc>
+          <w:tcPr>
+            <w:tcW w:type="dxa" w:w="4195"/>
+            <w:shd w:val="clear" w:color="auto" w:fill="F7F9FC"/>
+            <w:tcMar>
+              <w:top w:w="60" w:type="dxa"/>
+              <w:left w:w="80" w:type="dxa"/>
+              <w:bottom w:w="60" w:type="dxa"/>
+              <w:right w:w="80" w:type="dxa"/>
+            </w:tcMar>
+          </w:tcPr>
+          <w:p>
+            <w:pPr>
+              <w:spacing w:before="0" w:after="0" w:line="269" w:lineRule="auto"/>
+              <w:jc w:val="center"/>
+            </w:pPr>
+            <w:r/>
+            <w:r>
+              <w:rPr>
+                <w:rFonts w:ascii="맑은 고딕" w:hAnsi="맑은 고딕" w:eastAsia="맑은 고딕"/>
+                <w:b w:val="0"/>
+                <w:i w:val="0"/>
+                <w:color w:val="1A1A1A"/>
+                <w:sz w:val="19"/>
+              </w:rPr>
+              <w:t>수요의 구조는 글로벌 4사. 국내 소부장은 그 신호를 먼저, 더 세게 가격에 넣음</w:t>
+            </w:r>
+          </w:p>
+        </w:tc>
+        <w:tc>
+          <w:tcPr>
+            <w:tcW w:type="dxa" w:w="3969"/>
+            <w:shd w:val="clear" w:color="auto" w:fill="F7F9FC"/>
+            <w:tcMar>
+              <w:top w:w="60" w:type="dxa"/>
+              <w:left w:w="80" w:type="dxa"/>
+              <w:bottom w:w="60" w:type="dxa"/>
+              <w:right w:w="80" w:type="dxa"/>
+            </w:tcMar>
+          </w:tcPr>
+          <w:p>
+            <w:pPr>
+              <w:spacing w:before="0" w:after="0" w:line="269" w:lineRule="auto"/>
+              <w:jc w:val="center"/>
+            </w:pPr>
+            <w:r/>
+            <w:r>
+              <w:rPr>
+                <w:rFonts w:ascii="맑은 고딕" w:hAnsi="맑은 고딕" w:eastAsia="맑은 고딕"/>
+                <w:b w:val="0"/>
+                <w:i w:val="0"/>
+                <w:color w:val="1A1A1A"/>
+                <w:sz w:val="19"/>
+              </w:rPr>
+              <w:t>단기 수익은 축소. 장기 바스켓은 ETF. 솔리다임 약 200조 원은 현재 주가에 없음. 단기에는 할인</w:t>
+            </w:r>
+          </w:p>
+        </w:tc>
+      </w:tr>
+      <w:tr>
+        <w:trPr>
+          <w:cantSplit/>
+        </w:trPr>
+        <w:tc>
+          <w:tcPr>
+            <w:tcW w:type="dxa" w:w="1814"/>
+            <w:shd w:val="clear" w:color="auto" w:fill="FFFFFF"/>
+            <w:tcMar>
+              <w:top w:w="60" w:type="dxa"/>
+              <w:left w:w="80" w:type="dxa"/>
+              <w:bottom w:w="60" w:type="dxa"/>
+              <w:right w:w="80" w:type="dxa"/>
+            </w:tcMar>
+          </w:tcPr>
+          <w:p>
+            <w:pPr>
+              <w:spacing w:before="0" w:after="0" w:line="269" w:lineRule="auto"/>
+              <w:jc w:val="left"/>
+            </w:pPr>
+            <w:r/>
+            <w:r>
+              <w:rPr>
+                <w:rFonts w:ascii="맑은 고딕" w:hAnsi="맑은 고딕" w:eastAsia="맑은 고딕"/>
+                <w:b/>
+                <w:i w:val="0"/>
+                <w:color w:val="1A1A1A"/>
+                <w:sz w:val="19"/>
+              </w:rPr>
+              <w:t>다른 시계</w:t>
+            </w:r>
+          </w:p>
+        </w:tc>
+        <w:tc>
+          <w:tcPr>
+            <w:tcW w:type="dxa" w:w="4195"/>
+            <w:shd w:val="clear" w:color="auto" w:fill="FFFFFF"/>
+            <w:tcMar>
+              <w:top w:w="60" w:type="dxa"/>
+              <w:left w:w="80" w:type="dxa"/>
+              <w:bottom w:w="60" w:type="dxa"/>
+              <w:right w:w="80" w:type="dxa"/>
+            </w:tcMar>
+          </w:tcPr>
+          <w:p>
+            <w:pPr>
+              <w:spacing w:before="0" w:after="0" w:line="269" w:lineRule="auto"/>
+              <w:jc w:val="center"/>
+            </w:pPr>
+            <w:r/>
+            <w:r>
+              <w:rPr>
+                <w:rFonts w:ascii="맑은 고딕" w:hAnsi="맑은 고딕" w:eastAsia="맑은 고딕"/>
+                <w:b w:val="0"/>
+                <w:i w:val="0"/>
+                <w:color w:val="1A1A1A"/>
+                <w:sz w:val="19"/>
+              </w:rPr>
+              <w:t>마린솔루션은 급락일 트레이딩이 아님. 전력 3사는 밴드 이탈. 현대차는 자동차 실물, SK텔레콤은 상장 일정</w:t>
+            </w:r>
+          </w:p>
+        </w:tc>
+        <w:tc>
+          <w:tcPr>
+            <w:tcW w:type="dxa" w:w="3969"/>
+            <w:shd w:val="clear" w:color="auto" w:fill="FFFFFF"/>
+            <w:tcMar>
+              <w:top w:w="60" w:type="dxa"/>
+              <w:left w:w="80" w:type="dxa"/>
+              <w:bottom w:w="60" w:type="dxa"/>
+              <w:right w:w="80" w:type="dxa"/>
+            </w:tcMar>
+          </w:tcPr>
+          <w:p>
+            <w:pPr>
+              <w:spacing w:before="0" w:after="0" w:line="269" w:lineRule="auto"/>
+              <w:jc w:val="center"/>
+            </w:pPr>
+            <w:r/>
+            <w:r>
+              <w:rPr>
+                <w:rFonts w:ascii="맑은 고딕" w:hAnsi="맑은 고딕" w:eastAsia="맑은 고딕"/>
+                <w:b w:val="0"/>
+                <w:i w:val="0"/>
+                <w:color w:val="1A1A1A"/>
+                <w:sz w:val="19"/>
+              </w:rPr>
+              <w:t>2028년 이익을 미리 받은 하락은 저가 매수 신호가 아님. ESS는 지수 공포만으로 팔 이유가 약함</w:t>
+            </w:r>
+          </w:p>
+        </w:tc>
+      </w:tr>
+    </w:tbl>
+    <w:p>
+      <w:pPr>
+        <w:spacing w:after="160" w:before="40"/>
+      </w:pPr>
+    </w:p>
+    <w:p>
+      <w:pPr>
+        <w:spacing w:before="200" w:after="80"/>
+        <w:keepNext/>
+      </w:pPr>
+      <w:r>
+        <w:rPr>
+          <w:rFonts w:ascii="맑은 고딕" w:hAnsi="맑은 고딕" w:eastAsia="맑은 고딕"/>
+          <w:b/>
+          <w:i w:val="0"/>
+          <w:color w:val="1E407C"/>
+          <w:sz w:val="26"/>
+        </w:rPr>
+        <w:t>다섯 규칙</w:t>
+      </w:r>
+    </w:p>
+    <w:p>
+      <w:pPr>
+        <w:spacing w:after="50" w:before="0" w:line="276" w:lineRule="auto"/>
+        <w:ind w:left="312" w:hanging="198"/>
+      </w:pPr>
+      <w:r>
+        <w:rPr>
+          <w:rFonts w:ascii="맑은 고딕" w:hAnsi="맑은 고딕" w:eastAsia="맑은 고딕"/>
+          <w:b w:val="0"/>
+          <w:i w:val="0"/>
+          <w:color w:val="1E407C"/>
+          <w:sz w:val="22"/>
+        </w:rPr>
+        <w:t xml:space="preserve">• </w:t>
+      </w:r>
+      <w:r>
+        <w:rPr>
+          <w:rFonts w:ascii="맑은 고딕" w:hAnsi="맑은 고딕" w:eastAsia="맑은 고딕"/>
+          <w:b w:val="0"/>
+          <w:i w:val="0"/>
+          <w:color w:val="1A1A1A"/>
+          <w:sz w:val="22"/>
+        </w:rPr>
+        <w:t>실적이 좋은 날의 하락을 실적 문장으로 위로하지 않습니다. 할인율을 봅니다.</w:t>
+      </w:r>
+    </w:p>
+    <w:p>
+      <w:pPr>
+        <w:spacing w:after="50" w:before="0" w:line="276" w:lineRule="auto"/>
+        <w:ind w:left="312" w:hanging="198"/>
+      </w:pPr>
+      <w:r>
+        <w:rPr>
+          <w:rFonts w:ascii="맑은 고딕" w:hAnsi="맑은 고딕" w:eastAsia="맑은 고딕"/>
+          <w:b w:val="0"/>
+          <w:i w:val="0"/>
+          <w:color w:val="1E407C"/>
+          <w:sz w:val="22"/>
+        </w:rPr>
+        <w:t xml:space="preserve">• </w:t>
+      </w:r>
+      <w:r>
+        <w:rPr>
+          <w:rFonts w:ascii="맑은 고딕" w:hAnsi="맑은 고딕" w:eastAsia="맑은 고딕"/>
+          <w:b w:val="0"/>
+          <w:i w:val="0"/>
+          <w:color w:val="1A1A1A"/>
+          <w:sz w:val="22"/>
+        </w:rPr>
+        <w:t>깨진 날에 결심하지 않습니다. 되돌림에서 박스 위로 복귀하는 종목과, 복귀하지 못하는 종목을 가릅니다.</w:t>
+      </w:r>
+    </w:p>
+    <w:p>
+      <w:pPr>
+        <w:spacing w:after="50" w:before="0" w:line="276" w:lineRule="auto"/>
+        <w:ind w:left="312" w:hanging="198"/>
+      </w:pPr>
+      <w:r>
+        <w:rPr>
+          <w:rFonts w:ascii="맑은 고딕" w:hAnsi="맑은 고딕" w:eastAsia="맑은 고딕"/>
+          <w:b w:val="0"/>
+          <w:i w:val="0"/>
+          <w:color w:val="1E407C"/>
+          <w:sz w:val="22"/>
+        </w:rPr>
+        <w:t xml:space="preserve">• </w:t>
+      </w:r>
+      <w:r>
+        <w:rPr>
+          <w:rFonts w:ascii="맑은 고딕" w:hAnsi="맑은 고딕" w:eastAsia="맑은 고딕"/>
+          <w:b w:val="0"/>
+          <w:i w:val="0"/>
+          <w:color w:val="1A1A1A"/>
+          <w:sz w:val="22"/>
+        </w:rPr>
+        <w:t>물린 비중을 더 사지 않습니다. 현금이었던 돈만 나눕니다. 반도체 비중이 이미 30~40%라면 더 줄이지 않습니다.</w:t>
+      </w:r>
+    </w:p>
+    <w:p>
+      <w:pPr>
+        <w:spacing w:after="50" w:before="0" w:line="276" w:lineRule="auto"/>
+        <w:ind w:left="312" w:hanging="198"/>
+      </w:pPr>
+      <w:r>
+        <w:rPr>
+          <w:rFonts w:ascii="맑은 고딕" w:hAnsi="맑은 고딕" w:eastAsia="맑은 고딕"/>
+          <w:b w:val="0"/>
+          <w:i w:val="0"/>
+          <w:color w:val="1E407C"/>
+          <w:sz w:val="22"/>
+        </w:rPr>
+        <w:t xml:space="preserve">• </w:t>
+      </w:r>
+      <w:r>
+        <w:rPr>
+          <w:rFonts w:ascii="맑은 고딕" w:hAnsi="맑은 고딕" w:eastAsia="맑은 고딕"/>
+          <w:b w:val="0"/>
+          <w:i w:val="0"/>
+          <w:color w:val="1A1A1A"/>
+          <w:sz w:val="22"/>
+        </w:rPr>
+        <w:t>오픈AI의 700억 달러와 500억 달러는 플랫폼 총액과 수수료를 뺀 순액입니다. 그 차이로 반도체 수요를 접지 않습니다.</w:t>
+      </w:r>
+    </w:p>
+    <w:p>
+      <w:pPr>
+        <w:spacing w:after="50" w:before="0" w:line="276" w:lineRule="auto"/>
+        <w:ind w:left="312" w:hanging="198"/>
+      </w:pPr>
+      <w:r>
+        <w:rPr>
+          <w:rFonts w:ascii="맑은 고딕" w:hAnsi="맑은 고딕" w:eastAsia="맑은 고딕"/>
+          <w:b w:val="0"/>
+          <w:i w:val="0"/>
+          <w:color w:val="1E407C"/>
+          <w:sz w:val="22"/>
+        </w:rPr>
+        <w:t xml:space="preserve">• </w:t>
+      </w:r>
+      <w:r>
+        <w:rPr>
+          <w:rFonts w:ascii="맑은 고딕" w:hAnsi="맑은 고딕" w:eastAsia="맑은 고딕"/>
+          <w:b w:val="0"/>
+          <w:i w:val="0"/>
+          <w:color w:val="1A1A1A"/>
+          <w:sz w:val="22"/>
+        </w:rPr>
+        <w:t>미국 지수 적립은 유지할 수 있습니다. 4년 상승의 고점에서 남은 현금을 한 번에 넣는 것, 한국을 비우고 미국만 채우는 것은 다른 결정입니다.</w:t>
+      </w:r>
+    </w:p>
+    <w:p>
+      <w:pPr>
+        <w:spacing w:before="200" w:after="80"/>
+        <w:keepNext/>
+      </w:pPr>
+      <w:r>
+        <w:rPr>
+          <w:rFonts w:ascii="맑은 고딕" w:hAnsi="맑은 고딕" w:eastAsia="맑은 고딕"/>
+          <w:b/>
+          <w:i w:val="0"/>
+          <w:color w:val="1E407C"/>
+          <w:sz w:val="26"/>
+        </w:rPr>
+        <w:t>이번 주 확인 순서</w:t>
+      </w:r>
+    </w:p>
+    <w:tbl>
+      <w:tblPr>
+        <w:tblW w:type="auto" w:w="0"/>
+        <w:jc w:val="center"/>
+        <w:tblLayout w:type="autofit"/>
+        <w:tblLook w:firstColumn="1" w:firstRow="1" w:lastColumn="0" w:lastRow="0" w:noHBand="0" w:noVBand="1" w:val="04A0"/>
+        <w:tblBorders>
+          <w:top w:val="single" w:sz="4" w:space="0" w:color="D5DCE6"/>
+          <w:left w:val="single" w:sz="4" w:space="0" w:color="D5DCE6"/>
+          <w:bottom w:val="single" w:sz="4" w:space="0" w:color="D5DCE6"/>
+          <w:right w:val="single" w:sz="4" w:space="0" w:color="D5DCE6"/>
+          <w:insideH w:val="single" w:sz="4" w:space="0" w:color="D5DCE6"/>
+          <w:insideV w:val="single" w:sz="4" w:space="0" w:color="D5DCE6"/>
+        </w:tblBorders>
+      </w:tblPr>
+      <w:tblGrid>
+        <w:gridCol w:w="3364"/>
+        <w:gridCol w:w="3364"/>
+        <w:gridCol w:w="3364"/>
+      </w:tblGrid>
+      <w:tr>
+        <w:trPr>
+          <w:cantSplit/>
+        </w:trPr>
+        <w:tc>
+          <w:tcPr>
+            <w:tcW w:type="dxa" w:w="1020"/>
+            <w:shd w:val="clear" w:color="auto" w:fill="0F2043"/>
+            <w:tcMar>
+              <w:top w:w="60" w:type="dxa"/>
+              <w:left w:w="80" w:type="dxa"/>
+              <w:bottom w:w="60" w:type="dxa"/>
+              <w:right w:w="80" w:type="dxa"/>
+            </w:tcMar>
+          </w:tcPr>
+          <w:p>
+            <w:pPr>
+              <w:spacing w:before="0" w:after="0" w:line="269" w:lineRule="auto"/>
+              <w:jc w:val="center"/>
+              <w:keepNext/>
+            </w:pPr>
+            <w:r/>
+            <w:r>
+              <w:rPr>
+                <w:rFonts w:ascii="맑은 고딕" w:hAnsi="맑은 고딕" w:eastAsia="맑은 고딕"/>
+                <w:b/>
+                <w:i w:val="0"/>
+                <w:color w:val="FFFFFF"/>
+                <w:sz w:val="19"/>
+              </w:rPr>
+              <w:t>순서</w:t>
+            </w:r>
+          </w:p>
+        </w:tc>
+        <w:tc>
+          <w:tcPr>
+            <w:tcW w:type="dxa" w:w="2948"/>
+            <w:shd w:val="clear" w:color="auto" w:fill="0F2043"/>
+            <w:tcMar>
+              <w:top w:w="60" w:type="dxa"/>
+              <w:left w:w="80" w:type="dxa"/>
+              <w:bottom w:w="60" w:type="dxa"/>
+              <w:right w:w="80" w:type="dxa"/>
+            </w:tcMar>
+          </w:tcPr>
+          <w:p>
+            <w:pPr>
+              <w:spacing w:before="0" w:after="0" w:line="269" w:lineRule="auto"/>
+              <w:jc w:val="center"/>
+              <w:keepNext/>
+            </w:pPr>
+            <w:r/>
+            <w:r>
+              <w:rPr>
+                <w:rFonts w:ascii="맑은 고딕" w:hAnsi="맑은 고딕" w:eastAsia="맑은 고딕"/>
+                <w:b/>
+                <w:i w:val="0"/>
+                <w:color w:val="FFFFFF"/>
+                <w:sz w:val="19"/>
+              </w:rPr>
+              <w:t>이벤트</w:t>
+            </w:r>
+          </w:p>
+        </w:tc>
+        <w:tc>
+          <w:tcPr>
+            <w:tcW w:type="dxa" w:w="6009"/>
+            <w:shd w:val="clear" w:color="auto" w:fill="0F2043"/>
+            <w:tcMar>
+              <w:top w:w="60" w:type="dxa"/>
+              <w:left w:w="80" w:type="dxa"/>
+              <w:bottom w:w="60" w:type="dxa"/>
+              <w:right w:w="80" w:type="dxa"/>
+            </w:tcMar>
+          </w:tcPr>
+          <w:p>
+            <w:pPr>
+              <w:spacing w:before="0" w:after="0" w:line="269" w:lineRule="auto"/>
+              <w:jc w:val="center"/>
+              <w:keepNext/>
+            </w:pPr>
+            <w:r/>
+            <w:r>
+              <w:rPr>
+                <w:rFonts w:ascii="맑은 고딕" w:hAnsi="맑은 고딕" w:eastAsia="맑은 고딕"/>
+                <w:b/>
+                <w:i w:val="0"/>
+                <w:color w:val="FFFFFF"/>
+                <w:sz w:val="19"/>
+              </w:rPr>
+              <w:t>판단이 유지되거나 깨지는 자리</w:t>
+            </w:r>
+          </w:p>
+        </w:tc>
+      </w:tr>
+      <w:tr>
+        <w:trPr>
+          <w:cantSplit/>
+        </w:trPr>
+        <w:tc>
+          <w:tcPr>
+            <w:tcW w:type="dxa" w:w="1020"/>
+            <w:shd w:val="clear" w:color="auto" w:fill="FFFFFF"/>
+            <w:tcMar>
+              <w:top w:w="60" w:type="dxa"/>
+              <w:left w:w="80" w:type="dxa"/>
+              <w:bottom w:w="60" w:type="dxa"/>
+              <w:right w:w="80" w:type="dxa"/>
+            </w:tcMar>
+          </w:tcPr>
+          <w:p>
+            <w:pPr>
+              <w:spacing w:before="0" w:after="0" w:line="269" w:lineRule="auto"/>
+              <w:jc w:val="left"/>
+            </w:pPr>
+            <w:r/>
+            <w:r>
+              <w:rPr>
+                <w:rFonts w:ascii="맑은 고딕" w:hAnsi="맑은 고딕" w:eastAsia="맑은 고딕"/>
+                <w:b/>
+                <w:i w:val="0"/>
+                <w:color w:val="1A1A1A"/>
+                <w:sz w:val="19"/>
+              </w:rPr>
+              <w:t>1</w:t>
+            </w:r>
+          </w:p>
+        </w:tc>
+        <w:tc>
+          <w:tcPr>
+            <w:tcW w:type="dxa" w:w="2948"/>
+            <w:shd w:val="clear" w:color="auto" w:fill="FFFFFF"/>
+            <w:tcMar>
+              <w:top w:w="60" w:type="dxa"/>
+              <w:left w:w="80" w:type="dxa"/>
+              <w:bottom w:w="60" w:type="dxa"/>
+              <w:right w:w="80" w:type="dxa"/>
+            </w:tcMar>
+          </w:tcPr>
+          <w:p>
+            <w:pPr>
+              <w:spacing w:before="0" w:after="0" w:line="269" w:lineRule="auto"/>
+              <w:jc w:val="center"/>
+            </w:pPr>
+            <w:r/>
+            <w:r>
+              <w:rPr>
+                <w:rFonts w:ascii="맑은 고딕" w:hAnsi="맑은 고딕" w:eastAsia="맑은 고딕"/>
+                <w:b w:val="0"/>
+                <w:i w:val="0"/>
+                <w:color w:val="1A1A1A"/>
+                <w:sz w:val="19"/>
+              </w:rPr>
+              <w:t>14일 밤, 9월 CPI</w:t>
+            </w:r>
+          </w:p>
+        </w:tc>
+        <w:tc>
+          <w:tcPr>
+            <w:tcW w:type="dxa" w:w="6009"/>
+            <w:shd w:val="clear" w:color="auto" w:fill="FFFFFF"/>
+            <w:tcMar>
+              <w:top w:w="60" w:type="dxa"/>
+              <w:left w:w="80" w:type="dxa"/>
+              <w:bottom w:w="60" w:type="dxa"/>
+              <w:right w:w="80" w:type="dxa"/>
+            </w:tcMar>
+          </w:tcPr>
+          <w:p>
+            <w:pPr>
+              <w:spacing w:before="0" w:after="0" w:line="269" w:lineRule="auto"/>
+              <w:jc w:val="center"/>
+            </w:pPr>
+            <w:r/>
+            <w:r>
+              <w:rPr>
+                <w:rFonts w:ascii="맑은 고딕" w:hAnsi="맑은 고딕" w:eastAsia="맑은 고딕"/>
+                <w:b w:val="0"/>
+                <w:i w:val="0"/>
+                <w:color w:val="1A1A1A"/>
+                <w:sz w:val="19"/>
+              </w:rPr>
+              <w:t>10년물 기울기. 부합·상회면 할인율은 남고, 하회여도 장기물 하락은 제한될 수 있음</w:t>
+            </w:r>
+          </w:p>
+        </w:tc>
+      </w:tr>
+      <w:tr>
+        <w:trPr>
+          <w:cantSplit/>
+        </w:trPr>
+        <w:tc>
+          <w:tcPr>
+            <w:tcW w:type="dxa" w:w="1020"/>
+            <w:shd w:val="clear" w:color="auto" w:fill="F7F9FC"/>
+            <w:tcMar>
+              <w:top w:w="60" w:type="dxa"/>
+              <w:left w:w="80" w:type="dxa"/>
+              <w:bottom w:w="60" w:type="dxa"/>
+              <w:right w:w="80" w:type="dxa"/>
+            </w:tcMar>
+          </w:tcPr>
+          <w:p>
+            <w:pPr>
+              <w:spacing w:before="0" w:after="0" w:line="269" w:lineRule="auto"/>
+              <w:jc w:val="left"/>
+            </w:pPr>
+            <w:r/>
+            <w:r>
+              <w:rPr>
+                <w:rFonts w:ascii="맑은 고딕" w:hAnsi="맑은 고딕" w:eastAsia="맑은 고딕"/>
+                <w:b/>
+                <w:i w:val="0"/>
+                <w:color w:val="1A1A1A"/>
+                <w:sz w:val="19"/>
+              </w:rPr>
+              <w:t>2</w:t>
+            </w:r>
+          </w:p>
+        </w:tc>
+        <w:tc>
+          <w:tcPr>
+            <w:tcW w:type="dxa" w:w="2948"/>
+            <w:shd w:val="clear" w:color="auto" w:fill="F7F9FC"/>
+            <w:tcMar>
+              <w:top w:w="60" w:type="dxa"/>
+              <w:left w:w="80" w:type="dxa"/>
+              <w:bottom w:w="60" w:type="dxa"/>
+              <w:right w:w="80" w:type="dxa"/>
+            </w:tcMar>
+          </w:tcPr>
+          <w:p>
+            <w:pPr>
+              <w:spacing w:before="0" w:after="0" w:line="269" w:lineRule="auto"/>
+              <w:jc w:val="center"/>
+            </w:pPr>
+            <w:r/>
+            <w:r>
+              <w:rPr>
+                <w:rFonts w:ascii="맑은 고딕" w:hAnsi="맑은 고딕" w:eastAsia="맑은 고딕"/>
+                <w:b w:val="0"/>
+                <w:i w:val="0"/>
+                <w:color w:val="1A1A1A"/>
+                <w:sz w:val="19"/>
+              </w:rPr>
+              <w:t>국장 되돌림</w:t>
+            </w:r>
+          </w:p>
+        </w:tc>
+        <w:tc>
+          <w:tcPr>
+            <w:tcW w:type="dxa" w:w="6009"/>
+            <w:shd w:val="clear" w:color="auto" w:fill="F7F9FC"/>
+            <w:tcMar>
+              <w:top w:w="60" w:type="dxa"/>
+              <w:left w:w="80" w:type="dxa"/>
+              <w:bottom w:w="60" w:type="dxa"/>
+              <w:right w:w="80" w:type="dxa"/>
+            </w:tcMar>
+          </w:tcPr>
+          <w:p>
+            <w:pPr>
+              <w:spacing w:before="0" w:after="0" w:line="269" w:lineRule="auto"/>
+              <w:jc w:val="center"/>
+            </w:pPr>
+            <w:r/>
+            <w:r>
+              <w:rPr>
+                <w:rFonts w:ascii="맑은 고딕" w:hAnsi="맑은 고딕" w:eastAsia="맑은 고딕"/>
+                <w:b w:val="0"/>
+                <w:i w:val="0"/>
+                <w:color w:val="1A1A1A"/>
+                <w:sz w:val="19"/>
+              </w:rPr>
+              <w:t>6,600 박스와 11일선 위로 복귀하면 보수 모드를 거둠. 복귀 실패는 6,000을 열어 둠</w:t>
+            </w:r>
+          </w:p>
+        </w:tc>
+      </w:tr>
+      <w:tr>
+        <w:trPr>
+          <w:cantSplit/>
+        </w:trPr>
+        <w:tc>
+          <w:tcPr>
+            <w:tcW w:type="dxa" w:w="1020"/>
+            <w:shd w:val="clear" w:color="auto" w:fill="FFFFFF"/>
+            <w:tcMar>
+              <w:top w:w="60" w:type="dxa"/>
+              <w:left w:w="80" w:type="dxa"/>
+              <w:bottom w:w="60" w:type="dxa"/>
+              <w:right w:w="80" w:type="dxa"/>
+            </w:tcMar>
+          </w:tcPr>
+          <w:p>
+            <w:pPr>
+              <w:spacing w:before="0" w:after="0" w:line="269" w:lineRule="auto"/>
+              <w:jc w:val="left"/>
+            </w:pPr>
+            <w:r/>
+            <w:r>
+              <w:rPr>
+                <w:rFonts w:ascii="맑은 고딕" w:hAnsi="맑은 고딕" w:eastAsia="맑은 고딕"/>
+                <w:b/>
+                <w:i w:val="0"/>
+                <w:color w:val="1A1A1A"/>
+                <w:sz w:val="19"/>
+              </w:rPr>
+              <w:t>3</w:t>
+            </w:r>
+          </w:p>
+        </w:tc>
+        <w:tc>
+          <w:tcPr>
+            <w:tcW w:type="dxa" w:w="2948"/>
+            <w:shd w:val="clear" w:color="auto" w:fill="FFFFFF"/>
+            <w:tcMar>
+              <w:top w:w="60" w:type="dxa"/>
+              <w:left w:w="80" w:type="dxa"/>
+              <w:bottom w:w="60" w:type="dxa"/>
+              <w:right w:w="80" w:type="dxa"/>
+            </w:tcMar>
+          </w:tcPr>
+          <w:p>
+            <w:pPr>
+              <w:spacing w:before="0" w:after="0" w:line="269" w:lineRule="auto"/>
+              <w:jc w:val="center"/>
+            </w:pPr>
+            <w:r/>
+            <w:r>
+              <w:rPr>
+                <w:rFonts w:ascii="맑은 고딕" w:hAnsi="맑은 고딕" w:eastAsia="맑은 고딕"/>
+                <w:b w:val="0"/>
+                <w:i w:val="0"/>
+                <w:color w:val="1A1A1A"/>
+                <w:sz w:val="19"/>
+              </w:rPr>
+              <w:t>이번 주 TSMC 달러 실적</w:t>
+            </w:r>
+          </w:p>
+        </w:tc>
+        <w:tc>
+          <w:tcPr>
+            <w:tcW w:type="dxa" w:w="6009"/>
+            <w:shd w:val="clear" w:color="auto" w:fill="FFFFFF"/>
+            <w:tcMar>
+              <w:top w:w="60" w:type="dxa"/>
+              <w:left w:w="80" w:type="dxa"/>
+              <w:bottom w:w="60" w:type="dxa"/>
+              <w:right w:w="80" w:type="dxa"/>
+            </w:tcMar>
+          </w:tcPr>
+          <w:p>
+            <w:pPr>
+              <w:spacing w:before="0" w:after="0" w:line="269" w:lineRule="auto"/>
+              <w:jc w:val="center"/>
+            </w:pPr>
+            <w:r/>
+            <w:r>
+              <w:rPr>
+                <w:rFonts w:ascii="맑은 고딕" w:hAnsi="맑은 고딕" w:eastAsia="맑은 고딕"/>
+                <w:b w:val="0"/>
+                <w:i w:val="0"/>
+                <w:color w:val="1A1A1A"/>
+                <w:sz w:val="19"/>
+              </w:rPr>
+              <w:t>가이던스 상단 13.9%. 가속기 수요를 중복 없이 확인하는 자리</w:t>
+            </w:r>
+          </w:p>
+        </w:tc>
+      </w:tr>
+      <w:tr>
+        <w:trPr>
+          <w:cantSplit/>
+        </w:trPr>
+        <w:tc>
+          <w:tcPr>
+            <w:tcW w:type="dxa" w:w="1020"/>
+            <w:shd w:val="clear" w:color="auto" w:fill="F7F9FC"/>
+            <w:tcMar>
+              <w:top w:w="60" w:type="dxa"/>
+              <w:left w:w="80" w:type="dxa"/>
+              <w:bottom w:w="60" w:type="dxa"/>
+              <w:right w:w="80" w:type="dxa"/>
+            </w:tcMar>
+          </w:tcPr>
+          <w:p>
+            <w:pPr>
+              <w:spacing w:before="0" w:after="0" w:line="269" w:lineRule="auto"/>
+              <w:jc w:val="left"/>
+            </w:pPr>
+            <w:r/>
+            <w:r>
+              <w:rPr>
+                <w:rFonts w:ascii="맑은 고딕" w:hAnsi="맑은 고딕" w:eastAsia="맑은 고딕"/>
+                <w:b/>
+                <w:i w:val="0"/>
+                <w:color w:val="1A1A1A"/>
+                <w:sz w:val="19"/>
+              </w:rPr>
+              <w:t>4</w:t>
+            </w:r>
+          </w:p>
+        </w:tc>
+        <w:tc>
+          <w:tcPr>
+            <w:tcW w:type="dxa" w:w="2948"/>
+            <w:shd w:val="clear" w:color="auto" w:fill="F7F9FC"/>
+            <w:tcMar>
+              <w:top w:w="60" w:type="dxa"/>
+              <w:left w:w="80" w:type="dxa"/>
+              <w:bottom w:w="60" w:type="dxa"/>
+              <w:right w:w="80" w:type="dxa"/>
+            </w:tcMar>
+          </w:tcPr>
+          <w:p>
+            <w:pPr>
+              <w:spacing w:before="0" w:after="0" w:line="269" w:lineRule="auto"/>
+              <w:jc w:val="center"/>
+            </w:pPr>
+            <w:r/>
+            <w:r>
+              <w:rPr>
+                <w:rFonts w:ascii="맑은 고딕" w:hAnsi="맑은 고딕" w:eastAsia="맑은 고딕"/>
+                <w:b w:val="0"/>
+                <w:i w:val="0"/>
+                <w:color w:val="1A1A1A"/>
+                <w:sz w:val="19"/>
+              </w:rPr>
+              <w:t>10월 말 하이퍼스케일러</w:t>
+            </w:r>
+          </w:p>
+        </w:tc>
+        <w:tc>
+          <w:tcPr>
+            <w:tcW w:type="dxa" w:w="6009"/>
+            <w:shd w:val="clear" w:color="auto" w:fill="F7F9FC"/>
+            <w:tcMar>
+              <w:top w:w="60" w:type="dxa"/>
+              <w:left w:w="80" w:type="dxa"/>
+              <w:bottom w:w="60" w:type="dxa"/>
+              <w:right w:w="80" w:type="dxa"/>
+            </w:tcMar>
+          </w:tcPr>
+          <w:p>
+            <w:pPr>
+              <w:spacing w:before="0" w:after="0" w:line="269" w:lineRule="auto"/>
+              <w:jc w:val="center"/>
+            </w:pPr>
+            <w:r/>
+            <w:r>
+              <w:rPr>
+                <w:rFonts w:ascii="맑은 고딕" w:hAnsi="맑은 고딕" w:eastAsia="맑은 고딕"/>
+                <w:b w:val="0"/>
+                <w:i w:val="0"/>
+                <w:color w:val="1A1A1A"/>
+                <w:sz w:val="19"/>
+              </w:rPr>
+              <w:t>프리캐시플로, 선수금, 2년 뒤 부킹. 삼성 실적보다 수요의 돈줄</w:t>
+            </w:r>
+          </w:p>
+        </w:tc>
+      </w:tr>
+      <w:tr>
+        <w:trPr>
+          <w:cantSplit/>
+        </w:trPr>
+        <w:tc>
+          <w:tcPr>
+            <w:tcW w:type="dxa" w:w="1020"/>
+            <w:shd w:val="clear" w:color="auto" w:fill="FFFFFF"/>
+            <w:tcMar>
+              <w:top w:w="60" w:type="dxa"/>
+              <w:left w:w="80" w:type="dxa"/>
+              <w:bottom w:w="60" w:type="dxa"/>
+              <w:right w:w="80" w:type="dxa"/>
+            </w:tcMar>
+          </w:tcPr>
+          <w:p>
+            <w:pPr>
+              <w:spacing w:before="0" w:after="0" w:line="269" w:lineRule="auto"/>
+              <w:jc w:val="left"/>
+            </w:pPr>
+            <w:r/>
+            <w:r>
+              <w:rPr>
+                <w:rFonts w:ascii="맑은 고딕" w:hAnsi="맑은 고딕" w:eastAsia="맑은 고딕"/>
+                <w:b/>
+                <w:i w:val="0"/>
+                <w:color w:val="1A1A1A"/>
+                <w:sz w:val="19"/>
+              </w:rPr>
+              <w:t>5</w:t>
+            </w:r>
+          </w:p>
+        </w:tc>
+        <w:tc>
+          <w:tcPr>
+            <w:tcW w:type="dxa" w:w="2948"/>
+            <w:shd w:val="clear" w:color="auto" w:fill="FFFFFF"/>
+            <w:tcMar>
+              <w:top w:w="60" w:type="dxa"/>
+              <w:left w:w="80" w:type="dxa"/>
+              <w:bottom w:w="60" w:type="dxa"/>
+              <w:right w:w="80" w:type="dxa"/>
+            </w:tcMar>
+          </w:tcPr>
+          <w:p>
+            <w:pPr>
+              <w:spacing w:before="0" w:after="0" w:line="269" w:lineRule="auto"/>
+              <w:jc w:val="center"/>
+            </w:pPr>
+            <w:r/>
+            <w:r>
+              <w:rPr>
+                <w:rFonts w:ascii="맑은 고딕" w:hAnsi="맑은 고딕" w:eastAsia="맑은 고딕"/>
+                <w:b w:val="0"/>
+                <w:i w:val="0"/>
+                <w:color w:val="1A1A1A"/>
+                <w:sz w:val="19"/>
+              </w:rPr>
+              <w:t>10/27~28 FOMC</w:t>
+            </w:r>
+          </w:p>
+        </w:tc>
+        <w:tc>
+          <w:tcPr>
+            <w:tcW w:type="dxa" w:w="6009"/>
+            <w:shd w:val="clear" w:color="auto" w:fill="FFFFFF"/>
+            <w:tcMar>
+              <w:top w:w="60" w:type="dxa"/>
+              <w:left w:w="80" w:type="dxa"/>
+              <w:bottom w:w="60" w:type="dxa"/>
+              <w:right w:w="80" w:type="dxa"/>
+            </w:tcMar>
+          </w:tcPr>
+          <w:p>
+            <w:pPr>
+              <w:spacing w:before="0" w:after="0" w:line="269" w:lineRule="auto"/>
+              <w:jc w:val="center"/>
+            </w:pPr>
+            <w:r/>
+            <w:r>
+              <w:rPr>
+                <w:rFonts w:ascii="맑은 고딕" w:hAnsi="맑은 고딕" w:eastAsia="맑은 고딕"/>
+                <w:b w:val="0"/>
+                <w:i w:val="0"/>
+                <w:color w:val="1A1A1A"/>
+                <w:sz w:val="19"/>
+              </w:rPr>
+              <w:t>보험 인상을 마무리하는 문장인지, 한 번 더인지. 확률은 동결 우세, 시각은 분열</w:t>
+            </w:r>
+          </w:p>
+        </w:tc>
+      </w:tr>
+    </w:tbl>
+    <w:p>
+      <w:pPr>
+        <w:spacing w:after="160" w:before="40"/>
+      </w:pPr>
+    </w:p>
+    <w:p>
+      <w:pPr>
+        <w:spacing w:after="120" w:before="0" w:line="283" w:lineRule="auto"/>
+        <w:jc w:val="left"/>
+      </w:pPr>
+      <w:r>
+        <w:rPr>
+          <w:rFonts w:ascii="맑은 고딕" w:hAnsi="맑은 고딕" w:eastAsia="맑은 고딕"/>
+          <w:b w:val="0"/>
+          <w:i w:val="0"/>
+          <w:color w:val="1A1A1A"/>
+          <w:sz w:val="22"/>
+        </w:rPr>
+        <w:t>마린솔루션의 목표주가 31만 원, Goltens 15배, 벙커링 BEP는 이 순서 밖에 있습니다. 오늘 지수를 방어하는 재료가 아니고, 떠 있는 배의 정비 매출을 보는 자리입니다.</w:t>
       </w:r>
     </w:p>
     <w:p>

</xml_diff>

<commit_message>
Rewrite the Oct 12 front section as speaker intent and subtext.
Replace the seven-judgment distillation with what each speaker is trying to plant, the fear under the line, and both readings of the same fact, without dropping the threads.

Co-authored-by: choijunh-cloud <choijunh-cloud@users.noreply.github.com>
</commit_message>
<xml_diff>
--- a/lectures/10월 12일 금리와 국장 (CPI, 삼성전자, 장비, 마린솔루션).docx
+++ b/lectures/10월 12일 금리와 국장 (CPI, 삼성전자, 장비, 마린솔루션).docx
@@ -371,7 +371,7 @@
                 <w:color w:val="1A1A1A"/>
                 <w:sz w:val="19"/>
               </w:rPr>
-              <w:t>투자 인사이트</w:t>
+              <w:t>화자의 이면</w:t>
             </w:r>
           </w:p>
         </w:tc>
@@ -400,7 +400,7 @@
                 <w:color w:val="1A1A1A"/>
                 <w:sz w:val="19"/>
               </w:rPr>
-              <w:t>할인율, 정책, 채권, 국장, 삼성, 장비, 시계가 다른 자리</w:t>
+              <w:t>하려는 말, 침묵, 같은 재료의 두 읽기, 빠지지 않은 실</w:t>
             </w:r>
           </w:p>
         </w:tc>
@@ -1084,7 +1084,7 @@
           <w:color w:val="1A1A1A"/>
           <w:sz w:val="22"/>
         </w:rPr>
-        <w:t>오늘은 종목을 늘리는 날이 아니라 금리를 읽는 날입니다. 일본은 스포츠의 날로 쉬고, 미국은 주식이 열리더라도 채권·외환이 쉬는 날입니다. 그 공백에서 코스피가 박스 하단을 깨고 종가를 저가에 찍었습니다. 앞의 증류가 오늘의 판단이고, 뒤의 파트는 그 판단의 근거입니다.</w:t>
+        <w:t>오늘은 종목을 늘리는 날이 아니라 금리를 읽는 날입니다. 일본은 스포츠의 날로 쉬고, 미국은 주식이 열리더라도 채권·외환이 쉬는 날입니다. 그 공백에서 코스피가 박스 하단을 깨고 종가를 저가에 찍었습니다. 앞은 화자가 청중에게 심으려는 말이고, 뒤는 그 말의 근거입니다.</w:t>
       </w:r>
     </w:p>
     <w:p>
@@ -1113,7 +1113,7 @@
           <w:color w:val="0F2043"/>
           <w:sz w:val="32"/>
         </w:rPr>
-        <w:t>증류한 투자 인사이트</w:t>
+        <w:t>화자가 심으려는 말</w:t>
       </w:r>
     </w:p>
     <w:tbl>
@@ -1160,7 +1160,7 @@
                 <w:color w:val="0F2043"/>
                 <w:sz w:val="20"/>
               </w:rPr>
-              <w:t>한 줄</w:t>
+              <w:t>이면까지</w:t>
             </w:r>
           </w:p>
           <w:p>
@@ -1175,7 +1175,7 @@
                 <w:color w:val="1A1A1A"/>
                 <w:sz w:val="21"/>
               </w:rPr>
-              <w:t>오늘의 가격은 실적이 정하지 않습니다. 장기금리가 단기보다 더 오르는 기울기, 그리고 그 기울기가 한국 수급을 말리는 방식이 가격을 정합니다.</w:t>
+              <w:t>이 파트는 화자마다 청중에게 심으려는 말과, 그 말 밑의 공포·침묵·같은 재료의 다른 읽기를 나란히 둡니다.</w:t>
             </w:r>
           </w:p>
           <w:p>
@@ -1190,7 +1190,7 @@
                 <w:color w:val="1A1A1A"/>
                 <w:sz w:val="21"/>
               </w:rPr>
-              <w:t>아래 일곱 줄은 당일 방송의 판단만 남긴 것입니다. 숫자의 출처와 시각이 갈리는 지점은 뒤 파트에 있습니다.</w:t>
+              <w:t>숫자와 표의 출처는 0장부터입니다. 이름 하나는 방법의 사례로 읽고, 화자가 그 이름에 붙인 ‘따라 하지 말라’를 이름보다 앞에 둡니다.</w:t>
             </w:r>
           </w:p>
         </w:tc>
@@ -1214,7 +1214,7 @@
           <w:color w:val="1E407C"/>
           <w:sz w:val="26"/>
         </w:rPr>
-        <w:t>일곱 판단</w:t>
+        <w:t>화자별 — 하려는 말, 이면</w:t>
       </w:r>
     </w:p>
     <w:tbl>
@@ -1243,7 +1243,7 @@
         </w:trPr>
         <w:tc>
           <w:tcPr>
-            <w:tcW w:type="dxa" w:w="1814"/>
+            <w:tcW w:type="dxa" w:w="1474"/>
             <w:shd w:val="clear" w:color="auto" w:fill="0F2043"/>
             <w:tcMar>
               <w:top w:w="60" w:type="dxa"/>
@@ -1267,13 +1267,13 @@
                 <w:color w:val="FFFFFF"/>
                 <w:sz w:val="19"/>
               </w:rPr>
-              <w:t>판단</w:t>
-            </w:r>
-          </w:p>
-        </w:tc>
-        <w:tc>
-          <w:tcPr>
-            <w:tcW w:type="dxa" w:w="4195"/>
+              <w:t>화자</w:t>
+            </w:r>
+          </w:p>
+        </w:tc>
+        <w:tc>
+          <w:tcPr>
+            <w:tcW w:type="dxa" w:w="4252"/>
             <w:shd w:val="clear" w:color="auto" w:fill="0F2043"/>
             <w:tcMar>
               <w:top w:w="60" w:type="dxa"/>
@@ -1297,13 +1297,13 @@
                 <w:color w:val="FFFFFF"/>
                 <w:sz w:val="19"/>
               </w:rPr>
-              <w:t>핵심</w:t>
-            </w:r>
-          </w:p>
-        </w:tc>
-        <w:tc>
-          <w:tcPr>
-            <w:tcW w:type="dxa" w:w="3969"/>
+              <w:t>하려는 말</w:t>
+            </w:r>
+          </w:p>
+        </w:tc>
+        <w:tc>
+          <w:tcPr>
+            <w:tcW w:type="dxa" w:w="4252"/>
             <w:shd w:val="clear" w:color="auto" w:fill="0F2043"/>
             <w:tcMar>
               <w:top w:w="60" w:type="dxa"/>
@@ -1327,7 +1327,7 @@
                 <w:color w:val="FFFFFF"/>
                 <w:sz w:val="19"/>
               </w:rPr>
-              <w:t>포지션에 대한 함의</w:t>
+              <w:t>이면</w:t>
             </w:r>
           </w:p>
         </w:tc>
@@ -1338,7 +1338,7 @@
         </w:trPr>
         <w:tc>
           <w:tcPr>
-            <w:tcW w:type="dxa" w:w="1814"/>
+            <w:tcW w:type="dxa" w:w="1474"/>
             <w:shd w:val="clear" w:color="auto" w:fill="FFFFFF"/>
             <w:tcMar>
               <w:top w:w="60" w:type="dxa"/>
@@ -1349,7 +1349,7 @@
           </w:tcPr>
           <w:p>
             <w:pPr>
-              <w:spacing w:before="0" w:after="0" w:line="269" w:lineRule="auto"/>
+              <w:spacing w:before="0" w:after="20" w:line="269" w:lineRule="auto"/>
               <w:jc w:val="left"/>
             </w:pPr>
             <w:r/>
@@ -1361,13 +1361,29 @@
                 <w:color w:val="1A1A1A"/>
                 <w:sz w:val="19"/>
               </w:rPr>
-              <w:t>할인율</w:t>
-            </w:r>
-          </w:p>
-        </w:tc>
-        <w:tc>
-          <w:tcPr>
-            <w:tcW w:type="dxa" w:w="4195"/>
+              <w:t>이춘광</w:t>
+            </w:r>
+          </w:p>
+          <w:p>
+            <w:pPr>
+              <w:spacing w:before="0" w:after="0" w:line="269" w:lineRule="auto"/>
+              <w:jc w:val="left"/>
+            </w:pPr>
+            <w:r>
+              <w:rPr>
+                <w:rFonts w:ascii="맑은 고딕" w:hAnsi="맑은 고딕" w:eastAsia="맑은 고딕"/>
+                <w:b/>
+                <w:i w:val="0"/>
+                <w:color w:val="1A1A1A"/>
+                <w:sz w:val="19"/>
+              </w:rPr>
+              <w:t>레그넘</w:t>
+            </w:r>
+          </w:p>
+        </w:tc>
+        <w:tc>
+          <w:tcPr>
+            <w:tcW w:type="dxa" w:w="4252"/>
             <w:shd w:val="clear" w:color="auto" w:fill="FFFFFF"/>
             <w:tcMar>
               <w:top w:w="60" w:type="dxa"/>
@@ -1379,7 +1395,7 @@
           <w:p>
             <w:pPr>
               <w:spacing w:before="0" w:after="0" w:line="269" w:lineRule="auto"/>
-              <w:jc w:val="center"/>
+              <w:jc w:val="left"/>
             </w:pPr>
             <w:r/>
             <w:r>
@@ -1390,13 +1406,13 @@
                 <w:color w:val="1A1A1A"/>
                 <w:sz w:val="19"/>
               </w:rPr>
-              <w:t>베어 스티프닝. 9월 CPI가 예상과 맞아도 10년·30년물은 오를 수 있음</w:t>
-            </w:r>
-          </w:p>
-        </w:tc>
-        <w:tc>
-          <w:tcPr>
-            <w:tcW w:type="dxa" w:w="3969"/>
+              <w:t>장기금리의 문은 중동입니다. 6월 720억·7월 1,200억 달러 해외 매도(월간) 앞에 재무부 바이백 월 약 600억 달러는 작습니다. 순서는 바이백, SLR, 오퍼레이션 트위스트. 릭 라이더(블룸버그 TV)는 YCC를 말하지 않았고, 본인은 트위스트를 앞에 둡니다.</w:t>
+            </w:r>
+          </w:p>
+        </w:tc>
+        <w:tc>
+          <w:tcPr>
+            <w:tcW w:type="dxa" w:w="4252"/>
             <w:shd w:val="clear" w:color="auto" w:fill="FFFFFF"/>
             <w:tcMar>
               <w:top w:w="60" w:type="dxa"/>
@@ -1408,7 +1424,7 @@
           <w:p>
             <w:pPr>
               <w:spacing w:before="0" w:after="0" w:line="269" w:lineRule="auto"/>
-              <w:jc w:val="center"/>
+              <w:jc w:val="left"/>
             </w:pPr>
             <w:r/>
             <w:r>
@@ -1419,7 +1435,7 @@
                 <w:color w:val="1A1A1A"/>
                 <w:sz w:val="19"/>
               </w:rPr>
-              <w:t>헤드라인보다 10년물 기울기. 한국은 그 기울기를 삼성·하이닉스 비중으로 맞음</w:t>
+              <w:t>청중의 지하 공포는 외국인이 미 국채를 던져 기축 복합이 흔들리는 그림입니다. 과거 낙폭을 늘어놓는 말은, 그 그림까지는 아니라고 선을 긋는 본인의 낙관 편향입니다. 10월 인상·12월 동결이 그의 기본이고, 중동은 교착으로 읽지 않습니다.</w:t>
             </w:r>
           </w:p>
         </w:tc>
@@ -1430,7 +1446,7 @@
         </w:trPr>
         <w:tc>
           <w:tcPr>
-            <w:tcW w:type="dxa" w:w="1814"/>
+            <w:tcW w:type="dxa" w:w="1474"/>
             <w:shd w:val="clear" w:color="auto" w:fill="F7F9FC"/>
             <w:tcMar>
               <w:top w:w="60" w:type="dxa"/>
@@ -1453,13 +1469,13 @@
                 <w:color w:val="1A1A1A"/>
                 <w:sz w:val="19"/>
               </w:rPr>
-              <w:t>정책 카드</w:t>
-            </w:r>
-          </w:p>
-        </w:tc>
-        <w:tc>
-          <w:tcPr>
-            <w:tcW w:type="dxa" w:w="4195"/>
+              <w:t>진행</w:t>
+            </w:r>
+          </w:p>
+        </w:tc>
+        <w:tc>
+          <w:tcPr>
+            <w:tcW w:type="dxa" w:w="4252"/>
             <w:shd w:val="clear" w:color="auto" w:fill="F7F9FC"/>
             <w:tcMar>
               <w:top w:w="60" w:type="dxa"/>
@@ -1471,7 +1487,7 @@
           <w:p>
             <w:pPr>
               <w:spacing w:before="0" w:after="0" w:line="269" w:lineRule="auto"/>
-              <w:jc w:val="center"/>
+              <w:jc w:val="left"/>
             </w:pPr>
             <w:r/>
             <w:r>
@@ -1482,13 +1498,13 @@
                 <w:color w:val="1A1A1A"/>
                 <w:sz w:val="19"/>
               </w:rPr>
-              <w:t>바이백 월 약 600억 달러는 7월 해외 매도 1,200억 달러보다 작음. 순서는 바이백, SLR, 오퍼레이션 트위스트. YCC는 릭 라이더 본인 워딩이 아님</w:t>
-            </w:r>
-          </w:p>
-        </w:tc>
-        <w:tc>
-          <w:tcPr>
-            <w:tcW w:type="dxa" w:w="3969"/>
+              <w:t>목요일 이후라 금리 하락 환영도 안전자산 도피로 들립니다. 무너지기 전의 개입은, 이미 그 트레이드에 있는 사람의 고통을 나누는 일입니다. 베센트는 장기물 끝을 놓쳤습니다.</w:t>
+            </w:r>
+          </w:p>
+        </w:tc>
+        <w:tc>
+          <w:tcPr>
+            <w:tcW w:type="dxa" w:w="4252"/>
             <w:shd w:val="clear" w:color="auto" w:fill="F7F9FC"/>
             <w:tcMar>
               <w:top w:w="60" w:type="dxa"/>
@@ -1500,7 +1516,7 @@
           <w:p>
             <w:pPr>
               <w:spacing w:before="0" w:after="0" w:line="269" w:lineRule="auto"/>
-              <w:jc w:val="center"/>
+              <w:jc w:val="left"/>
             </w:pPr>
             <w:r/>
             <w:r>
@@ -1511,7 +1527,7 @@
                 <w:color w:val="1A1A1A"/>
                 <w:sz w:val="19"/>
               </w:rPr>
-              <w:t>극단 금리를 기본값으로 두지 않음. 10년 5.5% 전에는 말이 카드</w:t>
+              <w:t>질문은 전망이 아니라 도덕 시험입니다. 라이더가 부정하지 않은 것을 진행이 YCC로 부릅니다. 바이백을 ‘외면하지 않겠다’는 신호로 듣는 쪽과, 통제를 잃었다고 듣는 쪽이 한 자리에 있습니다.</w:t>
             </w:r>
           </w:p>
         </w:tc>
@@ -1522,7 +1538,7 @@
         </w:trPr>
         <w:tc>
           <w:tcPr>
-            <w:tcW w:type="dxa" w:w="1814"/>
+            <w:tcW w:type="dxa" w:w="1474"/>
             <w:shd w:val="clear" w:color="auto" w:fill="FFFFFF"/>
             <w:tcMar>
               <w:top w:w="60" w:type="dxa"/>
@@ -1533,7 +1549,7 @@
           </w:tcPr>
           <w:p>
             <w:pPr>
-              <w:spacing w:before="0" w:after="0" w:line="269" w:lineRule="auto"/>
+              <w:spacing w:before="0" w:after="20" w:line="269" w:lineRule="auto"/>
               <w:jc w:val="left"/>
             </w:pPr>
             <w:r/>
@@ -1545,13 +1561,29 @@
                 <w:color w:val="1A1A1A"/>
                 <w:sz w:val="19"/>
               </w:rPr>
-              <w:t>채권</w:t>
-            </w:r>
-          </w:p>
-        </w:tc>
-        <w:tc>
-          <w:tcPr>
-            <w:tcW w:type="dxa" w:w="4195"/>
+              <w:t>이권위</w:t>
+            </w:r>
+          </w:p>
+          <w:p>
+            <w:pPr>
+              <w:spacing w:before="0" w:after="0" w:line="269" w:lineRule="auto"/>
+              <w:jc w:val="left"/>
+            </w:pPr>
+            <w:r>
+              <w:rPr>
+                <w:rFonts w:ascii="맑은 고딕" w:hAnsi="맑은 고딕" w:eastAsia="맑은 고딕"/>
+                <w:b/>
+                <w:i w:val="0"/>
+                <w:color w:val="1A1A1A"/>
+                <w:sz w:val="19"/>
+              </w:rPr>
+              <w:t>위즈웨이브</w:t>
+            </w:r>
+          </w:p>
+        </w:tc>
+        <w:tc>
+          <w:tcPr>
+            <w:tcW w:type="dxa" w:w="4252"/>
             <w:shd w:val="clear" w:color="auto" w:fill="FFFFFF"/>
             <w:tcMar>
               <w:top w:w="60" w:type="dxa"/>
@@ -1563,7 +1595,7 @@
           <w:p>
             <w:pPr>
               <w:spacing w:before="0" w:after="0" w:line="269" w:lineRule="auto"/>
-              <w:jc w:val="center"/>
+              <w:jc w:val="left"/>
             </w:pPr>
             <w:r/>
             <w:r>
@@ -1574,13 +1606,13 @@
                 <w:color w:val="1A1A1A"/>
                 <w:sz w:val="19"/>
               </w:rPr>
-              <w:t>1시그마(약 30bp) 밖 급등은 이후 되밀린 사례가 많음. 15년물 10년 롤링 마이너스는 1936년 이후 두 번</w:t>
-            </w:r>
-          </w:p>
-        </w:tc>
-        <w:tc>
-          <w:tcPr>
-            <w:tcW w:type="dxa" w:w="3969"/>
+              <w:t>박스는 6,400–7,500입니다. 6,400 이탈은 추세 이탈입니다. ‘국장 탈출은 지능순’은 바닥 근처에서 나오는 말버릇입니다.</w:t>
+            </w:r>
+          </w:p>
+        </w:tc>
+        <w:tc>
+          <w:tcPr>
+            <w:tcW w:type="dxa" w:w="4252"/>
             <w:shd w:val="clear" w:color="auto" w:fill="FFFFFF"/>
             <w:tcMar>
               <w:top w:w="60" w:type="dxa"/>
@@ -1592,7 +1624,7 @@
           <w:p>
             <w:pPr>
               <w:spacing w:before="0" w:after="0" w:line="269" w:lineRule="auto"/>
-              <w:jc w:val="center"/>
+              <w:jc w:val="left"/>
             </w:pPr>
             <w:r/>
             <w:r>
@@ -1603,7 +1635,7 @@
                 <w:color w:val="1A1A1A"/>
                 <w:sz w:val="19"/>
               </w:rPr>
-              <w:t>살 수 있는 영역. 전량 매수 문장 아님. 채권 자금과 주식 자금의 성격은 다름</w:t>
+              <w:t>미국으로 옮겨 같은 AI만 사면 등급이 오르지 않습니다. 미국 지수가 버텨 보이는 이유는 지수가 메모리가 아니기 때문이고, 한국은 메모리입니다. 메모리가 빠져도 미국 지수는 오를 수 있습니다.</w:t>
             </w:r>
           </w:p>
         </w:tc>
@@ -1614,7 +1646,7 @@
         </w:trPr>
         <w:tc>
           <w:tcPr>
-            <w:tcW w:type="dxa" w:w="1814"/>
+            <w:tcW w:type="dxa" w:w="1474"/>
             <w:shd w:val="clear" w:color="auto" w:fill="F7F9FC"/>
             <w:tcMar>
               <w:top w:w="60" w:type="dxa"/>
@@ -1625,7 +1657,7 @@
           </w:tcPr>
           <w:p>
             <w:pPr>
-              <w:spacing w:before="0" w:after="0" w:line="269" w:lineRule="auto"/>
+              <w:spacing w:before="0" w:after="20" w:line="269" w:lineRule="auto"/>
               <w:jc w:val="left"/>
             </w:pPr>
             <w:r/>
@@ -1637,13 +1669,29 @@
                 <w:color w:val="1A1A1A"/>
                 <w:sz w:val="19"/>
               </w:rPr>
-              <w:t>국장</w:t>
-            </w:r>
-          </w:p>
-        </w:tc>
-        <w:tc>
-          <w:tcPr>
-            <w:tcW w:type="dxa" w:w="4195"/>
+              <w:t>노근창</w:t>
+            </w:r>
+          </w:p>
+          <w:p>
+            <w:pPr>
+              <w:spacing w:before="0" w:after="0" w:line="269" w:lineRule="auto"/>
+              <w:jc w:val="left"/>
+            </w:pPr>
+            <w:r>
+              <w:rPr>
+                <w:rFonts w:ascii="맑은 고딕" w:hAnsi="맑은 고딕" w:eastAsia="맑은 고딕"/>
+                <w:b/>
+                <w:i w:val="0"/>
+                <w:color w:val="1A1A1A"/>
+                <w:sz w:val="19"/>
+              </w:rPr>
+              <w:t>세미콘</w:t>
+            </w:r>
+          </w:p>
+        </w:tc>
+        <w:tc>
+          <w:tcPr>
+            <w:tcW w:type="dxa" w:w="4252"/>
             <w:shd w:val="clear" w:color="auto" w:fill="F7F9FC"/>
             <w:tcMar>
               <w:top w:w="60" w:type="dxa"/>
@@ -1655,7 +1703,7 @@
           <w:p>
             <w:pPr>
               <w:spacing w:before="0" w:after="0" w:line="269" w:lineRule="auto"/>
-              <w:jc w:val="center"/>
+              <w:jc w:val="left"/>
             </w:pPr>
             <w:r/>
             <w:r>
@@ -1666,13 +1714,13 @@
                 <w:color w:val="1A1A1A"/>
                 <w:sz w:val="19"/>
               </w:rPr>
-              <w:t>6,400 이탈, 종가=저가. 코스피 약 -3.6%, 코스닥 약 -4.8%. 외국인은 영국계 매도와 미국계 매수가 공존</w:t>
-            </w:r>
-          </w:p>
-        </w:tc>
-        <w:tc>
-          <w:tcPr>
-            <w:tcW w:type="dxa" w:w="3969"/>
+              <w:t>3분기 약 110조 원은 연초부터 본 숫자입니다. 30% 넘는 서프라이즈에만 오르던 주식이, 실적이 나온 날에 빠집니다. 그 자리는 수급과 거버넌스입니다. 소각은 금산법, 대비는 엔비디아 바이백 뒤의 신고가입니다.</w:t>
+            </w:r>
+          </w:p>
+        </w:tc>
+        <w:tc>
+          <w:tcPr>
+            <w:tcW w:type="dxa" w:w="4252"/>
             <w:shd w:val="clear" w:color="auto" w:fill="F7F9FC"/>
             <w:tcMar>
               <w:top w:w="60" w:type="dxa"/>
@@ -1684,7 +1732,7 @@
           <w:p>
             <w:pPr>
               <w:spacing w:before="0" w:after="0" w:line="269" w:lineRule="auto"/>
-              <w:jc w:val="center"/>
+              <w:jc w:val="left"/>
             </w:pPr>
             <w:r/>
             <w:r>
@@ -1695,7 +1743,7 @@
                 <w:color w:val="1A1A1A"/>
                 <w:sz w:val="19"/>
               </w:rPr>
-              <w:t>당일 손절·물타기는 보류. 미리 비운 현금만 주 후반 종가에 지수로 분할. 코스닥은 매수 제외. 열어 둔 아래는 5,900</w:t>
+              <w:t>‘27만 원이 선행 장부 1.5배였고 지금은 그 아래’와 ‘24.5만 원은 바이백이 끝나 자동 지지가 아니며, 이탈하면 22~23만 원은 여유 현금의 스케줄’이 함께 있습니다. 광주 팹은 그에게 장비 주문이고, 이춘광은 그 입지를 외국인이 할인으로 들을 수 있다고 옆에서 말합니다.</w:t>
             </w:r>
           </w:p>
         </w:tc>
@@ -1706,7 +1754,7 @@
         </w:trPr>
         <w:tc>
           <w:tcPr>
-            <w:tcW w:type="dxa" w:w="1814"/>
+            <w:tcW w:type="dxa" w:w="1474"/>
             <w:shd w:val="clear" w:color="auto" w:fill="FFFFFF"/>
             <w:tcMar>
               <w:top w:w="60" w:type="dxa"/>
@@ -1729,13 +1777,13 @@
                 <w:color w:val="1A1A1A"/>
                 <w:sz w:val="19"/>
               </w:rPr>
-              <w:t>삼성·하이닉스</w:t>
-            </w:r>
-          </w:p>
-        </w:tc>
-        <w:tc>
-          <w:tcPr>
-            <w:tcW w:type="dxa" w:w="4195"/>
+              <w:t>지표 추적</w:t>
+            </w:r>
+          </w:p>
+        </w:tc>
+        <w:tc>
+          <w:tcPr>
+            <w:tcW w:type="dxa" w:w="4252"/>
             <w:shd w:val="clear" w:color="auto" w:fill="FFFFFF"/>
             <w:tcMar>
               <w:top w:w="60" w:type="dxa"/>
@@ -1747,7 +1795,7 @@
           <w:p>
             <w:pPr>
               <w:spacing w:before="0" w:after="0" w:line="269" w:lineRule="auto"/>
-              <w:jc w:val="center"/>
+              <w:jc w:val="left"/>
             </w:pPr>
             <w:r/>
             <w:r>
@@ -1758,13 +1806,13 @@
                 <w:color w:val="1A1A1A"/>
                 <w:sz w:val="19"/>
               </w:rPr>
-              <w:t>3분기 약 110조 원, 내년 PER 3.0~3.1배, PBR 1.4배. 금산법으로 소각이 막히고 15조 원은 직원 배정. 24.5만 원은 자동 지지가 아님</w:t>
-            </w:r>
-          </w:p>
-        </w:tc>
-        <w:tc>
-          <w:tcPr>
-            <w:tcW w:type="dxa" w:w="3969"/>
+              <w:t>방송은 감정 매매를 멈추라고 켠 것입니다. 2~3주 전 현금은 하락을 알아서가 아니라, 어려운 판을 거부해서입니다. 오늘 손절과 결심은 보류합니다. 미국 주식·채권·외환이 모두 열린 가격이 아닙니다.</w:t>
+            </w:r>
+          </w:p>
+        </w:tc>
+        <w:tc>
+          <w:tcPr>
+            <w:tcW w:type="dxa" w:w="4252"/>
             <w:shd w:val="clear" w:color="auto" w:fill="FFFFFF"/>
             <w:tcMar>
               <w:top w:w="60" w:type="dxa"/>
@@ -1776,7 +1824,7 @@
           <w:p>
             <w:pPr>
               <w:spacing w:before="0" w:after="0" w:line="269" w:lineRule="auto"/>
-              <w:jc w:val="center"/>
+              <w:jc w:val="left"/>
             </w:pPr>
             <w:r/>
             <w:r>
@@ -1787,7 +1835,7 @@
                 <w:color w:val="1A1A1A"/>
                 <w:sz w:val="19"/>
               </w:rPr>
-              <w:t>만든 비중은 유지. 신규는 현금만, 이탈 시 22~23만 원은 스케줄. 밸류와 점유율은 삼성, 하이닉스 매출도 성장</w:t>
+              <w:t>현금인 사람의 매수만 매수이고, 풀매수인 사람의 추가는 물타기입니다. 종가=저가=매수 공백. 현금 30%는 배의 바닥재입니다. 전쟁이나 오픈AI 실패가 내일이면 이 말은 접힙니다. AI 붕괴는 10% 미만으로 두되, 맞으면 움직일 수 있는 현금을 요구합니다.</w:t>
             </w:r>
           </w:p>
         </w:tc>
@@ -1798,7 +1846,7 @@
         </w:trPr>
         <w:tc>
           <w:tcPr>
-            <w:tcW w:type="dxa" w:w="1814"/>
+            <w:tcW w:type="dxa" w:w="1474"/>
             <w:shd w:val="clear" w:color="auto" w:fill="F7F9FC"/>
             <w:tcMar>
               <w:top w:w="60" w:type="dxa"/>
@@ -1809,7 +1857,7 @@
           </w:tcPr>
           <w:p>
             <w:pPr>
-              <w:spacing w:before="0" w:after="0" w:line="269" w:lineRule="auto"/>
+              <w:spacing w:before="0" w:after="20" w:line="269" w:lineRule="auto"/>
               <w:jc w:val="left"/>
             </w:pPr>
             <w:r/>
@@ -1821,13 +1869,29 @@
                 <w:color w:val="1A1A1A"/>
                 <w:sz w:val="19"/>
               </w:rPr>
-              <w:t>장비</w:t>
-            </w:r>
-          </w:p>
-        </w:tc>
-        <w:tc>
-          <w:tcPr>
-            <w:tcW w:type="dxa" w:w="4195"/>
+              <w:t>박병창</w:t>
+            </w:r>
+          </w:p>
+          <w:p>
+            <w:pPr>
+              <w:spacing w:before="0" w:after="0" w:line="269" w:lineRule="auto"/>
+              <w:jc w:val="left"/>
+            </w:pPr>
+            <w:r>
+              <w:rPr>
+                <w:rFonts w:ascii="맑은 고딕" w:hAnsi="맑은 고딕" w:eastAsia="맑은 고딕"/>
+                <w:b/>
+                <w:i w:val="0"/>
+                <w:color w:val="1A1A1A"/>
+                <w:sz w:val="19"/>
+              </w:rPr>
+              <w:t>교보</w:t>
+            </w:r>
+          </w:p>
+        </w:tc>
+        <w:tc>
+          <w:tcPr>
+            <w:tcW w:type="dxa" w:w="4252"/>
             <w:shd w:val="clear" w:color="auto" w:fill="F7F9FC"/>
             <w:tcMar>
               <w:top w:w="60" w:type="dxa"/>
@@ -1839,7 +1903,7 @@
           <w:p>
             <w:pPr>
               <w:spacing w:before="0" w:after="0" w:line="269" w:lineRule="auto"/>
-              <w:jc w:val="center"/>
+              <w:jc w:val="left"/>
             </w:pPr>
             <w:r/>
             <w:r>
@@ -1850,13 +1914,13 @@
                 <w:color w:val="1A1A1A"/>
                 <w:sz w:val="19"/>
               </w:rPr>
-              <w:t>수요의 구조는 글로벌 4사. 국내 소부장은 그 신호를 먼저, 더 세게 가격에 넣음</w:t>
-            </w:r>
-          </w:p>
-        </w:tc>
-        <w:tc>
-          <w:tcPr>
-            <w:tcW w:type="dxa" w:w="3969"/>
+              <w:t>10월 7,200을 보고 있었고, 지난주 그 말을 바꿨습니다. 바뀐 것이 메시지입니다. 박스 상단은 종목, 하단과 이탈은 수비. 이탈 뒤 흔한 그림은 되돌림이고, 팔지 말지의 자리는 그 되돌림입니다.</w:t>
+            </w:r>
+          </w:p>
+        </w:tc>
+        <w:tc>
+          <w:tcPr>
+            <w:tcW w:type="dxa" w:w="4252"/>
             <w:shd w:val="clear" w:color="auto" w:fill="F7F9FC"/>
             <w:tcMar>
               <w:top w:w="60" w:type="dxa"/>
@@ -1868,7 +1932,7 @@
           <w:p>
             <w:pPr>
               <w:spacing w:before="0" w:after="0" w:line="269" w:lineRule="auto"/>
-              <w:jc w:val="center"/>
+              <w:jc w:val="left"/>
             </w:pPr>
             <w:r/>
             <w:r>
@@ -1879,7 +1943,7 @@
                 <w:color w:val="1A1A1A"/>
                 <w:sz w:val="19"/>
               </w:rPr>
-              <w:t>단기 수익은 축소. 장기 바스켓은 ETF. 솔리다임 약 200조 원은 현재 주가에 없음. 단기에는 할인</w:t>
+              <w:t>중간선거 해 4분기 상승 84%는 인용하고도 매매하지 않는 통계입니다. 레임덕은 계절성이 아닙니다. 종목과 결혼하지 않고, 연습은 계좌의 10%입니다. 미국 적립은 그들이 돈을 찍어서 가능하고, 4년 고점의 일시금·한국을 비운 미국 100%는 다른 결정입니다.</w:t>
             </w:r>
           </w:p>
         </w:tc>
@@ -1890,7 +1954,7 @@
         </w:trPr>
         <w:tc>
           <w:tcPr>
-            <w:tcW w:type="dxa" w:w="1814"/>
+            <w:tcW w:type="dxa" w:w="1474"/>
             <w:shd w:val="clear" w:color="auto" w:fill="FFFFFF"/>
             <w:tcMar>
               <w:top w:w="60" w:type="dxa"/>
@@ -1913,13 +1977,13 @@
                 <w:color w:val="1A1A1A"/>
                 <w:sz w:val="19"/>
               </w:rPr>
-              <w:t>다른 시계</w:t>
-            </w:r>
-          </w:p>
-        </w:tc>
-        <w:tc>
-          <w:tcPr>
-            <w:tcW w:type="dxa" w:w="4195"/>
+              <w:t>이주현</w:t>
+            </w:r>
+          </w:p>
+        </w:tc>
+        <w:tc>
+          <w:tcPr>
+            <w:tcW w:type="dxa" w:w="4252"/>
             <w:shd w:val="clear" w:color="auto" w:fill="FFFFFF"/>
             <w:tcMar>
               <w:top w:w="60" w:type="dxa"/>
@@ -1931,7 +1995,7 @@
           <w:p>
             <w:pPr>
               <w:spacing w:before="0" w:after="0" w:line="269" w:lineRule="auto"/>
-              <w:jc w:val="center"/>
+              <w:jc w:val="left"/>
             </w:pPr>
             <w:r/>
             <w:r>
@@ -1942,13 +2006,13 @@
                 <w:color w:val="1A1A1A"/>
                 <w:sz w:val="19"/>
               </w:rPr>
-              <w:t>마린솔루션은 급락일 트레이딩이 아님. 전력 3사는 밴드 이탈. 현대차는 자동차 실물, SK텔레콤은 상장 일정</w:t>
-            </w:r>
-          </w:p>
-        </w:tc>
-        <w:tc>
-          <w:tcPr>
-            <w:tcW w:type="dxa" w:w="3969"/>
+              <w:t>새 헤드라인은 없습니다. 휴일 사이 미국 금리가 이야기의 전부입니다. 나스닥 선물이 오르고 한국이 빠진 그림은, 돈이 미국으로 간 흐름입니다. 돈이 귀하니 대장, 또는 테마 안 한 종목만 남습니다.</w:t>
+            </w:r>
+          </w:p>
+        </w:tc>
+        <w:tc>
+          <w:tcPr>
+            <w:tcW w:type="dxa" w:w="4252"/>
             <w:shd w:val="clear" w:color="auto" w:fill="FFFFFF"/>
             <w:tcMar>
               <w:top w:w="60" w:type="dxa"/>
@@ -1960,7 +2024,7 @@
           <w:p>
             <w:pPr>
               <w:spacing w:before="0" w:after="0" w:line="269" w:lineRule="auto"/>
-              <w:jc w:val="center"/>
+              <w:jc w:val="left"/>
             </w:pPr>
             <w:r/>
             <w:r>
@@ -1971,7 +2035,7 @@
                 <w:color w:val="1A1A1A"/>
                 <w:sz w:val="19"/>
               </w:rPr>
-              <w:t>2028년 이익을 미리 받은 하락은 저가 매수 신호가 아님. ESS는 지수 공포만으로 팔 이유가 약함</w:t>
+              <w:t>오늘 오르는 호남 반도체·해운·자산주·저유동·음식은, 위험자본이 빠지고 ‘죽어도 땅이 준다’는 심리만 남았다는 신호입니다. 2021년의 ‘다 팔자’는 지금 그대로 붙이지 않습니다. AI·전력은 살아 있고, 기다리는 돈을 댈 수 있는지가 시험입니다. 현금 40%는 상승장에서 바보 같았고, 그 자리가 오늘입니다.</w:t>
             </w:r>
           </w:p>
         </w:tc>
@@ -1995,7 +2059,39 @@
           <w:color w:val="1E407C"/>
           <w:sz w:val="26"/>
         </w:rPr>
-        <w:t>다섯 규칙</w:t>
+        <w:t>빠지지 않은 실</w:t>
+      </w:r>
+    </w:p>
+    <w:p>
+      <w:pPr>
+        <w:spacing w:after="120" w:before="0" w:line="283" w:lineRule="auto"/>
+        <w:jc w:val="left"/>
+      </w:pPr>
+      <w:r>
+        <w:rPr>
+          <w:rFonts w:ascii="맑은 고딕" w:hAnsi="맑은 고딕" w:eastAsia="맑은 고딕"/>
+          <w:b w:val="0"/>
+          <w:i w:val="0"/>
+          <w:color w:val="1A1A1A"/>
+          <w:sz w:val="22"/>
+        </w:rPr>
+        <w:t>화자 표 밖으로 빠지기 쉬운 실입니다. 같은 사실은 두 읽기를 둘 다 적고, 숫자의 표는 뒤 파트에 둡니다.</w:t>
+      </w:r>
+    </w:p>
+    <w:p>
+      <w:pPr>
+        <w:spacing w:before="160" w:after="60"/>
+        <w:keepNext/>
+      </w:pPr>
+      <w:r>
+        <w:rPr>
+          <w:rFonts w:ascii="맑은 고딕" w:hAnsi="맑은 고딕" w:eastAsia="맑은 고딕"/>
+          <w:b/>
+          <w:i w:val="0"/>
+          <w:color w:val="0F2043"/>
+          <w:sz w:val="23"/>
+        </w:rPr>
+        <w:t>금리의 이면</w:t>
       </w:r>
     </w:p>
     <w:p>
@@ -2016,12 +2112,22 @@
       <w:r>
         <w:rPr>
           <w:rFonts w:ascii="맑은 고딕" w:hAnsi="맑은 고딕" w:eastAsia="맑은 고딕"/>
+          <w:b/>
+          <w:i w:val="0"/>
+          <w:color w:val="1A1A1A"/>
+          <w:sz w:val="22"/>
+        </w:rPr>
+        <w:t xml:space="preserve">베어 스티프닝. </w:t>
+      </w:r>
+      <w:r>
+        <w:rPr>
+          <w:rFonts w:ascii="맑은 고딕" w:hAnsi="맑은 고딕" w:eastAsia="맑은 고딕"/>
           <w:b w:val="0"/>
           <w:i w:val="0"/>
           <w:color w:val="1A1A1A"/>
           <w:sz w:val="22"/>
         </w:rPr>
-        <w:t>실적이 좋은 날의 하락을 실적 문장으로 위로하지 않습니다. 할인율을 봅니다.</w:t>
+        <w:t>미국 10년 5.2~5.3%, 말로 나온 정책 임계 5.5%. 한국 10년 약 4.3%. 10년 상승이 2년보다 큰 기울기가 오늘의 할인율입니다.</w:t>
       </w:r>
     </w:p>
     <w:p>
@@ -2042,12 +2148,22 @@
       <w:r>
         <w:rPr>
           <w:rFonts w:ascii="맑은 고딕" w:hAnsi="맑은 고딕" w:eastAsia="맑은 고딕"/>
+          <w:b/>
+          <w:i w:val="0"/>
+          <w:color w:val="1A1A1A"/>
+          <w:sz w:val="22"/>
+        </w:rPr>
+        <w:t xml:space="preserve">8월 CPI. </w:t>
+      </w:r>
+      <w:r>
+        <w:rPr>
+          <w:rFonts w:ascii="맑은 고딕" w:hAnsi="맑은 고딕" w:eastAsia="맑은 고딕"/>
           <w:b w:val="0"/>
           <w:i w:val="0"/>
           <w:color w:val="1A1A1A"/>
           <w:sz w:val="22"/>
         </w:rPr>
-        <w:t>깨진 날에 결심하지 않습니다. 되돌림에서 박스 위로 복귀하는 종목과, 복귀하지 못하는 종목을 가릅니다.</w:t>
+        <w:t>헤드라인 전월 +0.4%·전년 +3.4%, 근원 +0.3%·+2.4%. 9월 발표는 14일 밤. 노트에 컨센서스 레벨은 없습니다.</w:t>
       </w:r>
     </w:p>
     <w:p>
@@ -2068,12 +2184,22 @@
       <w:r>
         <w:rPr>
           <w:rFonts w:ascii="맑은 고딕" w:hAnsi="맑은 고딕" w:eastAsia="맑은 고딕"/>
+          <w:b/>
+          <w:i w:val="0"/>
+          <w:color w:val="1A1A1A"/>
+          <w:sz w:val="22"/>
+        </w:rPr>
+        <w:t xml:space="preserve">세 갈래. </w:t>
+      </w:r>
+      <w:r>
+        <w:rPr>
+          <w:rFonts w:ascii="맑은 고딕" w:hAnsi="맑은 고딕" w:eastAsia="맑은 고딕"/>
           <w:b w:val="0"/>
           <w:i w:val="0"/>
           <w:color w:val="1A1A1A"/>
           <w:sz w:val="22"/>
         </w:rPr>
-        <w:t>물린 비중을 더 사지 않습니다. 현금이었던 돈만 나눕니다. 반도체 비중이 이미 30~40%라면 더 줄이지 않습니다.</w:t>
+        <w:t>하회면 2년은 내릴 수 있고, 실질금리가 버티면 10년 하락은 제한됩니다. 부합이면 2년은 유지되고 10년·30년은 오를 수 있습니다. 상회면 둘 다 오릅니다.</w:t>
       </w:r>
     </w:p>
     <w:p>
@@ -2094,12 +2220,22 @@
       <w:r>
         <w:rPr>
           <w:rFonts w:ascii="맑은 고딕" w:hAnsi="맑은 고딕" w:eastAsia="맑은 고딕"/>
+          <w:b/>
+          <w:i w:val="0"/>
+          <w:color w:val="1A1A1A"/>
+          <w:sz w:val="22"/>
+        </w:rPr>
+        <w:t xml:space="preserve">해외 매도. </w:t>
+      </w:r>
+      <w:r>
+        <w:rPr>
+          <w:rFonts w:ascii="맑은 고딕" w:hAnsi="맑은 고딕" w:eastAsia="맑은 고딕"/>
           <w:b w:val="0"/>
           <w:i w:val="0"/>
           <w:color w:val="1A1A1A"/>
           <w:sz w:val="22"/>
         </w:rPr>
-        <w:t>오픈AI의 700억 달러와 500억 달러는 플랫폼 총액과 수수료를 뺀 순액입니다. 그 차이로 반도체 수요를 접지 않습니다.</w:t>
+        <w:t>6월 720억, 7월 1,200억 달러는 각 월의 순매도입니다. 바이백은 월 약 600억 달러. 8월 TIC는 약 두 달 시차, 중순 업데이트.</w:t>
       </w:r>
     </w:p>
     <w:p>
@@ -2120,12 +2256,2046 @@
       <w:r>
         <w:rPr>
           <w:rFonts w:ascii="맑은 고딕" w:hAnsi="맑은 고딕" w:eastAsia="맑은 고딕"/>
+          <w:b/>
+          <w:i w:val="0"/>
+          <w:color w:val="1A1A1A"/>
+          <w:sz w:val="22"/>
+        </w:rPr>
+        <w:t xml:space="preserve">보유 구조. </w:t>
+      </w:r>
+      <w:r>
+        <w:rPr>
+          <w:rFonts w:ascii="맑은 고딕" w:hAnsi="맑은 고딕" w:eastAsia="맑은 고딕"/>
           <w:b w:val="0"/>
           <w:i w:val="0"/>
           <w:color w:val="1A1A1A"/>
           <w:sz w:val="22"/>
         </w:rPr>
-        <w:t>미국 지수 적립은 유지할 수 있습니다. 4년 상승의 고점에서 남은 현금을 한 번에 넣는 것, 한국을 비우고 미국만 채우는 것은 다른 결정입니다.</w:t>
+        <w:t>미국은 국내 약 70·해외 약 30. 일본·중국·인도는 약 95 대 5. SLR로 국내 흡수를 ‘최소 25%포인트’로 본다는 것은 그의 논리입니다.</w:t>
+      </w:r>
+    </w:p>
+    <w:p>
+      <w:pPr>
+        <w:spacing w:after="50" w:before="0" w:line="276" w:lineRule="auto"/>
+        <w:ind w:left="312" w:hanging="198"/>
+      </w:pPr>
+      <w:r>
+        <w:rPr>
+          <w:rFonts w:ascii="맑은 고딕" w:hAnsi="맑은 고딕" w:eastAsia="맑은 고딕"/>
+          <w:b w:val="0"/>
+          <w:i w:val="0"/>
+          <w:color w:val="1E407C"/>
+          <w:sz w:val="22"/>
+        </w:rPr>
+        <w:t xml:space="preserve">• </w:t>
+      </w:r>
+      <w:r>
+        <w:rPr>
+          <w:rFonts w:ascii="맑은 고딕" w:hAnsi="맑은 고딕" w:eastAsia="맑은 고딕"/>
+          <w:b/>
+          <w:i w:val="0"/>
+          <w:color w:val="1A1A1A"/>
+          <w:sz w:val="22"/>
+        </w:rPr>
+        <w:t xml:space="preserve">그레그 입. </w:t>
+      </w:r>
+      <w:r>
+        <w:rPr>
+          <w:rFonts w:ascii="맑은 고딕" w:hAnsi="맑은 고딕" w:eastAsia="맑은 고딕"/>
+          <w:b w:val="0"/>
+          <w:i w:val="0"/>
+          <w:color w:val="1A1A1A"/>
+          <w:sz w:val="22"/>
+        </w:rPr>
+        <w:t>명목 GDI 6.1→6.6→6.9가 50년 회귀로 10년 약 5.8%. 높은 금리가 고장만이 아닐 수 있다는 말입니다.</w:t>
+      </w:r>
+    </w:p>
+    <w:p>
+      <w:pPr>
+        <w:spacing w:after="50" w:before="0" w:line="276" w:lineRule="auto"/>
+        <w:ind w:left="312" w:hanging="198"/>
+      </w:pPr>
+      <w:r>
+        <w:rPr>
+          <w:rFonts w:ascii="맑은 고딕" w:hAnsi="맑은 고딕" w:eastAsia="맑은 고딕"/>
+          <w:b w:val="0"/>
+          <w:i w:val="0"/>
+          <w:color w:val="1E407C"/>
+          <w:sz w:val="22"/>
+        </w:rPr>
+        <w:t xml:space="preserve">• </w:t>
+      </w:r>
+      <w:r>
+        <w:rPr>
+          <w:rFonts w:ascii="맑은 고딕" w:hAnsi="맑은 고딕" w:eastAsia="맑은 고딕"/>
+          <w:b/>
+          <w:i w:val="0"/>
+          <w:color w:val="1A1A1A"/>
+          <w:sz w:val="22"/>
+        </w:rPr>
+        <w:t xml:space="preserve">부의 스톡. </w:t>
+      </w:r>
+      <w:r>
+        <w:rPr>
+          <w:rFonts w:ascii="맑은 고딕" w:hAnsi="맑은 고딕" w:eastAsia="맑은 고딕"/>
+          <w:b w:val="0"/>
+          <w:i w:val="0"/>
+          <w:color w:val="1A1A1A"/>
+          <w:sz w:val="22"/>
+        </w:rPr>
+        <w:t>미국 GDP 32조·시총 68~70조·부 167조 달러. 한국 GDP 1.9조·부 11조. 부채/부 한국 17%·미국 24%. 국채를 0으로 두지 말라는 국내 매수 이야기입니다. 비교의 초점은 미국 부의 스톡이 크다는 점입니다.</w:t>
+      </w:r>
+    </w:p>
+    <w:p>
+      <w:pPr>
+        <w:spacing w:after="50" w:before="0" w:line="276" w:lineRule="auto"/>
+        <w:ind w:left="312" w:hanging="198"/>
+      </w:pPr>
+      <w:r>
+        <w:rPr>
+          <w:rFonts w:ascii="맑은 고딕" w:hAnsi="맑은 고딕" w:eastAsia="맑은 고딕"/>
+          <w:b w:val="0"/>
+          <w:i w:val="0"/>
+          <w:color w:val="1E407C"/>
+          <w:sz w:val="22"/>
+        </w:rPr>
+        <w:t xml:space="preserve">• </w:t>
+      </w:r>
+      <w:r>
+        <w:rPr>
+          <w:rFonts w:ascii="맑은 고딕" w:hAnsi="맑은 고딕" w:eastAsia="맑은 고딕"/>
+          <w:b/>
+          <w:i w:val="0"/>
+          <w:color w:val="1A1A1A"/>
+          <w:sz w:val="22"/>
+        </w:rPr>
+        <w:t xml:space="preserve">미국 밖 장기물. </w:t>
+      </w:r>
+      <w:r>
+        <w:rPr>
+          <w:rFonts w:ascii="맑은 고딕" w:hAnsi="맑은 고딕" w:eastAsia="맑은 고딕"/>
+          <w:b w:val="0"/>
+          <w:i w:val="0"/>
+          <w:color w:val="1A1A1A"/>
+          <w:sz w:val="22"/>
+        </w:rPr>
+        <w:t>프랑스·독일·일본·한국 장기금리가 수십 년 고점 근처. 멜랑숑은 프랑스 중앙은행 보유 국채 5,440억 유로 소각을 말합니다. 정치는 체감을 키우고, 국내 보유가 낮은 나라의 장기물이 더 아픕니다.</w:t>
+      </w:r>
+    </w:p>
+    <w:p>
+      <w:pPr>
+        <w:spacing w:after="50" w:before="0" w:line="276" w:lineRule="auto"/>
+        <w:ind w:left="312" w:hanging="198"/>
+      </w:pPr>
+      <w:r>
+        <w:rPr>
+          <w:rFonts w:ascii="맑은 고딕" w:hAnsi="맑은 고딕" w:eastAsia="맑은 고딕"/>
+          <w:b w:val="0"/>
+          <w:i w:val="0"/>
+          <w:color w:val="1E407C"/>
+          <w:sz w:val="22"/>
+        </w:rPr>
+        <w:t xml:space="preserve">• </w:t>
+      </w:r>
+      <w:r>
+        <w:rPr>
+          <w:rFonts w:ascii="맑은 고딕" w:hAnsi="맑은 고딕" w:eastAsia="맑은 고딕"/>
+          <w:b/>
+          <w:i w:val="0"/>
+          <w:color w:val="1A1A1A"/>
+          <w:sz w:val="22"/>
+        </w:rPr>
+        <w:t xml:space="preserve">하이퍼스케일러 회사채. </w:t>
+      </w:r>
+      <w:r>
+        <w:rPr>
+          <w:rFonts w:ascii="맑은 고딕" w:hAnsi="맑은 고딕" w:eastAsia="맑은 고딕"/>
+          <w:b w:val="0"/>
+          <w:i w:val="0"/>
+          <w:color w:val="1A1A1A"/>
+          <w:sz w:val="22"/>
+        </w:rPr>
+        <w:t>국채 대비 1~2%포인트, 이후 2~3%포인트. 발행 정점은 확인 전인 강세 메모 하나입니다. 금리 상승의 원인이고, 동시에 신용 수요가 살아 있다는 증거입니다.</w:t>
+      </w:r>
+    </w:p>
+    <w:p>
+      <w:pPr>
+        <w:spacing w:after="50" w:before="0" w:line="276" w:lineRule="auto"/>
+        <w:ind w:left="312" w:hanging="198"/>
+      </w:pPr>
+      <w:r>
+        <w:rPr>
+          <w:rFonts w:ascii="맑은 고딕" w:hAnsi="맑은 고딕" w:eastAsia="맑은 고딕"/>
+          <w:b w:val="0"/>
+          <w:i w:val="0"/>
+          <w:color w:val="1E407C"/>
+          <w:sz w:val="22"/>
+        </w:rPr>
+        <w:t xml:space="preserve">• </w:t>
+      </w:r>
+      <w:r>
+        <w:rPr>
+          <w:rFonts w:ascii="맑은 고딕" w:hAnsi="맑은 고딕" w:eastAsia="맑은 고딕"/>
+          <w:b/>
+          <w:i w:val="0"/>
+          <w:color w:val="1A1A1A"/>
+          <w:sz w:val="22"/>
+        </w:rPr>
+        <w:t xml:space="preserve">오픈AI. </w:t>
+      </w:r>
+      <w:r>
+        <w:rPr>
+          <w:rFonts w:ascii="맑은 고딕" w:hAnsi="맑은 고딕" w:eastAsia="맑은 고딕"/>
+          <w:b w:val="0"/>
+          <w:i w:val="0"/>
+          <w:color w:val="1A1A1A"/>
+          <w:sz w:val="22"/>
+        </w:rPr>
+        <w:t>플랫폼 총액 약 700억 달러와 수수료를 뺀 약 500억 달러는 부풀린 회계가 아닙니다. 앤트로픽도 총액·순액·클라우드 믹스. ARR은 최근×12. 센티가 약해 시장이 핑계를 찾는 자리입니다. 신규 진입을 법으로 막던 슬로다운은 해자였고, 상장은 첫날의 폭을 키우려고 미룬 쪽입니다. 안전·해킹은 초기 인터넷의 부작용으로 두고, 그 차이로 반도체 수요를 접는 말은 화자의 말이 아닙니다.</w:t>
+      </w:r>
+    </w:p>
+    <w:p>
+      <w:pPr>
+        <w:spacing w:after="50" w:before="0" w:line="276" w:lineRule="auto"/>
+        <w:ind w:left="312" w:hanging="198"/>
+      </w:pPr>
+      <w:r>
+        <w:rPr>
+          <w:rFonts w:ascii="맑은 고딕" w:hAnsi="맑은 고딕" w:eastAsia="맑은 고딕"/>
+          <w:b w:val="0"/>
+          <w:i w:val="0"/>
+          <w:color w:val="1E407C"/>
+          <w:sz w:val="22"/>
+        </w:rPr>
+        <w:t xml:space="preserve">• </w:t>
+      </w:r>
+      <w:r>
+        <w:rPr>
+          <w:rFonts w:ascii="맑은 고딕" w:hAnsi="맑은 고딕" w:eastAsia="맑은 고딕"/>
+          <w:b/>
+          <w:i w:val="0"/>
+          <w:color w:val="1A1A1A"/>
+          <w:sz w:val="22"/>
+        </w:rPr>
+        <w:t xml:space="preserve">정책 순서. </w:t>
+      </w:r>
+      <w:r>
+        <w:rPr>
+          <w:rFonts w:ascii="맑은 고딕" w:hAnsi="맑은 고딕" w:eastAsia="맑은 고딕"/>
+          <w:b w:val="0"/>
+          <w:i w:val="0"/>
+          <w:color w:val="1A1A1A"/>
+          <w:sz w:val="22"/>
+        </w:rPr>
+        <w:t>바이백은 이미 켜져 있고 작습니다. SLR은 진행 중. 오퍼레이션 트위스트가 선호(듀레이션이고, 대차대조표 크기가 핵심이 아닙니다). YCC·QE는 맨 뒤, 일본 YCC는 2016년부터. 2022년 물가의 재연을 피하려는 순서입니다. 10년 5.5% 전에는 말이 카드입니다.</w:t>
+      </w:r>
+    </w:p>
+    <w:p>
+      <w:pPr>
+        <w:spacing w:after="50" w:before="0" w:line="276" w:lineRule="auto"/>
+        <w:ind w:left="312" w:hanging="198"/>
+      </w:pPr>
+      <w:r>
+        <w:rPr>
+          <w:rFonts w:ascii="맑은 고딕" w:hAnsi="맑은 고딕" w:eastAsia="맑은 고딕"/>
+          <w:b w:val="0"/>
+          <w:i w:val="0"/>
+          <w:color w:val="1E407C"/>
+          <w:sz w:val="22"/>
+        </w:rPr>
+        <w:t xml:space="preserve">• </w:t>
+      </w:r>
+      <w:r>
+        <w:rPr>
+          <w:rFonts w:ascii="맑은 고딕" w:hAnsi="맑은 고딕" w:eastAsia="맑은 고딕"/>
+          <w:b/>
+          <w:i w:val="0"/>
+          <w:color w:val="1A1A1A"/>
+          <w:sz w:val="22"/>
+        </w:rPr>
+        <w:t xml:space="preserve">연준, 세 사람의 기본. </w:t>
+      </w:r>
+      <w:r>
+        <w:rPr>
+          <w:rFonts w:ascii="맑은 고딕" w:hAnsi="맑은 고딕" w:eastAsia="맑은 고딕"/>
+          <w:b w:val="0"/>
+          <w:i w:val="0"/>
+          <w:color w:val="1A1A1A"/>
+          <w:sz w:val="22"/>
+        </w:rPr>
+        <w:t>이춘광의 기본은 10월 인상·12월 동결입니다. 유가는 90달러 초반에서 100달러 위(후티·사우디), 9월 CPI 구간 약 95달러, 트루플레이션 9월이 틱업. 노근창은 9월을 의사록상 보험으로 보고, 10월 27~28일(한국 시간 29일)은 유가 급등이 없으면 동결. 공포 정점은 지났고, 10월 말 아마존·마이크로소프트·구글의 프리캐시플로·선수금·2년 부킹이 삼성 실적보다 앞섭니다. 이주현은 인상 확률이 20%대에서 30% 초반, 큰 상회가 없으면 동결이 다수, 국면은 아직 인상 사이클이고 한국도 인상입니다. 공통은 9월이 보험이었다는 점입니다.</w:t>
+      </w:r>
+    </w:p>
+    <w:p>
+      <w:pPr>
+        <w:spacing w:after="50" w:before="0" w:line="276" w:lineRule="auto"/>
+        <w:ind w:left="312" w:hanging="198"/>
+      </w:pPr>
+      <w:r>
+        <w:rPr>
+          <w:rFonts w:ascii="맑은 고딕" w:hAnsi="맑은 고딕" w:eastAsia="맑은 고딕"/>
+          <w:b w:val="0"/>
+          <w:i w:val="0"/>
+          <w:color w:val="1E407C"/>
+          <w:sz w:val="22"/>
+        </w:rPr>
+        <w:t xml:space="preserve">• </w:t>
+      </w:r>
+      <w:r>
+        <w:rPr>
+          <w:rFonts w:ascii="맑은 고딕" w:hAnsi="맑은 고딕" w:eastAsia="맑은 고딕"/>
+          <w:b/>
+          <w:i w:val="0"/>
+          <w:color w:val="1A1A1A"/>
+          <w:sz w:val="22"/>
+        </w:rPr>
+        <w:t xml:space="preserve">중동. </w:t>
+      </w:r>
+      <w:r>
+        <w:rPr>
+          <w:rFonts w:ascii="맑은 고딕" w:hAnsi="맑은 고딕" w:eastAsia="맑은 고딕"/>
+          <w:b w:val="0"/>
+          <w:i w:val="0"/>
+          <w:color w:val="1A1A1A"/>
+          <w:sz w:val="22"/>
+        </w:rPr>
+        <w:t>장기물의 문입니다. 이춘광은 교착으로 읽지 않습니다. 푸틴·트럼프 통화, 디젤, CIS에서 페제시키안과 푸틴이 만난 뒤 내용이 트럼프에게 전달됩니다(메시지이고, 중재의 완료가 아닙니다). UN에서 핵 제한과 협상 의향, 전술일 수 있습니다. 에너지 타격 자제 요청과 같은 날의 타격이 공존합니다. 중간선거가 미국을 유가에 민감하게 만듭니다. 호르무즈·사우디가 물가의 문입니다.</w:t>
+      </w:r>
+    </w:p>
+    <w:p>
+      <w:pPr>
+        <w:spacing w:after="50" w:before="0" w:line="276" w:lineRule="auto"/>
+        <w:ind w:left="312" w:hanging="198"/>
+      </w:pPr>
+      <w:r>
+        <w:rPr>
+          <w:rFonts w:ascii="맑은 고딕" w:hAnsi="맑은 고딕" w:eastAsia="맑은 고딕"/>
+          <w:b w:val="0"/>
+          <w:i w:val="0"/>
+          <w:color w:val="1E407C"/>
+          <w:sz w:val="22"/>
+        </w:rPr>
+        <w:t xml:space="preserve">• </w:t>
+      </w:r>
+      <w:r>
+        <w:rPr>
+          <w:rFonts w:ascii="맑은 고딕" w:hAnsi="맑은 고딕" w:eastAsia="맑은 고딕"/>
+          <w:b/>
+          <w:i w:val="0"/>
+          <w:color w:val="1A1A1A"/>
+          <w:sz w:val="22"/>
+        </w:rPr>
+        <w:t xml:space="preserve">낙폭을 늘어놓는 용도. </w:t>
+      </w:r>
+      <w:r>
+        <w:rPr>
+          <w:rFonts w:ascii="맑은 고딕" w:hAnsi="맑은 고딕" w:eastAsia="맑은 고딕"/>
+          <w:b w:val="0"/>
+          <w:i w:val="0"/>
+          <w:color w:val="1A1A1A"/>
+          <w:sz w:val="22"/>
+        </w:rPr>
+        <w:t>2022~23년 +525bp. 2023년 초 SVB 다음 파월 매파, 코스피·S&amp;P 일주일 약 -5% 뒤 BTFP. 2024년 봄 일주일 약 -5%. 엔 캐리, S&amp;P 일주일 약 -8%. 2025년 가을 관세, 두 달 -19.8%. ‘새벽 전의 어둠’은 본인이 인정한 편향의 고백이고 약속이 아닙니다. 그가 실제로 잠재우는 공포는 기축이 흔들리는 그림입니다.</w:t>
+      </w:r>
+    </w:p>
+    <w:p>
+      <w:pPr>
+        <w:spacing w:after="50" w:before="0" w:line="276" w:lineRule="auto"/>
+        <w:ind w:left="312" w:hanging="198"/>
+      </w:pPr>
+      <w:r>
+        <w:rPr>
+          <w:rFonts w:ascii="맑은 고딕" w:hAnsi="맑은 고딕" w:eastAsia="맑은 고딕"/>
+          <w:b w:val="0"/>
+          <w:i w:val="0"/>
+          <w:color w:val="1E407C"/>
+          <w:sz w:val="22"/>
+        </w:rPr>
+        <w:t xml:space="preserve">• </w:t>
+      </w:r>
+      <w:r>
+        <w:rPr>
+          <w:rFonts w:ascii="맑은 고딕" w:hAnsi="맑은 고딕" w:eastAsia="맑은 고딕"/>
+          <w:b/>
+          <w:i w:val="0"/>
+          <w:color w:val="1A1A1A"/>
+          <w:sz w:val="22"/>
+        </w:rPr>
+        <w:t xml:space="preserve">채권 밸류. </w:t>
+      </w:r>
+      <w:r>
+        <w:rPr>
+          <w:rFonts w:ascii="맑은 고딕" w:hAnsi="맑은 고딕" w:eastAsia="맑은 고딕"/>
+          <w:b w:val="0"/>
+          <w:i w:val="0"/>
+          <w:color w:val="1A1A1A"/>
+          <w:sz w:val="22"/>
+        </w:rPr>
+        <w:t>1시그마 약 30bp 밖 급등은 9월 말까지의 차트에서 되밀린 경우가 많습니다. BofA 10월 초, 15년물 10년 롤링이 1936년 이후 마이너스인 때는 1959년 10월과 2026년 8월부터 약 -2.3%. 살 수 있는 영역이고, 전량을 넣으라는 문장은 아닙니다. 2025년 4월 7~8일 관세 저점과의 자기 비교입니다.</w:t>
+      </w:r>
+    </w:p>
+    <w:p>
+      <w:pPr>
+        <w:spacing w:after="50" w:before="0" w:line="276" w:lineRule="auto"/>
+        <w:ind w:left="312" w:hanging="198"/>
+      </w:pPr>
+      <w:r>
+        <w:rPr>
+          <w:rFonts w:ascii="맑은 고딕" w:hAnsi="맑은 고딕" w:eastAsia="맑은 고딕"/>
+          <w:b w:val="0"/>
+          <w:i w:val="0"/>
+          <w:color w:val="1E407C"/>
+          <w:sz w:val="22"/>
+        </w:rPr>
+        <w:t xml:space="preserve">• </w:t>
+      </w:r>
+      <w:r>
+        <w:rPr>
+          <w:rFonts w:ascii="맑은 고딕" w:hAnsi="맑은 고딕" w:eastAsia="맑은 고딕"/>
+          <w:b/>
+          <w:i w:val="0"/>
+          <w:color w:val="1A1A1A"/>
+          <w:sz w:val="22"/>
+        </w:rPr>
+        <w:t xml:space="preserve">속도와 국면 인식. </w:t>
+      </w:r>
+      <w:r>
+        <w:rPr>
+          <w:rFonts w:ascii="맑은 고딕" w:hAnsi="맑은 고딕" w:eastAsia="맑은 고딕"/>
+          <w:b w:val="0"/>
+          <w:i w:val="0"/>
+          <w:color w:val="1A1A1A"/>
+          <w:sz w:val="22"/>
+        </w:rPr>
+        <w:t>금리와 환율은 천천히 움직여야 하고, 빠른 하락도 리스크오프입니다. 채권 돈과 주식 돈은 풀이 다릅니다. 2026년이 높으면 2027년 물가는 기저입니다. 4.5%는 예전에 위기였고 지금은 ‘낮다’, 1,550은 패닉이고 1,330은 원이 강하다는 말, 옛 기사는 1,300을 위기라 썼습니다.</w:t>
+      </w:r>
+    </w:p>
+    <w:p>
+      <w:pPr>
+        <w:spacing w:after="50" w:before="0" w:line="276" w:lineRule="auto"/>
+        <w:ind w:left="312" w:hanging="198"/>
+      </w:pPr>
+      <w:r>
+        <w:rPr>
+          <w:rFonts w:ascii="맑은 고딕" w:hAnsi="맑은 고딕" w:eastAsia="맑은 고딕"/>
+          <w:b w:val="0"/>
+          <w:i w:val="0"/>
+          <w:color w:val="1E407C"/>
+          <w:sz w:val="22"/>
+        </w:rPr>
+        <w:t xml:space="preserve">• </w:t>
+      </w:r>
+      <w:r>
+        <w:rPr>
+          <w:rFonts w:ascii="맑은 고딕" w:hAnsi="맑은 고딕" w:eastAsia="맑은 고딕"/>
+          <w:b/>
+          <w:i w:val="0"/>
+          <w:color w:val="1A1A1A"/>
+          <w:sz w:val="22"/>
+        </w:rPr>
+        <w:t xml:space="preserve">국정원. </w:t>
+      </w:r>
+      <w:r>
+        <w:rPr>
+          <w:rFonts w:ascii="맑은 고딕" w:hAnsi="맑은 고딕" w:eastAsia="맑은 고딕"/>
+          <w:b w:val="0"/>
+          <w:i w:val="0"/>
+          <w:color w:val="1A1A1A"/>
+          <w:sz w:val="22"/>
+        </w:rPr>
+        <w:t>정치는 이미 가격 안에 들어왔습니다. 화자는 그 대목에서 말을 멈춥니다.</w:t>
+      </w:r>
+    </w:p>
+    <w:p>
+      <w:pPr>
+        <w:spacing w:before="160" w:after="60"/>
+        <w:keepNext/>
+      </w:pPr>
+      <w:r>
+        <w:rPr>
+          <w:rFonts w:ascii="맑은 고딕" w:hAnsi="맑은 고딕" w:eastAsia="맑은 고딕"/>
+          <w:b/>
+          <w:i w:val="0"/>
+          <w:color w:val="0F2043"/>
+          <w:sz w:val="23"/>
+        </w:rPr>
+        <w:t>한국이 유독 맞는 자리</w:t>
+      </w:r>
+    </w:p>
+    <w:p>
+      <w:pPr>
+        <w:spacing w:after="50" w:before="0" w:line="276" w:lineRule="auto"/>
+        <w:ind w:left="312" w:hanging="198"/>
+      </w:pPr>
+      <w:r>
+        <w:rPr>
+          <w:rFonts w:ascii="맑은 고딕" w:hAnsi="맑은 고딕" w:eastAsia="맑은 고딕"/>
+          <w:b w:val="0"/>
+          <w:i w:val="0"/>
+          <w:color w:val="1E407C"/>
+          <w:sz w:val="22"/>
+        </w:rPr>
+        <w:t xml:space="preserve">• </w:t>
+      </w:r>
+      <w:r>
+        <w:rPr>
+          <w:rFonts w:ascii="맑은 고딕" w:hAnsi="맑은 고딕" w:eastAsia="맑은 고딕"/>
+          <w:b/>
+          <w:i w:val="0"/>
+          <w:color w:val="1A1A1A"/>
+          <w:sz w:val="22"/>
+        </w:rPr>
+        <w:t xml:space="preserve">테이프. </w:t>
+      </w:r>
+      <w:r>
+        <w:rPr>
+          <w:rFonts w:ascii="맑은 고딕" w:hAnsi="맑은 고딕" w:eastAsia="맑은 고딕"/>
+          <w:b w:val="0"/>
+          <w:i w:val="0"/>
+          <w:color w:val="1A1A1A"/>
+          <w:sz w:val="22"/>
+        </w:rPr>
+        <w:t>코스피는 저가 부근 약 -3.6%, 코스닥 약 -4.8%(장중 4.77%). 장중 약 6,394. 아침 이야기는 약 -2.8%에서 시작. 종가는 저가. 일본은 스포츠의 날, 미국은 주식이 열려도 채권·외환이 쉬는 날일 수 있습니다. 월요일은 위클리 옵션 만기. 유럽도 약합니다. 나스닥 선물은 장중 약 +0.4%.</w:t>
+      </w:r>
+    </w:p>
+    <w:p>
+      <w:pPr>
+        <w:spacing w:after="50" w:before="0" w:line="276" w:lineRule="auto"/>
+        <w:ind w:left="312" w:hanging="198"/>
+      </w:pPr>
+      <w:r>
+        <w:rPr>
+          <w:rFonts w:ascii="맑은 고딕" w:hAnsi="맑은 고딕" w:eastAsia="맑은 고딕"/>
+          <w:b w:val="0"/>
+          <w:i w:val="0"/>
+          <w:color w:val="1E407C"/>
+          <w:sz w:val="22"/>
+        </w:rPr>
+        <w:t xml:space="preserve">• </w:t>
+      </w:r>
+      <w:r>
+        <w:rPr>
+          <w:rFonts w:ascii="맑은 고딕" w:hAnsi="맑은 고딕" w:eastAsia="맑은 고딕"/>
+          <w:b/>
+          <w:i w:val="0"/>
+          <w:color w:val="1A1A1A"/>
+          <w:sz w:val="22"/>
+        </w:rPr>
+        <w:t xml:space="preserve">박스. </w:t>
+      </w:r>
+      <w:r>
+        <w:rPr>
+          <w:rFonts w:ascii="맑은 고딕" w:hAnsi="맑은 고딕" w:eastAsia="맑은 고딕"/>
+          <w:b w:val="0"/>
+          <w:i w:val="0"/>
+          <w:color w:val="1A1A1A"/>
+          <w:sz w:val="22"/>
+        </w:rPr>
+        <w:t>이권위는 6,400–7,500, 이평이 모였다 목·금에 하향. 박병창은 7,160 / 6,600, 11일선, 이탈하면 7월 하순 장대양봉의 50%인 6,000, 시계는 11월 초 중간선거 프록시. 볼린저 하단을 목요일에 닿고 한 번 더 늘었습니다. 지표 추적은 5,900을 열어 두고 이번 주 3~4%를 허용. 지난주 주간 -5.39%. 6,400이 버틴다는 본인 말은 틀렸다고 인정합니다. 연말 7,000 위는 시나리오 하나입니다.</w:t>
+      </w:r>
+    </w:p>
+    <w:p>
+      <w:pPr>
+        <w:spacing w:after="50" w:before="0" w:line="276" w:lineRule="auto"/>
+        <w:ind w:left="312" w:hanging="198"/>
+      </w:pPr>
+      <w:r>
+        <w:rPr>
+          <w:rFonts w:ascii="맑은 고딕" w:hAnsi="맑은 고딕" w:eastAsia="맑은 고딕"/>
+          <w:b w:val="0"/>
+          <w:i w:val="0"/>
+          <w:color w:val="1E407C"/>
+          <w:sz w:val="22"/>
+        </w:rPr>
+        <w:t xml:space="preserve">• </w:t>
+      </w:r>
+      <w:r>
+        <w:rPr>
+          <w:rFonts w:ascii="맑은 고딕" w:hAnsi="맑은 고딕" w:eastAsia="맑은 고딕"/>
+          <w:b/>
+          <w:i w:val="0"/>
+          <w:color w:val="1A1A1A"/>
+          <w:sz w:val="22"/>
+        </w:rPr>
+        <w:t xml:space="preserve">수급. </w:t>
+      </w:r>
+      <w:r>
+        <w:rPr>
+          <w:rFonts w:ascii="맑은 고딕" w:hAnsi="맑은 고딕" w:eastAsia="맑은 고딕"/>
+          <w:b w:val="0"/>
+          <w:i w:val="0"/>
+          <w:color w:val="1A1A1A"/>
+          <w:sz w:val="22"/>
+        </w:rPr>
+        <w:t>오늘 외국인 약 1.16조는 하락의 전부가 아닙니다. 지난주 외국인 약 6.9조는 한글날로 짧은 주의 3거래일. 영국계 헤지·숏과 최근 미국계 매수가 공존합니다. 개인 약 1.8조는 마지못한 물타기에 가깝습니다. 목요일 반도체 ETF 리밸런싱 약 19조, 삼성 축소·장비 매수. 직원 매수 약 15조는 끝났고 소각이 아닙니다. 미국 10년이 약 5.3%를 넘은 뒤 일본과 디커플링. MSCI 신흥국이라 중국 대비 팔기 쉽고, 연초 대비 약 +50%라 외국인에게는 ‘이미 많이 올랐다’입니다.</w:t>
+      </w:r>
+    </w:p>
+    <w:p>
+      <w:pPr>
+        <w:spacing w:after="50" w:before="0" w:line="276" w:lineRule="auto"/>
+        <w:ind w:left="312" w:hanging="198"/>
+      </w:pPr>
+      <w:r>
+        <w:rPr>
+          <w:rFonts w:ascii="맑은 고딕" w:hAnsi="맑은 고딕" w:eastAsia="맑은 고딕"/>
+          <w:b w:val="0"/>
+          <w:i w:val="0"/>
+          <w:color w:val="1E407C"/>
+          <w:sz w:val="22"/>
+        </w:rPr>
+        <w:t xml:space="preserve">• </w:t>
+      </w:r>
+      <w:r>
+        <w:rPr>
+          <w:rFonts w:ascii="맑은 고딕" w:hAnsi="맑은 고딕" w:eastAsia="맑은 고딕"/>
+          <w:b/>
+          <w:i w:val="0"/>
+          <w:color w:val="1A1A1A"/>
+          <w:sz w:val="22"/>
+        </w:rPr>
+        <w:t xml:space="preserve">지수와 메모리. </w:t>
+      </w:r>
+      <w:r>
+        <w:rPr>
+          <w:rFonts w:ascii="맑은 고딕" w:hAnsi="맑은 고딕" w:eastAsia="맑은 고딕"/>
+          <w:b w:val="0"/>
+          <w:i w:val="0"/>
+          <w:color w:val="1A1A1A"/>
+          <w:sz w:val="22"/>
+        </w:rPr>
+        <w:t>AI가 S&amp;P 시총의 약 45%. 다우는 이미 약하고, S&amp;P의 약 20%만 50일선 위. 프랑스 8,700→7,700. 달러 강세는 미국 대 취약한 나라(2011년, 1998년의 유비)입니다. 엔비디아는 고점 근처에서 바이백·인수. 샌디스크·마이크론은 깊은 조정 뒤 한국보다 큰 반등. 나이키와 배당·소비는 신저가. 코스닥은 롱과 숏이 충돌해 매매 제외, 777은 그 구간의 언급입니다.</w:t>
+      </w:r>
+    </w:p>
+    <w:p>
+      <w:pPr>
+        <w:spacing w:after="50" w:before="0" w:line="276" w:lineRule="auto"/>
+        <w:ind w:left="312" w:hanging="198"/>
+      </w:pPr>
+      <w:r>
+        <w:rPr>
+          <w:rFonts w:ascii="맑은 고딕" w:hAnsi="맑은 고딕" w:eastAsia="맑은 고딕"/>
+          <w:b w:val="0"/>
+          <w:i w:val="0"/>
+          <w:color w:val="1E407C"/>
+          <w:sz w:val="22"/>
+        </w:rPr>
+        <w:t xml:space="preserve">• </w:t>
+      </w:r>
+      <w:r>
+        <w:rPr>
+          <w:rFonts w:ascii="맑은 고딕" w:hAnsi="맑은 고딕" w:eastAsia="맑은 고딕"/>
+          <w:b/>
+          <w:i w:val="0"/>
+          <w:color w:val="1A1A1A"/>
+          <w:sz w:val="22"/>
+        </w:rPr>
+        <w:t xml:space="preserve">심으려는 버릇. </w:t>
+      </w:r>
+      <w:r>
+        <w:rPr>
+          <w:rFonts w:ascii="맑은 고딕" w:hAnsi="맑은 고딕" w:eastAsia="맑은 고딕"/>
+          <w:b w:val="0"/>
+          <w:i w:val="0"/>
+          <w:color w:val="1A1A1A"/>
+          <w:sz w:val="22"/>
+        </w:rPr>
+        <w:t>이탈 구간의 손절과 물타기는 보류하고, 결심은 되돌림에서. 이미 현금이었던 돈만, 가급적 주 후반 종가에 나눕니다. 반도체 비중 30~40%는 더 줄이지 않습니다. 전력·방산·조선·변압기는 반도체나 현금으로 덜어 냅니다. 교체 연습은 계좌의 10%. 7월 22일 전후 2주가 고점 후보, 레버리지 ETF는 고점 약 2주 전에 꺾여 반 토막 넘게 줄었습니다. 7만 원에 삼성을 사서 30만 원까지 간 사람과, 올해 늦게 들어온 사람은 다른 상처입니다. 이춘광 본인의 희망은 추가 -10%도 가능, 원금은 시간이 걸리고, 쇼티지는 계속, 삼성은 1등입니다.</w:t>
+      </w:r>
+    </w:p>
+    <w:p>
+      <w:pPr>
+        <w:spacing w:after="50" w:before="0" w:line="276" w:lineRule="auto"/>
+        <w:ind w:left="312" w:hanging="198"/>
+      </w:pPr>
+      <w:r>
+        <w:rPr>
+          <w:rFonts w:ascii="맑은 고딕" w:hAnsi="맑은 고딕" w:eastAsia="맑은 고딕"/>
+          <w:b w:val="0"/>
+          <w:i w:val="0"/>
+          <w:color w:val="1E407C"/>
+          <w:sz w:val="22"/>
+        </w:rPr>
+        <w:t xml:space="preserve">• </w:t>
+      </w:r>
+      <w:r>
+        <w:rPr>
+          <w:rFonts w:ascii="맑은 고딕" w:hAnsi="맑은 고딕" w:eastAsia="맑은 고딕"/>
+          <w:b/>
+          <w:i w:val="0"/>
+          <w:color w:val="1A1A1A"/>
+          <w:sz w:val="22"/>
+        </w:rPr>
+        <w:t xml:space="preserve">주성엔지니어링. </w:t>
+      </w:r>
+      <w:r>
+        <w:rPr>
+          <w:rFonts w:ascii="맑은 고딕" w:hAnsi="맑은 고딕" w:eastAsia="맑은 고딕"/>
+          <w:b w:val="0"/>
+          <w:i w:val="0"/>
+          <w:color w:val="1A1A1A"/>
+          <w:sz w:val="22"/>
+        </w:rPr>
+        <w:t>화자가 이름을 꺼낸 뒤 베끼지 말라고 한 자리입니다. 남는 것은 10% 연습이라는 방법입니다.</w:t>
+      </w:r>
+    </w:p>
+    <w:p>
+      <w:pPr>
+        <w:spacing w:before="160" w:after="60"/>
+        <w:keepNext/>
+      </w:pPr>
+      <w:r>
+        <w:rPr>
+          <w:rFonts w:ascii="맑은 고딕" w:hAnsi="맑은 고딕" w:eastAsia="맑은 고딕"/>
+          <w:b/>
+          <w:i w:val="0"/>
+          <w:color w:val="0F2043"/>
+          <w:sz w:val="23"/>
+        </w:rPr>
+        <w:t>삼성·메모리·장비</w:t>
+      </w:r>
+    </w:p>
+    <w:p>
+      <w:pPr>
+        <w:spacing w:after="50" w:before="0" w:line="276" w:lineRule="auto"/>
+        <w:ind w:left="312" w:hanging="198"/>
+      </w:pPr>
+      <w:r>
+        <w:rPr>
+          <w:rFonts w:ascii="맑은 고딕" w:hAnsi="맑은 고딕" w:eastAsia="맑은 고딕"/>
+          <w:b w:val="0"/>
+          <w:i w:val="0"/>
+          <w:color w:val="1E407C"/>
+          <w:sz w:val="22"/>
+        </w:rPr>
+        <w:t xml:space="preserve">• </w:t>
+      </w:r>
+      <w:r>
+        <w:rPr>
+          <w:rFonts w:ascii="맑은 고딕" w:hAnsi="맑은 고딕" w:eastAsia="맑은 고딕"/>
+          <w:b/>
+          <w:i w:val="0"/>
+          <w:color w:val="1A1A1A"/>
+          <w:sz w:val="22"/>
+        </w:rPr>
+        <w:t xml:space="preserve">사업부. </w:t>
+      </w:r>
+      <w:r>
+        <w:rPr>
+          <w:rFonts w:ascii="맑은 고딕" w:hAnsi="맑은 고딕" w:eastAsia="맑은 고딕"/>
+          <w:b w:val="0"/>
+          <w:i w:val="0"/>
+          <w:color w:val="1A1A1A"/>
+          <w:sz w:val="22"/>
+        </w:rPr>
+        <w:t>회사·메모리 영업이익 각 약 110조, 메모리 매출 약 140조. 스마트폰 약 -1.8조(흑자 주장도 있고, 일회성은 4분기까지), 디스플레이 +1.2조, 파운드리 약 -1조, 가전·VD는 손익분기 근처. 다음 분기 120조. 2027년 585조(거리의 말은 약 600조), 이듬해 662조, 모델은 2030년까지. ‘107조·매일 1조·엔비디아 85조’는 당일 말실수라 남기지 않습니다. 진행이 엔비디아라고 한 목요일 프린트는 삼성입니다.</w:t>
+      </w:r>
+    </w:p>
+    <w:p>
+      <w:pPr>
+        <w:spacing w:after="50" w:before="0" w:line="276" w:lineRule="auto"/>
+        <w:ind w:left="312" w:hanging="198"/>
+      </w:pPr>
+      <w:r>
+        <w:rPr>
+          <w:rFonts w:ascii="맑은 고딕" w:hAnsi="맑은 고딕" w:eastAsia="맑은 고딕"/>
+          <w:b w:val="0"/>
+          <w:i w:val="0"/>
+          <w:color w:val="1E407C"/>
+          <w:sz w:val="22"/>
+        </w:rPr>
+        <w:t xml:space="preserve">• </w:t>
+      </w:r>
+      <w:r>
+        <w:rPr>
+          <w:rFonts w:ascii="맑은 고딕" w:hAnsi="맑은 고딕" w:eastAsia="맑은 고딕"/>
+          <w:b/>
+          <w:i w:val="0"/>
+          <w:color w:val="1A1A1A"/>
+          <w:sz w:val="22"/>
+        </w:rPr>
+        <w:t xml:space="preserve">두 개의 분모. </w:t>
+      </w:r>
+      <w:r>
+        <w:rPr>
+          <w:rFonts w:ascii="맑은 고딕" w:hAnsi="맑은 고딕" w:eastAsia="맑은 고딕"/>
+          <w:b w:val="0"/>
+          <w:i w:val="0"/>
+          <w:color w:val="1A1A1A"/>
+          <w:sz w:val="22"/>
+        </w:rPr>
+        <w:t>선행 PER 3.0~3.1배, PBR 1.4배. 27만 원 = 선행 장부 1.5배, 지금은 그 아래라 ‘먹을 게 없다’가 나옵니다. 런레이트 PER 4배 미만은 ‘4년 치 이익이면 회사를 산다’는 다른 분모입니다.</w:t>
+      </w:r>
+    </w:p>
+    <w:p>
+      <w:pPr>
+        <w:spacing w:after="50" w:before="0" w:line="276" w:lineRule="auto"/>
+        <w:ind w:left="312" w:hanging="198"/>
+      </w:pPr>
+      <w:r>
+        <w:rPr>
+          <w:rFonts w:ascii="맑은 고딕" w:hAnsi="맑은 고딕" w:eastAsia="맑은 고딕"/>
+          <w:b w:val="0"/>
+          <w:i w:val="0"/>
+          <w:color w:val="1E407C"/>
+          <w:sz w:val="22"/>
+        </w:rPr>
+        <w:t xml:space="preserve">• </w:t>
+      </w:r>
+      <w:r>
+        <w:rPr>
+          <w:rFonts w:ascii="맑은 고딕" w:hAnsi="맑은 고딕" w:eastAsia="맑은 고딕"/>
+          <w:b/>
+          <w:i w:val="0"/>
+          <w:color w:val="1A1A1A"/>
+          <w:sz w:val="22"/>
+        </w:rPr>
+        <w:t xml:space="preserve">수급의 길. </w:t>
+      </w:r>
+      <w:r>
+        <w:rPr>
+          <w:rFonts w:ascii="맑은 고딕" w:hAnsi="맑은 고딕" w:eastAsia="맑은 고딕"/>
+          <w:b w:val="0"/>
+          <w:i w:val="0"/>
+          <w:color w:val="1A1A1A"/>
+          <w:sz w:val="22"/>
+        </w:rPr>
+        <w:t>밴드 하단 24.5만 원은 바이백이 지키던 자리이고, 바이백이 끝나 자동 지지가 아닙니다. 깨지면 22~23만 원은 여유 현금의 분할 스케줄입니다. 물타기의 가격도, 반등의 약속도 아닙니다. 배당은 9월 말 주주 약 4,500원(약 30조, 이사회 10월 말), 연말 주주 약 1만 원·수익률 약 3.8%. 환원 재원 90~110조, 중간 100조, 내년은 더 큽니다. 금산법상 금융 계열 한도 10%, 소각은 주식 수를 줄여 그 한도를 넘깁니다. 하이닉스는 바이백이 자유롭습니다. 영업이익 100조 구간의 직원 주식·성과급은 내부자가 업사이드를 먹는 그림입니다. 외국인은 바이백 호가에, 삼성만이 아니라 시장 전체에 팔았고, 더 비싼 값에 돌아오지 않습니다. 대만 반도체·일본 차가 대체재이고, 외교·정치 할인이 붙으며, 달러 환산이 원화 헤드라인을 작게 만듭니다.</w:t>
+      </w:r>
+    </w:p>
+    <w:p>
+      <w:pPr>
+        <w:spacing w:after="50" w:before="0" w:line="276" w:lineRule="auto"/>
+        <w:ind w:left="312" w:hanging="198"/>
+      </w:pPr>
+      <w:r>
+        <w:rPr>
+          <w:rFonts w:ascii="맑은 고딕" w:hAnsi="맑은 고딕" w:eastAsia="맑은 고딕"/>
+          <w:b w:val="0"/>
+          <w:i w:val="0"/>
+          <w:color w:val="1E407C"/>
+          <w:sz w:val="22"/>
+        </w:rPr>
+        <w:t xml:space="preserve">• </w:t>
+      </w:r>
+      <w:r>
+        <w:rPr>
+          <w:rFonts w:ascii="맑은 고딕" w:hAnsi="맑은 고딕" w:eastAsia="맑은 고딕"/>
+          <w:b/>
+          <w:i w:val="0"/>
+          <w:color w:val="1A1A1A"/>
+          <w:sz w:val="22"/>
+        </w:rPr>
+        <w:t xml:space="preserve">점유. </w:t>
+      </w:r>
+      <w:r>
+        <w:rPr>
+          <w:rFonts w:ascii="맑은 고딕" w:hAnsi="맑은 고딕" w:eastAsia="맑은 고딕"/>
+          <w:b w:val="0"/>
+          <w:i w:val="0"/>
+          <w:color w:val="1A1A1A"/>
+          <w:sz w:val="22"/>
+        </w:rPr>
+        <w:t>삼성 디램 2025년 32.3%, 2026년 1분기 38.5·2분기 39.4·3분기 40.8%. 하이닉스가 2025년 1~3분기 디램 1위였던 이유는 삼성 HBM3E 부진이고, 역전은 2025년 4분기 에이전틱 AI의 범용 급등부터입니다. HBM4는 AMD가 먼저, 엔비디아 피드백이 좋다는 것이 구조가 이어진다는 주장입니다. 하이닉스 디램 매출 529억 달러에서 올해 1,770억 달러, 매출은 큽니다. 낸드는 두 곳 모두 점유가 소폭 오릅니다. CXMT는 5.2%에서 8.6%이고, 한국 업체보다 비싸게 팝니다. 금액 점유가 수량보다 큽니다.</w:t>
+      </w:r>
+    </w:p>
+    <w:p>
+      <w:pPr>
+        <w:spacing w:after="50" w:before="0" w:line="276" w:lineRule="auto"/>
+        <w:ind w:left="312" w:hanging="198"/>
+      </w:pPr>
+      <w:r>
+        <w:rPr>
+          <w:rFonts w:ascii="맑은 고딕" w:hAnsi="맑은 고딕" w:eastAsia="맑은 고딕"/>
+          <w:b w:val="0"/>
+          <w:i w:val="0"/>
+          <w:color w:val="1E407C"/>
+          <w:sz w:val="22"/>
+        </w:rPr>
+        <w:t xml:space="preserve">• </w:t>
+      </w:r>
+      <w:r>
+        <w:rPr>
+          <w:rFonts w:ascii="맑은 고딕" w:hAnsi="맑은 고딕" w:eastAsia="맑은 고딕"/>
+          <w:b/>
+          <w:i w:val="0"/>
+          <w:color w:val="1A1A1A"/>
+          <w:sz w:val="22"/>
+        </w:rPr>
+        <w:t xml:space="preserve">신뢰의 시계. </w:t>
+      </w:r>
+      <w:r>
+        <w:rPr>
+          <w:rFonts w:ascii="맑은 고딕" w:hAnsi="맑은 고딕" w:eastAsia="맑은 고딕"/>
+          <w:b w:val="0"/>
+          <w:i w:val="0"/>
+          <w:color w:val="1A1A1A"/>
+          <w:sz w:val="22"/>
+        </w:rPr>
+        <w:t>서프라이즈는 작년 4분기에 시작됐고, 계절을 한 번 더 본다는 말입니다. 글로벌은 4분기가 좋은 것을 알아도 2028년을 의심합니다. TSMC PER이 5배에서 25배가 되는 데 10년 이상. D.A. Davidson의 마이크론 2,100달러에서 3,000달러, 19배는 소수 의견입니다. ‘7월 이후의 기회’는 약 100일째이고, 7월 31일 하이닉스 상한가·삼성 약 +28%의 반등 가격은 깨졌습니다. 선행 PBR 약 1.4. 현지인은 갇혀 의심하고, 외국인은 알고 있는 신흥국 조정을 앞서 사지 않습니다. 7,500을 현지인에게 넘길 자신이 있어야 외국인 매수입니다. 예탁금은 가격이 반응하지 않아 멈췄고, 믿음이 보일 때 방이 생깁니다.</w:t>
+      </w:r>
+    </w:p>
+    <w:p>
+      <w:pPr>
+        <w:spacing w:after="50" w:before="0" w:line="276" w:lineRule="auto"/>
+        <w:ind w:left="312" w:hanging="198"/>
+      </w:pPr>
+      <w:r>
+        <w:rPr>
+          <w:rFonts w:ascii="맑은 고딕" w:hAnsi="맑은 고딕" w:eastAsia="맑은 고딕"/>
+          <w:b w:val="0"/>
+          <w:i w:val="0"/>
+          <w:color w:val="1E407C"/>
+          <w:sz w:val="22"/>
+        </w:rPr>
+        <w:t xml:space="preserve">• </w:t>
+      </w:r>
+      <w:r>
+        <w:rPr>
+          <w:rFonts w:ascii="맑은 고딕" w:hAnsi="맑은 고딕" w:eastAsia="맑은 고딕"/>
+          <w:b/>
+          <w:i w:val="0"/>
+          <w:color w:val="1A1A1A"/>
+          <w:sz w:val="22"/>
+        </w:rPr>
+        <w:t xml:space="preserve">비메모리. </w:t>
+      </w:r>
+      <w:r>
+        <w:rPr>
+          <w:rFonts w:ascii="맑은 고딕" w:hAnsi="맑은 고딕" w:eastAsia="맑은 고딕"/>
+          <w:b w:val="0"/>
+          <w:i w:val="0"/>
+          <w:color w:val="1A1A1A"/>
+          <w:sz w:val="22"/>
+        </w:rPr>
+        <w:t>최대 이익 회사에 복합 할인이 남는 이유는 비메모리입니다. 호황으로 구조를 고치라는 말. 파운드리 인력은 메모리 출신이라 보상 격차가 아픕니다. 프리미엄 폰은 중국 경쟁자에게 디램이 없는 동안의 전략입니다. ETF를 사라는 말은, 농담으로 삼성으로 바뀌었습니다. HBM4, 싼 밸류, 디램 점유.</w:t>
+      </w:r>
+    </w:p>
+    <w:p>
+      <w:pPr>
+        <w:spacing w:after="50" w:before="0" w:line="276" w:lineRule="auto"/>
+        <w:ind w:left="312" w:hanging="198"/>
+      </w:pPr>
+      <w:r>
+        <w:rPr>
+          <w:rFonts w:ascii="맑은 고딕" w:hAnsi="맑은 고딕" w:eastAsia="맑은 고딕"/>
+          <w:b w:val="0"/>
+          <w:i w:val="0"/>
+          <w:color w:val="1E407C"/>
+          <w:sz w:val="22"/>
+        </w:rPr>
+        <w:t xml:space="preserve">• </w:t>
+      </w:r>
+      <w:r>
+        <w:rPr>
+          <w:rFonts w:ascii="맑은 고딕" w:hAnsi="맑은 고딕" w:eastAsia="맑은 고딕"/>
+          <w:b/>
+          <w:i w:val="0"/>
+          <w:color w:val="1A1A1A"/>
+          <w:sz w:val="22"/>
+        </w:rPr>
+        <w:t xml:space="preserve">장비의 온도. </w:t>
+      </w:r>
+      <w:r>
+        <w:rPr>
+          <w:rFonts w:ascii="맑은 고딕" w:hAnsi="맑은 고딕" w:eastAsia="맑은 고딕"/>
+          <w:b w:val="0"/>
+          <w:i w:val="0"/>
+          <w:color w:val="1A1A1A"/>
+          <w:sz w:val="22"/>
+        </w:rPr>
+        <w:t>국내 이름은 한 달에 +100%, 2~3주에 50~60%. 줄이고, 쫓지 않습니다. 보유는 ETF, 최근 약 +20%. 신호는 AMAT·KLA·Lam. 일본은 금요일에 장비만 강했습니다. 목요일 한국 리밸런싱은 삼성 ETF에서 장비로. ASML EUV 약 16대, 캐파는 20을 향해, 연 약 80대면 레벨이 오르고 수요는 그 위. 중국 수출 비중은 2024년 47%에서 10%, 행선은 한국·대만(EUV만이 아니라 장비 수출로 정정). 이머전 DUV는 중국이 비축과 국산화를 말하나 물량은 남습니다. AMAT는 사상 분기, 내년과 2027년이 더 강하고 그린필드 팹 10곳. Lam은 에칭 1등, 믹스는 낸드에서 파운드리, HBM 드라이 에칭은 독점, 가이던스 전분기 대비 +20%, AMEC와 비교하지 않고, 한국 에칭은 한 곳. TEL의 중국 비중 40%대에서 20~30%, 행선은 한국·대만. 중국의 위협은 실재하고, 5년 이상은 껍데기를 짓는 시간이라는 말입니다.</w:t>
+      </w:r>
+    </w:p>
+    <w:p>
+      <w:pPr>
+        <w:spacing w:after="50" w:before="0" w:line="276" w:lineRule="auto"/>
+        <w:ind w:left="312" w:hanging="198"/>
+      </w:pPr>
+      <w:r>
+        <w:rPr>
+          <w:rFonts w:ascii="맑은 고딕" w:hAnsi="맑은 고딕" w:eastAsia="맑은 고딕"/>
+          <w:b w:val="0"/>
+          <w:i w:val="0"/>
+          <w:color w:val="1E407C"/>
+          <w:sz w:val="22"/>
+        </w:rPr>
+        <w:t xml:space="preserve">• </w:t>
+      </w:r>
+      <w:r>
+        <w:rPr>
+          <w:rFonts w:ascii="맑은 고딕" w:hAnsi="맑은 고딕" w:eastAsia="맑은 고딕"/>
+          <w:b/>
+          <w:i w:val="0"/>
+          <w:color w:val="1A1A1A"/>
+          <w:sz w:val="22"/>
+        </w:rPr>
+        <w:t xml:space="preserve">광주·호남. </w:t>
+      </w:r>
+      <w:r>
+        <w:rPr>
+          <w:rFonts w:ascii="맑은 고딕" w:hAnsi="맑은 고딕" w:eastAsia="맑은 고딕"/>
+          <w:b w:val="0"/>
+          <w:i w:val="0"/>
+          <w:color w:val="1A1A1A"/>
+          <w:sz w:val="22"/>
+        </w:rPr>
+        <w:t>최태원 주말 발언과, 전제가 붙은 400조 보도. 노근창에게는 장비 주문을 계속 말하라는 재료. 이춘광에게는 외국인이 정치가 고른 입지를 코리아 디스카운트와 변동성으로 듣는 재료.</w:t>
+      </w:r>
+    </w:p>
+    <w:p>
+      <w:pPr>
+        <w:spacing w:after="50" w:before="0" w:line="276" w:lineRule="auto"/>
+        <w:ind w:left="312" w:hanging="198"/>
+      </w:pPr>
+      <w:r>
+        <w:rPr>
+          <w:rFonts w:ascii="맑은 고딕" w:hAnsi="맑은 고딕" w:eastAsia="맑은 고딕"/>
+          <w:b w:val="0"/>
+          <w:i w:val="0"/>
+          <w:color w:val="1E407C"/>
+          <w:sz w:val="22"/>
+        </w:rPr>
+        <w:t xml:space="preserve">• </w:t>
+      </w:r>
+      <w:r>
+        <w:rPr>
+          <w:rFonts w:ascii="맑은 고딕" w:hAnsi="맑은 고딕" w:eastAsia="맑은 고딕"/>
+          <w:b/>
+          <w:i w:val="0"/>
+          <w:color w:val="1A1A1A"/>
+          <w:sz w:val="22"/>
+        </w:rPr>
+        <w:t xml:space="preserve">TSMC. </w:t>
+      </w:r>
+      <w:r>
+        <w:rPr>
+          <w:rFonts w:ascii="맑은 고딕" w:hAnsi="맑은 고딕" w:eastAsia="맑은 고딕"/>
+          <w:b w:val="0"/>
+          <w:i w:val="0"/>
+          <w:color w:val="1A1A1A"/>
+          <w:sz w:val="22"/>
+        </w:rPr>
+        <w:t>대만달러 매출 전분기 +17.6%, 달러 가이던스 상단 +13.9%. 환율은 월간이고 분기 평균이 아닙니다. 비트 가능성. 방송은 12일과 15일을 둘 다 말합니다. 이번 주, 달력을 확인합니다. 가속기는 한 파운드리에 몰려 GPU와 TPU를 두 번 세지 않습니다. 월간 공시가 투명성의 우위. 하이퍼스케일러의 현금이, 삼성 실적보다 수요의 돈줄입니다.</w:t>
+      </w:r>
+    </w:p>
+    <w:p>
+      <w:pPr>
+        <w:spacing w:after="50" w:before="0" w:line="276" w:lineRule="auto"/>
+        <w:ind w:left="312" w:hanging="198"/>
+      </w:pPr>
+      <w:r>
+        <w:rPr>
+          <w:rFonts w:ascii="맑은 고딕" w:hAnsi="맑은 고딕" w:eastAsia="맑은 고딕"/>
+          <w:b w:val="0"/>
+          <w:i w:val="0"/>
+          <w:color w:val="1E407C"/>
+          <w:sz w:val="22"/>
+        </w:rPr>
+        <w:t xml:space="preserve">• </w:t>
+      </w:r>
+      <w:r>
+        <w:rPr>
+          <w:rFonts w:ascii="맑은 고딕" w:hAnsi="맑은 고딕" w:eastAsia="맑은 고딕"/>
+          <w:b/>
+          <w:i w:val="0"/>
+          <w:color w:val="1A1A1A"/>
+          <w:sz w:val="22"/>
+        </w:rPr>
+        <w:t xml:space="preserve">솔리다임. </w:t>
+      </w:r>
+      <w:r>
+        <w:rPr>
+          <w:rFonts w:ascii="맑은 고딕" w:hAnsi="맑은 고딕" w:eastAsia="맑은 고딕"/>
+          <w:b w:val="0"/>
+          <w:i w:val="0"/>
+          <w:color w:val="1A1A1A"/>
+          <w:sz w:val="22"/>
+        </w:rPr>
+        <w:t>단기에는 하이닉스에 마이너스. 상장하면 약 200조 원, 하이닉스 시총 1,200~1,300조의 12~13%이고 주가에 없습니다. 아직 팥은 아닙니다. 디램이 본체이고 낸드·SSD가 민감한 조각입니다. 이유는 SSD 투자비가 별도 법인에 있어서입니다. 신주인지 구주인지, 기존 주주가 무엇을 받는지를 봅니다. 블룸버그의 문장과 회사의 ‘검토 중’은 다릅니다.</w:t>
+      </w:r>
+    </w:p>
+    <w:p>
+      <w:pPr>
+        <w:spacing w:before="160" w:after="60"/>
+        <w:keepNext/>
+      </w:pPr>
+      <w:r>
+        <w:rPr>
+          <w:rFonts w:ascii="맑은 고딕" w:hAnsi="맑은 고딕" w:eastAsia="맑은 고딕"/>
+          <w:b/>
+          <w:i w:val="0"/>
+          <w:color w:val="0F2043"/>
+          <w:sz w:val="23"/>
+        </w:rPr>
+        <w:t>오늘 계좌 — 세 사람의 일</w:t>
+      </w:r>
+    </w:p>
+    <w:p>
+      <w:pPr>
+        <w:spacing w:after="50" w:before="0" w:line="276" w:lineRule="auto"/>
+        <w:ind w:left="312" w:hanging="198"/>
+      </w:pPr>
+      <w:r>
+        <w:rPr>
+          <w:rFonts w:ascii="맑은 고딕" w:hAnsi="맑은 고딕" w:eastAsia="맑은 고딕"/>
+          <w:b w:val="0"/>
+          <w:i w:val="0"/>
+          <w:color w:val="1E407C"/>
+          <w:sz w:val="22"/>
+        </w:rPr>
+        <w:t xml:space="preserve">• </w:t>
+      </w:r>
+      <w:r>
+        <w:rPr>
+          <w:rFonts w:ascii="맑은 고딕" w:hAnsi="맑은 고딕" w:eastAsia="맑은 고딕"/>
+          <w:b/>
+          <w:i w:val="0"/>
+          <w:color w:val="1A1A1A"/>
+          <w:sz w:val="22"/>
+        </w:rPr>
+        <w:t xml:space="preserve">지표 추적, 자기 코칭. </w:t>
+      </w:r>
+      <w:r>
+        <w:rPr>
+          <w:rFonts w:ascii="맑은 고딕" w:hAnsi="맑은 고딕" w:eastAsia="맑은 고딕"/>
+          <w:b w:val="0"/>
+          <w:i w:val="0"/>
+          <w:color w:val="1A1A1A"/>
+          <w:sz w:val="22"/>
+        </w:rPr>
+        <w:t>종가를 사고, 다음 날 아침 +1%에 팔고, 시초를 넘으면 다시 삽니다. 오늘의 손절은 금요일에 저가를 파는 일입니다. 120분·60분이 시초에 깨졌습니다. 7월의 첫 120일 이탈은 무서웠고, 6,000이 익숙해진 이번 이탈은 다른 사건입니다.</w:t>
+      </w:r>
+    </w:p>
+    <w:p>
+      <w:pPr>
+        <w:spacing w:after="50" w:before="0" w:line="276" w:lineRule="auto"/>
+        <w:ind w:left="312" w:hanging="198"/>
+      </w:pPr>
+      <w:r>
+        <w:rPr>
+          <w:rFonts w:ascii="맑은 고딕" w:hAnsi="맑은 고딕" w:eastAsia="맑은 고딕"/>
+          <w:b w:val="0"/>
+          <w:i w:val="0"/>
+          <w:color w:val="1E407C"/>
+          <w:sz w:val="22"/>
+        </w:rPr>
+        <w:t xml:space="preserve">• </w:t>
+      </w:r>
+      <w:r>
+        <w:rPr>
+          <w:rFonts w:ascii="맑은 고딕" w:hAnsi="맑은 고딕" w:eastAsia="맑은 고딕"/>
+          <w:b/>
+          <w:i w:val="0"/>
+          <w:color w:val="1A1A1A"/>
+          <w:sz w:val="22"/>
+        </w:rPr>
+        <w:t xml:space="preserve">지표 추적, 오늘을 비우는 이유. </w:t>
+      </w:r>
+      <w:r>
+        <w:rPr>
+          <w:rFonts w:ascii="맑은 고딕" w:hAnsi="맑은 고딕" w:eastAsia="맑은 고딕"/>
+          <w:b w:val="0"/>
+          <w:i w:val="0"/>
+          <w:color w:val="1A1A1A"/>
+          <w:sz w:val="22"/>
+        </w:rPr>
+        <w:t>미국이 다 열리지 않아 가격이 인정된 것이 아닙니다. 트럼프가 전쟁을 시작하거나 오픈AI가 내일 실패하면 말은 접힙니다. JPM·BAC는 고금리에도 신용 손실로 안 좋습니다. 오늘 밤 은행 실적은 구원이 아닙니다. 시간외의 첫눈에는 팔지 않습니다. 정보가 부족하고, 미국 현물 이후에 정합니다.</w:t>
+      </w:r>
+    </w:p>
+    <w:p>
+      <w:pPr>
+        <w:spacing w:after="50" w:before="0" w:line="276" w:lineRule="auto"/>
+        <w:ind w:left="312" w:hanging="198"/>
+      </w:pPr>
+      <w:r>
+        <w:rPr>
+          <w:rFonts w:ascii="맑은 고딕" w:hAnsi="맑은 고딕" w:eastAsia="맑은 고딕"/>
+          <w:b w:val="0"/>
+          <w:i w:val="0"/>
+          <w:color w:val="1E407C"/>
+          <w:sz w:val="22"/>
+        </w:rPr>
+        <w:t xml:space="preserve">• </w:t>
+      </w:r>
+      <w:r>
+        <w:rPr>
+          <w:rFonts w:ascii="맑은 고딕" w:hAnsi="맑은 고딕" w:eastAsia="맑은 고딕"/>
+          <w:b/>
+          <w:i w:val="0"/>
+          <w:color w:val="1A1A1A"/>
+          <w:sz w:val="22"/>
+        </w:rPr>
+        <w:t xml:space="preserve">지표 추적, 인정. </w:t>
+      </w:r>
+      <w:r>
+        <w:rPr>
+          <w:rFonts w:ascii="맑은 고딕" w:hAnsi="맑은 고딕" w:eastAsia="맑은 고딕"/>
+          <w:b w:val="0"/>
+          <w:i w:val="0"/>
+          <w:color w:val="1A1A1A"/>
+          <w:sz w:val="22"/>
+        </w:rPr>
+        <w:t>주주환원 침묵과 정의장의 퇴장은 한국 할인이 돌아온 자리입니다. 삼양·하이트진로와 기아가 오릅니다. 시장이 약하고, 그 약함에 이유가 있습니다. 복권에 비유하면 올해의 토요일 오후 6시. 6,800으로 돌아오면 사람들은 괜찮다 느끼고 7,000 돌파를 삽니다. 현금 30%.</w:t>
+      </w:r>
+    </w:p>
+    <w:p>
+      <w:pPr>
+        <w:spacing w:after="50" w:before="0" w:line="276" w:lineRule="auto"/>
+        <w:ind w:left="312" w:hanging="198"/>
+      </w:pPr>
+      <w:r>
+        <w:rPr>
+          <w:rFonts w:ascii="맑은 고딕" w:hAnsi="맑은 고딕" w:eastAsia="맑은 고딕"/>
+          <w:b w:val="0"/>
+          <w:i w:val="0"/>
+          <w:color w:val="1E407C"/>
+          <w:sz w:val="22"/>
+        </w:rPr>
+        <w:t xml:space="preserve">• </w:t>
+      </w:r>
+      <w:r>
+        <w:rPr>
+          <w:rFonts w:ascii="맑은 고딕" w:hAnsi="맑은 고딕" w:eastAsia="맑은 고딕"/>
+          <w:b/>
+          <w:i w:val="0"/>
+          <w:color w:val="1A1A1A"/>
+          <w:sz w:val="22"/>
+        </w:rPr>
+        <w:t xml:space="preserve">박병창, 모드. </w:t>
+      </w:r>
+      <w:r>
+        <w:rPr>
+          <w:rFonts w:ascii="맑은 고딕" w:hAnsi="맑은 고딕" w:eastAsia="맑은 고딕"/>
+          <w:b w:val="0"/>
+          <w:i w:val="0"/>
+          <w:color w:val="1A1A1A"/>
+          <w:sz w:val="22"/>
+        </w:rPr>
+        <w:t>9월이 악재를 삼킨 뒤 10월 7,200을 말했고, 지난주 그 말을 바꿨습니다. 상단에서는 종목, 하단과 이탈에서는 보수. 이탈 뒤 2번·3번 그림(되돌림)이 흔합니다. 7월의 두 번째 다리가, 지금 팔고 싶게 만듭니다. 삼성·하이닉스는 비중을 이미 줄였으면 이탈에 팔지 않고 반등을 봅니다. 11월 전에 촉매가 없는 애매한 이름은 현금을 늘려, 6,000 이탈을 선물로 만들고 무탈하면 다시 짓습니다.</w:t>
+      </w:r>
+    </w:p>
+    <w:p>
+      <w:pPr>
+        <w:spacing w:after="50" w:before="0" w:line="276" w:lineRule="auto"/>
+        <w:ind w:left="312" w:hanging="198"/>
+      </w:pPr>
+      <w:r>
+        <w:rPr>
+          <w:rFonts w:ascii="맑은 고딕" w:hAnsi="맑은 고딕" w:eastAsia="맑은 고딕"/>
+          <w:b w:val="0"/>
+          <w:i w:val="0"/>
+          <w:color w:val="1E407C"/>
+          <w:sz w:val="22"/>
+        </w:rPr>
+        <w:t xml:space="preserve">• </w:t>
+      </w:r>
+      <w:r>
+        <w:rPr>
+          <w:rFonts w:ascii="맑은 고딕" w:hAnsi="맑은 고딕" w:eastAsia="맑은 고딕"/>
+          <w:b/>
+          <w:i w:val="0"/>
+          <w:color w:val="1A1A1A"/>
+          <w:sz w:val="22"/>
+        </w:rPr>
+        <w:t xml:space="preserve">박병창, 산수와 레임덕. </w:t>
+      </w:r>
+      <w:r>
+        <w:rPr>
+          <w:rFonts w:ascii="맑은 고딕" w:hAnsi="맑은 고딕" w:eastAsia="맑은 고딕"/>
+          <w:b w:val="0"/>
+          <w:i w:val="0"/>
+          <w:color w:val="1A1A1A"/>
+          <w:sz w:val="22"/>
+        </w:rPr>
+        <w:t>젤렌스키·디젤·후티·이란은 캠페인이고, 펀더멘털로는 약하다고 부릅니다. 중간선거에서 트럼프가 레임덕이 되는 쪽이 미지라, 84% 통계로 하락을 사지 않습니다. 30% 손실은 남은 돈의 약 40%가 있어야 한 판입니다. 가만히 있는 것을 장기라고 부르지 않습니다. 급락 직전 가장 강했던 것이 먼저 되돌리려 하고, 연습은 10%입니다. 10% 비중의 -20%는 계좌의 2%이고, 30% 비중의 -30%가 이야기입니다.</w:t>
+      </w:r>
+    </w:p>
+    <w:p>
+      <w:pPr>
+        <w:spacing w:after="50" w:before="0" w:line="276" w:lineRule="auto"/>
+        <w:ind w:left="312" w:hanging="198"/>
+      </w:pPr>
+      <w:r>
+        <w:rPr>
+          <w:rFonts w:ascii="맑은 고딕" w:hAnsi="맑은 고딕" w:eastAsia="맑은 고딕"/>
+          <w:b w:val="0"/>
+          <w:i w:val="0"/>
+          <w:color w:val="1E407C"/>
+          <w:sz w:val="22"/>
+        </w:rPr>
+        <w:t xml:space="preserve">• </w:t>
+      </w:r>
+      <w:r>
+        <w:rPr>
+          <w:rFonts w:ascii="맑은 고딕" w:hAnsi="맑은 고딕" w:eastAsia="맑은 고딕"/>
+          <w:b/>
+          <w:i w:val="0"/>
+          <w:color w:val="1A1A1A"/>
+          <w:sz w:val="22"/>
+        </w:rPr>
+        <w:t xml:space="preserve">박병창, 가격. </w:t>
+      </w:r>
+      <w:r>
+        <w:rPr>
+          <w:rFonts w:ascii="맑은 고딕" w:hAnsi="맑은 고딕" w:eastAsia="맑은 고딕"/>
+          <w:b w:val="0"/>
+          <w:i w:val="0"/>
+          <w:color w:val="1A1A1A"/>
+          <w:sz w:val="22"/>
+        </w:rPr>
+        <w:t>방송에서 쓴 가격은 올해 삼성 약 30만 원, 하이닉스 190만 원 근처. 지수 7,100~7,200이면 그 보유가 가능하고, 테이프가 바뀌면 고집하지 않습니다. ‘수급이 꼬였다’는 호가 한쪽이 사라진 것, 지금은 매수 호가입니다.</w:t>
+      </w:r>
+    </w:p>
+    <w:p>
+      <w:pPr>
+        <w:spacing w:after="50" w:before="0" w:line="276" w:lineRule="auto"/>
+        <w:ind w:left="312" w:hanging="198"/>
+      </w:pPr>
+      <w:r>
+        <w:rPr>
+          <w:rFonts w:ascii="맑은 고딕" w:hAnsi="맑은 고딕" w:eastAsia="맑은 고딕"/>
+          <w:b w:val="0"/>
+          <w:i w:val="0"/>
+          <w:color w:val="1E407C"/>
+          <w:sz w:val="22"/>
+        </w:rPr>
+        <w:t xml:space="preserve">• </w:t>
+      </w:r>
+      <w:r>
+        <w:rPr>
+          <w:rFonts w:ascii="맑은 고딕" w:hAnsi="맑은 고딕" w:eastAsia="맑은 고딕"/>
+          <w:b/>
+          <w:i w:val="0"/>
+          <w:color w:val="1A1A1A"/>
+          <w:sz w:val="22"/>
+        </w:rPr>
+        <w:t xml:space="preserve">박병창, 미국 적립. </w:t>
+      </w:r>
+      <w:r>
+        <w:rPr>
+          <w:rFonts w:ascii="맑은 고딕" w:hAnsi="맑은 고딕" w:eastAsia="맑은 고딕"/>
+          <w:b w:val="0"/>
+          <w:i w:val="0"/>
+          <w:color w:val="1A1A1A"/>
+          <w:sz w:val="22"/>
+        </w:rPr>
+        <w:t>적립이 가능한 이유는 미국이 돈을 찍어서입니다. 2008년 QE, 2011년 유럽 -1% 회복, 2015년 중국 -9%, 2018년 인상 -6%, 2022년 종가 -20%·저가 -26%, 2020년 -32% 뒤 제로 금리, 2023년부터의 엔비디아. 2001~2008년은 이런 랠리가 아닙니다. 영원한 것은 없습니다. 2023~26년 복리 위에 2027년 또 15~20%는 그의 기본이 아닙니다. 4년 고점의 일시금, 미국 100%·한국 0%는 다른 결정입니다. 버핏은 모두가 카지노에 있다고 봅니다. 빅테크가 국가보다 크고, 스페이스X의 감시 능력이 ‘무너지면 세상이 무너진다’는 믿음의 출처입니다. 그는 그 믿음으로 일시금을 보증하지 않습니다. 10월 말이 틀렸음을 인정합니다.</w:t>
+      </w:r>
+    </w:p>
+    <w:p>
+      <w:pPr>
+        <w:spacing w:after="50" w:before="0" w:line="276" w:lineRule="auto"/>
+        <w:ind w:left="312" w:hanging="198"/>
+      </w:pPr>
+      <w:r>
+        <w:rPr>
+          <w:rFonts w:ascii="맑은 고딕" w:hAnsi="맑은 고딕" w:eastAsia="맑은 고딕"/>
+          <w:b w:val="0"/>
+          <w:i w:val="0"/>
+          <w:color w:val="1E407C"/>
+          <w:sz w:val="22"/>
+        </w:rPr>
+        <w:t xml:space="preserve">• </w:t>
+      </w:r>
+      <w:r>
+        <w:rPr>
+          <w:rFonts w:ascii="맑은 고딕" w:hAnsi="맑은 고딕" w:eastAsia="맑은 고딕"/>
+          <w:b/>
+          <w:i w:val="0"/>
+          <w:color w:val="1A1A1A"/>
+          <w:sz w:val="22"/>
+        </w:rPr>
+        <w:t xml:space="preserve">이주현, 농도. </w:t>
+      </w:r>
+      <w:r>
+        <w:rPr>
+          <w:rFonts w:ascii="맑은 고딕" w:hAnsi="맑은 고딕" w:eastAsia="맑은 고딕"/>
+          <w:b w:val="0"/>
+          <w:i w:val="0"/>
+          <w:color w:val="1A1A1A"/>
+          <w:sz w:val="22"/>
+        </w:rPr>
+        <w:t>위험자산 안의 리스크오프, 선진국이 신흥국보다 덜 위험합니다. 지난주도 옵션 만기와 약 19조 ETF. 사상 실적에 삼성 -2%는 죄 없는 피크 읽기입니다. 한 번의 건너뜀이 인상 사이클의 끝은 아니고, 유동성은 줄어듭니다. 최악 차트는 돌파하면 박스 상단 8,000 방향, 그 외에는 쌍바닥·240일선·약 6,000. 코일의 방향은 아래이고, 미국 선물이 올라 혼란스럽습니다. 인상 사이클의 역사에서 한국은 미국에 뒤집니다. 6,300~6,400 반등, 또는 6,000 테스트.</w:t>
+      </w:r>
+    </w:p>
+    <w:p>
+      <w:pPr>
+        <w:spacing w:after="50" w:before="0" w:line="276" w:lineRule="auto"/>
+        <w:ind w:left="312" w:hanging="198"/>
+      </w:pPr>
+      <w:r>
+        <w:rPr>
+          <w:rFonts w:ascii="맑은 고딕" w:hAnsi="맑은 고딕" w:eastAsia="맑은 고딕"/>
+          <w:b w:val="0"/>
+          <w:i w:val="0"/>
+          <w:color w:val="1E407C"/>
+          <w:sz w:val="22"/>
+        </w:rPr>
+        <w:t xml:space="preserve">• </w:t>
+      </w:r>
+      <w:r>
+        <w:rPr>
+          <w:rFonts w:ascii="맑은 고딕" w:hAnsi="맑은 고딕" w:eastAsia="맑은 고딕"/>
+          <w:b/>
+          <w:i w:val="0"/>
+          <w:color w:val="1A1A1A"/>
+          <w:sz w:val="22"/>
+        </w:rPr>
+        <w:t xml:space="preserve">이주현, 거래 공백. </w:t>
+      </w:r>
+      <w:r>
+        <w:rPr>
+          <w:rFonts w:ascii="맑은 고딕" w:hAnsi="맑은 고딕" w:eastAsia="맑은 고딕"/>
+          <w:b w:val="0"/>
+          <w:i w:val="0"/>
+          <w:color w:val="1A1A1A"/>
+          <w:sz w:val="22"/>
+        </w:rPr>
+        <w:t>30~40분 거래가 없습니다. 삼성·하이닉스는 보통 10분에 2~3천억. 총량을 줄이라고 해 왔습니다. 지수가 1.5~2% 안에서 삼성·하이닉스가 아래꼬리면 소부장이 매매였고, 지수가 깨지자 아침 반등이 죽었습니다. 2%를 넘으면 무감각해도 급락입니다. 실적에 값이 붙는 것은 시장이 천천히 나을 때이고, 인상 테이프의 모멘텀은 작아야 합니다.</w:t>
+      </w:r>
+    </w:p>
+    <w:p>
+      <w:pPr>
+        <w:spacing w:after="50" w:before="0" w:line="276" w:lineRule="auto"/>
+        <w:ind w:left="312" w:hanging="198"/>
+      </w:pPr>
+      <w:r>
+        <w:rPr>
+          <w:rFonts w:ascii="맑은 고딕" w:hAnsi="맑은 고딕" w:eastAsia="맑은 고딕"/>
+          <w:b w:val="0"/>
+          <w:i w:val="0"/>
+          <w:color w:val="1E407C"/>
+          <w:sz w:val="22"/>
+        </w:rPr>
+        <w:t xml:space="preserve">• </w:t>
+      </w:r>
+      <w:r>
+        <w:rPr>
+          <w:rFonts w:ascii="맑은 고딕" w:hAnsi="맑은 고딕" w:eastAsia="맑은 고딕"/>
+          <w:b/>
+          <w:i w:val="0"/>
+          <w:color w:val="1A1A1A"/>
+          <w:sz w:val="22"/>
+        </w:rPr>
+        <w:t xml:space="preserve">이주현, 오늘 오르는 것. </w:t>
+      </w:r>
+      <w:r>
+        <w:rPr>
+          <w:rFonts w:ascii="맑은 고딕" w:hAnsi="맑은 고딕" w:eastAsia="맑은 고딕"/>
+          <w:b w:val="0"/>
+          <w:i w:val="0"/>
+          <w:color w:val="1A1A1A"/>
+          <w:sz w:val="22"/>
+        </w:rPr>
+        <w:t>오늘 되는 호남 반도체·해운·자산·부동산·저유동·음식은, 진짜 위험 자본이 빠졌다는 신호입니다. 강세의 끝과 세척의 초입에 사람들은 자산주를 삽니다. 역사가 있는 저유동을, 빈 저유동보다 앞에 둡니다. 팬오션은 실체가 있는 회사(장기 계약, 신고가 시도)가 심리 그룹 안에 있는 경우이고, 거래대금은 약 300억입니다.</w:t>
+      </w:r>
+    </w:p>
+    <w:p>
+      <w:pPr>
+        <w:spacing w:after="50" w:before="0" w:line="276" w:lineRule="auto"/>
+        <w:ind w:left="312" w:hanging="198"/>
+      </w:pPr>
+      <w:r>
+        <w:rPr>
+          <w:rFonts w:ascii="맑은 고딕" w:hAnsi="맑은 고딕" w:eastAsia="맑은 고딕"/>
+          <w:b w:val="0"/>
+          <w:i w:val="0"/>
+          <w:color w:val="1E407C"/>
+          <w:sz w:val="22"/>
+        </w:rPr>
+        <w:t xml:space="preserve">• </w:t>
+      </w:r>
+      <w:r>
+        <w:rPr>
+          <w:rFonts w:ascii="맑은 고딕" w:hAnsi="맑은 고딕" w:eastAsia="맑은 고딕"/>
+          <w:b/>
+          <w:i w:val="0"/>
+          <w:color w:val="1A1A1A"/>
+          <w:sz w:val="22"/>
+        </w:rPr>
+        <w:t xml:space="preserve">이주현, 따라 하지 말 것. </w:t>
+      </w:r>
+      <w:r>
+        <w:rPr>
+          <w:rFonts w:ascii="맑은 고딕" w:hAnsi="맑은 고딕" w:eastAsia="맑은 고딕"/>
+          <w:b w:val="0"/>
+          <w:i w:val="0"/>
+          <w:color w:val="1A1A1A"/>
+          <w:sz w:val="22"/>
+        </w:rPr>
+        <w:t>계좌 전부로 삼성을 샀다는 말은 농담이고, 바로 뒤에 따라 하지 말라고 붙습니다. 부자가 되면 부자처럼 투자하겠다는 말은, 그 상태를 유지하는 변명입니다. 전문가 말은 입력이고 후각은 본인 것입니다. 초록에서 빨강으로 뒤집히고 현금이 없으면, 마음을 바꾸려고 팝니다. 5만 4,000원 상한가·비중 40% 로봇은 위의 물량을 소화해야 하고, 급등 베이스가 깨지면 지도는 4만 1,000~4만 3,000원입니다. 그 비중에서의 20~30% 손절은 계좌의 결정입니다. 거래 없는 하락. 점심을 먹고, 공포가 아니라 논리로 정합니다. 현금 약 40%는 초보에게 한 말입니다.</w:t>
+      </w:r>
+    </w:p>
+    <w:p>
+      <w:pPr>
+        <w:spacing w:before="160" w:after="60"/>
+        <w:keepNext/>
+      </w:pPr>
+      <w:r>
+        <w:rPr>
+          <w:rFonts w:ascii="맑은 고딕" w:hAnsi="맑은 고딕" w:eastAsia="맑은 고딕"/>
+          <w:b/>
+          <w:i w:val="0"/>
+          <w:color w:val="0F2043"/>
+          <w:sz w:val="23"/>
+        </w:rPr>
+        <w:t>종목의 이면</w:t>
+      </w:r>
+    </w:p>
+    <w:p>
+      <w:pPr>
+        <w:spacing w:after="50" w:before="0" w:line="276" w:lineRule="auto"/>
+        <w:ind w:left="312" w:hanging="198"/>
+      </w:pPr>
+      <w:r>
+        <w:rPr>
+          <w:rFonts w:ascii="맑은 고딕" w:hAnsi="맑은 고딕" w:eastAsia="맑은 고딕"/>
+          <w:b w:val="0"/>
+          <w:i w:val="0"/>
+          <w:color w:val="1E407C"/>
+          <w:sz w:val="22"/>
+        </w:rPr>
+        <w:t xml:space="preserve">• </w:t>
+      </w:r>
+      <w:r>
+        <w:rPr>
+          <w:rFonts w:ascii="맑은 고딕" w:hAnsi="맑은 고딕" w:eastAsia="맑은 고딕"/>
+          <w:b/>
+          <w:i w:val="0"/>
+          <w:color w:val="1A1A1A"/>
+          <w:sz w:val="22"/>
+        </w:rPr>
+        <w:t xml:space="preserve">산일·일진. </w:t>
+      </w:r>
+      <w:r>
+        <w:rPr>
+          <w:rFonts w:ascii="맑은 고딕" w:hAnsi="맑은 고딕" w:eastAsia="맑은 고딕"/>
+          <w:b w:val="0"/>
+          <w:i w:val="0"/>
+          <w:color w:val="1A1A1A"/>
+          <w:sz w:val="22"/>
+        </w:rPr>
+        <w:t>연금·신탁·개인이 사고, 외국인과 일부 펀드가 팔며, 거래는 가볍습니다. 일진의 중심은 약 7만 원. 영업이익 2,500억에서 2,700억, 시총 약 3.5조는 이미 2028년을 넣었습니다. 사례 계좌는 평단 83,550원·비중 15%. 거래가 마르고 방향이 바뀔 때까지 보고, 그 저가 아래에서는 멈춥니다. 추가는 비중이 작을 때만.</w:t>
+      </w:r>
+    </w:p>
+    <w:p>
+      <w:pPr>
+        <w:spacing w:after="50" w:before="0" w:line="276" w:lineRule="auto"/>
+        <w:ind w:left="312" w:hanging="198"/>
+      </w:pPr>
+      <w:r>
+        <w:rPr>
+          <w:rFonts w:ascii="맑은 고딕" w:hAnsi="맑은 고딕" w:eastAsia="맑은 고딕"/>
+          <w:b w:val="0"/>
+          <w:i w:val="0"/>
+          <w:color w:val="1E407C"/>
+          <w:sz w:val="22"/>
+        </w:rPr>
+        <w:t xml:space="preserve">• </w:t>
+      </w:r>
+      <w:r>
+        <w:rPr>
+          <w:rFonts w:ascii="맑은 고딕" w:hAnsi="맑은 고딕" w:eastAsia="맑은 고딕"/>
+          <w:b/>
+          <w:i w:val="0"/>
+          <w:color w:val="1A1A1A"/>
+          <w:sz w:val="22"/>
+        </w:rPr>
+        <w:t xml:space="preserve">전력 3사. </w:t>
+      </w:r>
+      <w:r>
+        <w:rPr>
+          <w:rFonts w:ascii="맑은 고딕" w:hAnsi="맑은 고딕" w:eastAsia="맑은 고딕"/>
+          <w:b w:val="0"/>
+          <w:i w:val="0"/>
+          <w:color w:val="1A1A1A"/>
+          <w:sz w:val="22"/>
+        </w:rPr>
+        <w:t>효성중공업·HD현대일렉트릭·두산에너빌리티는 투매 거래의 밴드 이탈, 외바닥, V자는 없습니다. 거래가 마른 뒤의 확대. 효성의 2028년 영업이익 약 2조 대 시총 약 20조는 적정으로 말하고, 전저점은 쌍바닥 후보, 미래 이익 20배를 넘으면 자동 추가가 아닙니다. 현대일렉트릭은 더 약하고 기관·외국인이 팔며 개인만 사, 전저점 테스트가 열려 있습니다. 7월 반등의 받침대가 선입니다. 지키면 쌍바닥, 잃으면 시장이 그 밸류를 인정하지 않은 것입니다.</w:t>
+      </w:r>
+    </w:p>
+    <w:p>
+      <w:pPr>
+        <w:spacing w:after="50" w:before="0" w:line="276" w:lineRule="auto"/>
+        <w:ind w:left="312" w:hanging="198"/>
+      </w:pPr>
+      <w:r>
+        <w:rPr>
+          <w:rFonts w:ascii="맑은 고딕" w:hAnsi="맑은 고딕" w:eastAsia="맑은 고딕"/>
+          <w:b w:val="0"/>
+          <w:i w:val="0"/>
+          <w:color w:val="1E407C"/>
+          <w:sz w:val="22"/>
+        </w:rPr>
+        <w:t xml:space="preserve">• </w:t>
+      </w:r>
+      <w:r>
+        <w:rPr>
+          <w:rFonts w:ascii="맑은 고딕" w:hAnsi="맑은 고딕" w:eastAsia="맑은 고딕"/>
+          <w:b/>
+          <w:i w:val="0"/>
+          <w:color w:val="1A1A1A"/>
+          <w:sz w:val="22"/>
+        </w:rPr>
+        <w:t xml:space="preserve">LG이노텍. </w:t>
+      </w:r>
+      <w:r>
+        <w:rPr>
+          <w:rFonts w:ascii="맑은 고딕" w:hAnsi="맑은 고딕" w:eastAsia="맑은 고딕"/>
+          <w:b w:val="0"/>
+          <w:i w:val="0"/>
+          <w:color w:val="1A1A1A"/>
+          <w:sz w:val="22"/>
+        </w:rPr>
+        <w:t>약 -14%. 카메라 약 82%(이전 83%), 기판 약 9%. 기판 이야기로 샀으나 카메라 모듈 회사입니다. 2026년 영업이익 약 1조 1,250억, 시총 11.6조. 7월 저가는 올해 이익 기준 적정 근처이고, 위에는 16조 방향의 방이 있습니다. 애플의 가격 압박. 카메라 이야기로 기다릴 수 있으면, 투매에 팔지 말라는 말입니다.</w:t>
+      </w:r>
+    </w:p>
+    <w:p>
+      <w:pPr>
+        <w:spacing w:after="50" w:before="0" w:line="276" w:lineRule="auto"/>
+        <w:ind w:left="312" w:hanging="198"/>
+      </w:pPr>
+      <w:r>
+        <w:rPr>
+          <w:rFonts w:ascii="맑은 고딕" w:hAnsi="맑은 고딕" w:eastAsia="맑은 고딕"/>
+          <w:b w:val="0"/>
+          <w:i w:val="0"/>
+          <w:color w:val="1E407C"/>
+          <w:sz w:val="22"/>
+        </w:rPr>
+        <w:t xml:space="preserve">• </w:t>
+      </w:r>
+      <w:r>
+        <w:rPr>
+          <w:rFonts w:ascii="맑은 고딕" w:hAnsi="맑은 고딕" w:eastAsia="맑은 고딕"/>
+          <w:b/>
+          <w:i w:val="0"/>
+          <w:color w:val="1A1A1A"/>
+          <w:sz w:val="22"/>
+        </w:rPr>
+        <w:t xml:space="preserve">현대차. </w:t>
+      </w:r>
+      <w:r>
+        <w:rPr>
+          <w:rFonts w:ascii="맑은 고딕" w:hAnsi="맑은 고딕" w:eastAsia="맑은 고딕"/>
+          <w:b w:val="0"/>
+          <w:i w:val="0"/>
+          <w:color w:val="1A1A1A"/>
+          <w:sz w:val="22"/>
+        </w:rPr>
+        <w:t>사례 계좌 38만 원·비중 30%·약 -23%. 로봇 프리미엄과 자동차 실물(중국의 가격, 테슬라 1등, 가격 인상, 자율주행 격차)이 같이 있습니다. 다음 날의 장대는 오늘 시초를 지켜야 하고, 못 지키면 이전 돌파 구간인 30만 원 방향입니다.</w:t>
+      </w:r>
+    </w:p>
+    <w:p>
+      <w:pPr>
+        <w:spacing w:after="50" w:before="0" w:line="276" w:lineRule="auto"/>
+        <w:ind w:left="312" w:hanging="198"/>
+      </w:pPr>
+      <w:r>
+        <w:rPr>
+          <w:rFonts w:ascii="맑은 고딕" w:hAnsi="맑은 고딕" w:eastAsia="맑은 고딕"/>
+          <w:b w:val="0"/>
+          <w:i w:val="0"/>
+          <w:color w:val="1E407C"/>
+          <w:sz w:val="22"/>
+        </w:rPr>
+        <w:t xml:space="preserve">• </w:t>
+      </w:r>
+      <w:r>
+        <w:rPr>
+          <w:rFonts w:ascii="맑은 고딕" w:hAnsi="맑은 고딕" w:eastAsia="맑은 고딕"/>
+          <w:b/>
+          <w:i w:val="0"/>
+          <w:color w:val="1A1A1A"/>
+          <w:sz w:val="22"/>
+        </w:rPr>
+        <w:t xml:space="preserve">SK텔레콤. </w:t>
+      </w:r>
+      <w:r>
+        <w:rPr>
+          <w:rFonts w:ascii="맑은 고딕" w:hAnsi="맑은 고딕" w:eastAsia="맑은 고딕"/>
+          <w:b w:val="0"/>
+          <w:i w:val="0"/>
+          <w:color w:val="1A1A1A"/>
+          <w:sz w:val="22"/>
+        </w:rPr>
+        <w:t>10월 앤트로픽 상장이 논리였고 일정이 밀렸습니다. -5%에서 끊은 것은 작은 손실의 사례입니다. 깊게 물린 쪽은 약 86,400~86,500원 회복을 봅니다. 앤트로픽 상장은 반도체와 지수에 잠시 마이너스입니다.</w:t>
+      </w:r>
+    </w:p>
+    <w:p>
+      <w:pPr>
+        <w:spacing w:after="50" w:before="0" w:line="276" w:lineRule="auto"/>
+        <w:ind w:left="312" w:hanging="198"/>
+      </w:pPr>
+      <w:r>
+        <w:rPr>
+          <w:rFonts w:ascii="맑은 고딕" w:hAnsi="맑은 고딕" w:eastAsia="맑은 고딕"/>
+          <w:b w:val="0"/>
+          <w:i w:val="0"/>
+          <w:color w:val="1E407C"/>
+          <w:sz w:val="22"/>
+        </w:rPr>
+        <w:t xml:space="preserve">• </w:t>
+      </w:r>
+      <w:r>
+        <w:rPr>
+          <w:rFonts w:ascii="맑은 고딕" w:hAnsi="맑은 고딕" w:eastAsia="맑은 고딕"/>
+          <w:b/>
+          <w:i w:val="0"/>
+          <w:color w:val="1A1A1A"/>
+          <w:sz w:val="22"/>
+        </w:rPr>
+        <w:t xml:space="preserve">SDI·ESS. </w:t>
+      </w:r>
+      <w:r>
+        <w:rPr>
+          <w:rFonts w:ascii="맑은 고딕" w:hAnsi="맑은 고딕" w:eastAsia="맑은 고딕"/>
+          <w:b w:val="0"/>
+          <w:i w:val="0"/>
+          <w:color w:val="1A1A1A"/>
+          <w:sz w:val="22"/>
+        </w:rPr>
+        <w:t>선거 테마입니다. 지수가 약하다는 이유만으로 던지지 않습니다. 삼성이 급하면 돈이 이쪽으로 돌 수 있습니다.</w:t>
+      </w:r>
+    </w:p>
+    <w:p>
+      <w:pPr>
+        <w:spacing w:after="50" w:before="0" w:line="276" w:lineRule="auto"/>
+        <w:ind w:left="312" w:hanging="198"/>
+      </w:pPr>
+      <w:r>
+        <w:rPr>
+          <w:rFonts w:ascii="맑은 고딕" w:hAnsi="맑은 고딕" w:eastAsia="맑은 고딕"/>
+          <w:b w:val="0"/>
+          <w:i w:val="0"/>
+          <w:color w:val="1E407C"/>
+          <w:sz w:val="22"/>
+        </w:rPr>
+        <w:t xml:space="preserve">• </w:t>
+      </w:r>
+      <w:r>
+        <w:rPr>
+          <w:rFonts w:ascii="맑은 고딕" w:hAnsi="맑은 고딕" w:eastAsia="맑은 고딕"/>
+          <w:b/>
+          <w:i w:val="0"/>
+          <w:color w:val="1A1A1A"/>
+          <w:sz w:val="22"/>
+        </w:rPr>
+        <w:t xml:space="preserve">바이오. </w:t>
+      </w:r>
+      <w:r>
+        <w:rPr>
+          <w:rFonts w:ascii="맑은 고딕" w:hAnsi="맑은 고딕" w:eastAsia="맑은 고딕"/>
+          <w:b w:val="0"/>
+          <w:i w:val="0"/>
+          <w:color w:val="1A1A1A"/>
+          <w:sz w:val="22"/>
+        </w:rPr>
+        <w:t>AI 헬스케어는 미국과 중국이 앞섭니다. 한국의 파이프라인·기술이전 프리미엄은 옅어집니다.</w:t>
+      </w:r>
+    </w:p>
+    <w:p>
+      <w:pPr>
+        <w:spacing w:after="50" w:before="0" w:line="276" w:lineRule="auto"/>
+        <w:ind w:left="312" w:hanging="198"/>
+      </w:pPr>
+      <w:r>
+        <w:rPr>
+          <w:rFonts w:ascii="맑은 고딕" w:hAnsi="맑은 고딕" w:eastAsia="맑은 고딕"/>
+          <w:b w:val="0"/>
+          <w:i w:val="0"/>
+          <w:color w:val="1E407C"/>
+          <w:sz w:val="22"/>
+        </w:rPr>
+        <w:t xml:space="preserve">• </w:t>
+      </w:r>
+      <w:r>
+        <w:rPr>
+          <w:rFonts w:ascii="맑은 고딕" w:hAnsi="맑은 고딕" w:eastAsia="맑은 고딕"/>
+          <w:b/>
+          <w:i w:val="0"/>
+          <w:color w:val="1A1A1A"/>
+          <w:sz w:val="22"/>
+        </w:rPr>
+        <w:t xml:space="preserve">재생. </w:t>
+      </w:r>
+      <w:r>
+        <w:rPr>
+          <w:rFonts w:ascii="맑은 고딕" w:hAnsi="맑은 고딕" w:eastAsia="맑은 고딕"/>
+          <w:b w:val="0"/>
+          <w:i w:val="0"/>
+          <w:color w:val="1A1A1A"/>
+          <w:sz w:val="22"/>
+        </w:rPr>
+        <w:t>SK이터닉스형은 액티브 펀드의 급등이고, 오늘의 본류가 아닙니다.</w:t>
+      </w:r>
+    </w:p>
+    <w:p>
+      <w:pPr>
+        <w:spacing w:after="50" w:before="0" w:line="276" w:lineRule="auto"/>
+        <w:ind w:left="312" w:hanging="198"/>
+      </w:pPr>
+      <w:r>
+        <w:rPr>
+          <w:rFonts w:ascii="맑은 고딕" w:hAnsi="맑은 고딕" w:eastAsia="맑은 고딕"/>
+          <w:b w:val="0"/>
+          <w:i w:val="0"/>
+          <w:color w:val="1E407C"/>
+          <w:sz w:val="22"/>
+        </w:rPr>
+        <w:t xml:space="preserve">• </w:t>
+      </w:r>
+      <w:r>
+        <w:rPr>
+          <w:rFonts w:ascii="맑은 고딕" w:hAnsi="맑은 고딕" w:eastAsia="맑은 고딕"/>
+          <w:b/>
+          <w:i w:val="0"/>
+          <w:color w:val="1A1A1A"/>
+          <w:sz w:val="22"/>
+        </w:rPr>
+        <w:t xml:space="preserve">대장의 실패. </w:t>
+      </w:r>
+      <w:r>
+        <w:rPr>
+          <w:rFonts w:ascii="맑은 고딕" w:hAnsi="맑은 고딕" w:eastAsia="맑은 고딕"/>
+          <w:b w:val="0"/>
+          <w:i w:val="0"/>
+          <w:color w:val="1A1A1A"/>
+          <w:sz w:val="22"/>
+        </w:rPr>
+        <w:t>한화엔진·방산·조선·원전·변압기가 깨진 심리적 손상입니다. 지수를 지키던 대장이 실패한 자리이고, 스파이크 뒤 붕괴라는 교과서적 헤드앤숄더와는 모양이 다릅니다.</w:t>
+      </w:r>
+    </w:p>
+    <w:p>
+      <w:pPr>
+        <w:spacing w:after="50" w:before="0" w:line="276" w:lineRule="auto"/>
+        <w:ind w:left="312" w:hanging="198"/>
+      </w:pPr>
+      <w:r>
+        <w:rPr>
+          <w:rFonts w:ascii="맑은 고딕" w:hAnsi="맑은 고딕" w:eastAsia="맑은 고딕"/>
+          <w:b w:val="0"/>
+          <w:i w:val="0"/>
+          <w:color w:val="1E407C"/>
+          <w:sz w:val="22"/>
+        </w:rPr>
+        <w:t xml:space="preserve">• </w:t>
+      </w:r>
+      <w:r>
+        <w:rPr>
+          <w:rFonts w:ascii="맑은 고딕" w:hAnsi="맑은 고딕" w:eastAsia="맑은 고딕"/>
+          <w:b/>
+          <w:i w:val="0"/>
+          <w:color w:val="1A1A1A"/>
+          <w:sz w:val="22"/>
+        </w:rPr>
+        <w:t xml:space="preserve">SGC에너지. </w:t>
+      </w:r>
+      <w:r>
+        <w:rPr>
+          <w:rFonts w:ascii="맑은 고딕" w:hAnsi="맑은 고딕" w:eastAsia="맑은 고딕"/>
+          <w:b w:val="0"/>
+          <w:i w:val="0"/>
+          <w:color w:val="1A1A1A"/>
+          <w:sz w:val="22"/>
+        </w:rPr>
+        <w:t>상승 중간의 대량 이탈은 힘을 잃은 것입니다. 믿으면 반등이 약 5만 원을 넘는지를 보고, 시장이 반등하는데 뒤처지면 그때 줄입니다. 애매한 구간은 사는 자리가 아닙니다.</w:t>
+      </w:r>
+    </w:p>
+    <w:p>
+      <w:pPr>
+        <w:spacing w:after="50" w:before="0" w:line="276" w:lineRule="auto"/>
+        <w:ind w:left="312" w:hanging="198"/>
+      </w:pPr>
+      <w:r>
+        <w:rPr>
+          <w:rFonts w:ascii="맑은 고딕" w:hAnsi="맑은 고딕" w:eastAsia="맑은 고딕"/>
+          <w:b w:val="0"/>
+          <w:i w:val="0"/>
+          <w:color w:val="1E407C"/>
+          <w:sz w:val="22"/>
+        </w:rPr>
+        <w:t xml:space="preserve">• </w:t>
+      </w:r>
+      <w:r>
+        <w:rPr>
+          <w:rFonts w:ascii="맑은 고딕" w:hAnsi="맑은 고딕" w:eastAsia="맑은 고딕"/>
+          <w:b/>
+          <w:i w:val="0"/>
+          <w:color w:val="1A1A1A"/>
+          <w:sz w:val="22"/>
+        </w:rPr>
+        <w:t xml:space="preserve">책. </w:t>
+      </w:r>
+      <w:r>
+        <w:rPr>
+          <w:rFonts w:ascii="맑은 고딕" w:hAnsi="맑은 고딕" w:eastAsia="맑은 고딕"/>
+          <w:b w:val="0"/>
+          <w:i w:val="0"/>
+          <w:color w:val="1A1A1A"/>
+          <w:sz w:val="22"/>
+        </w:rPr>
+        <w:t>『절대 흔들리지 않는 미국 주식 투자』는 홍보가 아니고, ‘미국은 빠지지 않는다’도 아닙니다. 결정 규칙입니다. 분석이 통하고 돈이 모이는 시장으로의 롱 편향이고, 댓글을 미리 받습니다.</w:t>
+      </w:r>
+    </w:p>
+    <w:p>
+      <w:pPr>
+        <w:spacing w:before="160" w:after="60"/>
+        <w:keepNext/>
+      </w:pPr>
+      <w:r>
+        <w:rPr>
+          <w:rFonts w:ascii="맑은 고딕" w:hAnsi="맑은 고딕" w:eastAsia="맑은 고딕"/>
+          <w:b/>
+          <w:i w:val="0"/>
+          <w:color w:val="0F2043"/>
+          <w:sz w:val="23"/>
+        </w:rPr>
+        <w:t>마린솔루션, 다른 시계</w:t>
+      </w:r>
+    </w:p>
+    <w:p>
+      <w:pPr>
+        <w:spacing w:after="50" w:before="0" w:line="276" w:lineRule="auto"/>
+        <w:ind w:left="312" w:hanging="198"/>
+      </w:pPr>
+      <w:r>
+        <w:rPr>
+          <w:rFonts w:ascii="맑은 고딕" w:hAnsi="맑은 고딕" w:eastAsia="맑은 고딕"/>
+          <w:b w:val="0"/>
+          <w:i w:val="0"/>
+          <w:color w:val="1E407C"/>
+          <w:sz w:val="22"/>
+        </w:rPr>
+        <w:t xml:space="preserve">• </w:t>
+      </w:r>
+      <w:r>
+        <w:rPr>
+          <w:rFonts w:ascii="맑은 고딕" w:hAnsi="맑은 고딕" w:eastAsia="맑은 고딕"/>
+          <w:b/>
+          <w:i w:val="0"/>
+          <w:color w:val="1A1A1A"/>
+          <w:sz w:val="22"/>
+        </w:rPr>
+        <w:t xml:space="preserve">시계. </w:t>
+      </w:r>
+      <w:r>
+        <w:rPr>
+          <w:rFonts w:ascii="맑은 고딕" w:hAnsi="맑은 고딕" w:eastAsia="맑은 고딕"/>
+          <w:b w:val="0"/>
+          <w:i w:val="0"/>
+          <w:color w:val="1A1A1A"/>
+          <w:sz w:val="22"/>
+        </w:rPr>
+        <w:t>급락일에 싣는 종목이 아닙니다. 다올 제목은 ‘Goltens를 품고, 이제 남의 배도 탐한다’. 목표 29만 원에서 31만 원, 상향 폭은 2만 원. 이미 떠 있는 배의 애프터마켓입니다. 애프터마켓·엔진 부품·그린 개조·운항 솔루션으로 나눕니다.</w:t>
+      </w:r>
+    </w:p>
+    <w:p>
+      <w:pPr>
+        <w:spacing w:after="50" w:before="0" w:line="276" w:lineRule="auto"/>
+        <w:ind w:left="312" w:hanging="198"/>
+      </w:pPr>
+      <w:r>
+        <w:rPr>
+          <w:rFonts w:ascii="맑은 고딕" w:hAnsi="맑은 고딕" w:eastAsia="맑은 고딕"/>
+          <w:b w:val="0"/>
+          <w:i w:val="0"/>
+          <w:color w:val="1E407C"/>
+          <w:sz w:val="22"/>
+        </w:rPr>
+        <w:t xml:space="preserve">• </w:t>
+      </w:r>
+      <w:r>
+        <w:rPr>
+          <w:rFonts w:ascii="맑은 고딕" w:hAnsi="맑은 고딕" w:eastAsia="맑은 고딕"/>
+          <w:b/>
+          <w:i w:val="0"/>
+          <w:color w:val="1A1A1A"/>
+          <w:sz w:val="22"/>
+        </w:rPr>
+        <w:t xml:space="preserve">마진의 분리. </w:t>
+      </w:r>
+      <w:r>
+        <w:rPr>
+          <w:rFonts w:ascii="맑은 고딕" w:hAnsi="맑은 고딕" w:eastAsia="맑은 고딕"/>
+          <w:b w:val="0"/>
+          <w:i w:val="0"/>
+          <w:color w:val="1A1A1A"/>
+          <w:sz w:val="22"/>
+        </w:rPr>
+        <w:t>벙커링은 매출의 30%대 후반, 최근 약 40%, 손익분기 근처. AM 영업이익률은 30%를 크게 넘습니다. 연결은 약 17%. 벙커 이익을 0으로 두면 코어는 20%대 후반. 2분기 매출 전년 약 +24%, 코어 약 +26%, 이익 약 +18%. 리드타임 3개월과 가격 전가. 3분기는 환율이 허들을 낮추는 구간이고, 증명이 시작되는 분기는 아닙니다. 분기 표(억 원으로 읽히나 PDF에 단위 표기가 없습니다)는 6장입니다.</w:t>
+      </w:r>
+    </w:p>
+    <w:p>
+      <w:pPr>
+        <w:spacing w:after="50" w:before="0" w:line="276" w:lineRule="auto"/>
+        <w:ind w:left="312" w:hanging="198"/>
+      </w:pPr>
+      <w:r>
+        <w:rPr>
+          <w:rFonts w:ascii="맑은 고딕" w:hAnsi="맑은 고딕" w:eastAsia="맑은 고딕"/>
+          <w:b w:val="0"/>
+          <w:i w:val="0"/>
+          <w:color w:val="1E407C"/>
+          <w:sz w:val="22"/>
+        </w:rPr>
+        <w:t xml:space="preserve">• </w:t>
+      </w:r>
+      <w:r>
+        <w:rPr>
+          <w:rFonts w:ascii="맑은 고딕" w:hAnsi="맑은 고딕" w:eastAsia="맑은 고딕"/>
+          <w:b/>
+          <w:i w:val="0"/>
+          <w:color w:val="1A1A1A"/>
+          <w:sz w:val="22"/>
+        </w:rPr>
+        <w:t xml:space="preserve">Goltens. </w:t>
+      </w:r>
+      <w:r>
+        <w:rPr>
+          <w:rFonts w:ascii="맑은 고딕" w:hAnsi="맑은 고딕" w:eastAsia="맑은 고딕"/>
+          <w:b w:val="0"/>
+          <w:i w:val="0"/>
+          <w:color w:val="1A1A1A"/>
+          <w:sz w:val="22"/>
+        </w:rPr>
+        <w:t>2억 5,000만 달러, 2025년 EBITDA의 약 15배. 매출 1억 5,100만 달러, EBITDA 1,650만 달러, 마진 약 11%라 15배는 현재 마진이 설명하지 못합니다. 가치는 교차판매, 자사 선박이 아닌 부품·솔루션, 반복 주문입니다. 거점은 노트 문구대로 15개국·28곳, 인원·고객은 1,300~2,300으로 적힌 그대로입니다.</w:t>
+      </w:r>
+    </w:p>
+    <w:p>
+      <w:pPr>
+        <w:spacing w:after="50" w:before="0" w:line="276" w:lineRule="auto"/>
+        <w:ind w:left="312" w:hanging="198"/>
+      </w:pPr>
+      <w:r>
+        <w:rPr>
+          <w:rFonts w:ascii="맑은 고딕" w:hAnsi="맑은 고딕" w:eastAsia="맑은 고딕"/>
+          <w:b w:val="0"/>
+          <w:i w:val="0"/>
+          <w:color w:val="1E407C"/>
+          <w:sz w:val="22"/>
+        </w:rPr>
+        <w:t xml:space="preserve">• </w:t>
+      </w:r>
+      <w:r>
+        <w:rPr>
+          <w:rFonts w:ascii="맑은 고딕" w:hAnsi="맑은 고딕" w:eastAsia="맑은 고딕"/>
+          <w:b/>
+          <w:i w:val="0"/>
+          <w:color w:val="1A1A1A"/>
+          <w:sz w:val="22"/>
+        </w:rPr>
+        <w:t xml:space="preserve">피어. </w:t>
+      </w:r>
+      <w:r>
+        <w:rPr>
+          <w:rFonts w:ascii="맑은 고딕" w:hAnsi="맑은 고딕" w:eastAsia="맑은 고딕"/>
+          <w:b w:val="0"/>
+          <w:i w:val="0"/>
+          <w:color w:val="1A1A1A"/>
+          <w:sz w:val="22"/>
+        </w:rPr>
+        <w:t>Wärtsilä 2025년 매출 69.14억 유로, 서비스 52%. 에너지 사업이 그룹을 흔듭니다. 페이지에 보이는 조각은 3개월 약 -2.9%, 현재 PER 약 25~29배, 선행은 별도 확인. Kongsberg Maritime 2025년 271억 노르웨이크로네, 애프터마켓 약 50%. 부품·벙커·개조를 한 묶음으로 둔 회사가 아니고, PER는 그 페이지에 없습니다. HD현대마린솔루션 2027년 컨센서스 PER 23배.</w:t>
       </w:r>
     </w:p>
     <w:p>
@@ -2141,7 +4311,7 @@
           <w:color w:val="1E407C"/>
           <w:sz w:val="26"/>
         </w:rPr>
-        <w:t>이번 주 확인 순서</w:t>
+        <w:t>같은 사실의 두 읽기</w:t>
       </w:r>
     </w:p>
     <w:tbl>
@@ -2160,9 +4330,8 @@
         </w:tblBorders>
       </w:tblPr>
       <w:tblGrid>
-        <w:gridCol w:w="3364"/>
-        <w:gridCol w:w="3364"/>
-        <w:gridCol w:w="3364"/>
+        <w:gridCol w:w="5046"/>
+        <w:gridCol w:w="5046"/>
       </w:tblGrid>
       <w:tr>
         <w:trPr>
@@ -2170,7 +4339,7 @@
         </w:trPr>
         <w:tc>
           <w:tcPr>
-            <w:tcW w:type="dxa" w:w="1020"/>
+            <w:tcW w:type="dxa" w:w="2041"/>
             <w:shd w:val="clear" w:color="auto" w:fill="0F2043"/>
             <w:tcMar>
               <w:top w:w="60" w:type="dxa"/>
@@ -2194,13 +4363,13 @@
                 <w:color w:val="FFFFFF"/>
                 <w:sz w:val="19"/>
               </w:rPr>
-              <w:t>순서</w:t>
-            </w:r>
-          </w:p>
-        </w:tc>
-        <w:tc>
-          <w:tcPr>
-            <w:tcW w:type="dxa" w:w="2948"/>
+              <w:t>사실</w:t>
+            </w:r>
+          </w:p>
+        </w:tc>
+        <w:tc>
+          <w:tcPr>
+            <w:tcW w:type="dxa" w:w="7937"/>
             <w:shd w:val="clear" w:color="auto" w:fill="0F2043"/>
             <w:tcMar>
               <w:top w:w="60" w:type="dxa"/>
@@ -2224,37 +4393,7 @@
                 <w:color w:val="FFFFFF"/>
                 <w:sz w:val="19"/>
               </w:rPr>
-              <w:t>이벤트</w:t>
-            </w:r>
-          </w:p>
-        </w:tc>
-        <w:tc>
-          <w:tcPr>
-            <w:tcW w:type="dxa" w:w="6009"/>
-            <w:shd w:val="clear" w:color="auto" w:fill="0F2043"/>
-            <w:tcMar>
-              <w:top w:w="60" w:type="dxa"/>
-              <w:left w:w="80" w:type="dxa"/>
-              <w:bottom w:w="60" w:type="dxa"/>
-              <w:right w:w="80" w:type="dxa"/>
-            </w:tcMar>
-          </w:tcPr>
-          <w:p>
-            <w:pPr>
-              <w:spacing w:before="0" w:after="0" w:line="269" w:lineRule="auto"/>
-              <w:jc w:val="center"/>
-              <w:keepNext/>
-            </w:pPr>
-            <w:r/>
-            <w:r>
-              <w:rPr>
-                <w:rFonts w:ascii="맑은 고딕" w:hAnsi="맑은 고딕" w:eastAsia="맑은 고딕"/>
-                <w:b/>
-                <w:i w:val="0"/>
-                <w:color w:val="FFFFFF"/>
-                <w:sz w:val="19"/>
-              </w:rPr>
-              <w:t>판단이 유지되거나 깨지는 자리</w:t>
+              <w:t>나란히 두는 읽기</w:t>
             </w:r>
           </w:p>
         </w:tc>
@@ -2265,7 +4404,7 @@
         </w:trPr>
         <w:tc>
           <w:tcPr>
-            <w:tcW w:type="dxa" w:w="1020"/>
+            <w:tcW w:type="dxa" w:w="2041"/>
             <w:shd w:val="clear" w:color="auto" w:fill="FFFFFF"/>
             <w:tcMar>
               <w:top w:w="60" w:type="dxa"/>
@@ -2288,13 +4427,13 @@
                 <w:color w:val="1A1A1A"/>
                 <w:sz w:val="19"/>
               </w:rPr>
-              <w:t>1</w:t>
-            </w:r>
-          </w:p>
-        </w:tc>
-        <w:tc>
-          <w:tcPr>
-            <w:tcW w:type="dxa" w:w="2948"/>
+              <w:t>광주·호남 팹</w:t>
+            </w:r>
+          </w:p>
+        </w:tc>
+        <w:tc>
+          <w:tcPr>
+            <w:tcW w:type="dxa" w:w="7937"/>
             <w:shd w:val="clear" w:color="auto" w:fill="FFFFFF"/>
             <w:tcMar>
               <w:top w:w="60" w:type="dxa"/>
@@ -2306,7 +4445,7 @@
           <w:p>
             <w:pPr>
               <w:spacing w:before="0" w:after="0" w:line="269" w:lineRule="auto"/>
-              <w:jc w:val="center"/>
+              <w:jc w:val="left"/>
             </w:pPr>
             <w:r/>
             <w:r>
@@ -2317,36 +4456,7 @@
                 <w:color w:val="1A1A1A"/>
                 <w:sz w:val="19"/>
               </w:rPr>
-              <w:t>14일 밤, 9월 CPI</w:t>
-            </w:r>
-          </w:p>
-        </w:tc>
-        <w:tc>
-          <w:tcPr>
-            <w:tcW w:type="dxa" w:w="6009"/>
-            <w:shd w:val="clear" w:color="auto" w:fill="FFFFFF"/>
-            <w:tcMar>
-              <w:top w:w="60" w:type="dxa"/>
-              <w:left w:w="80" w:type="dxa"/>
-              <w:bottom w:w="60" w:type="dxa"/>
-              <w:right w:w="80" w:type="dxa"/>
-            </w:tcMar>
-          </w:tcPr>
-          <w:p>
-            <w:pPr>
-              <w:spacing w:before="0" w:after="0" w:line="269" w:lineRule="auto"/>
-              <w:jc w:val="center"/>
-            </w:pPr>
-            <w:r/>
-            <w:r>
-              <w:rPr>
-                <w:rFonts w:ascii="맑은 고딕" w:hAnsi="맑은 고딕" w:eastAsia="맑은 고딕"/>
-                <w:b w:val="0"/>
-                <w:i w:val="0"/>
-                <w:color w:val="1A1A1A"/>
-                <w:sz w:val="19"/>
-              </w:rPr>
-              <w:t>10년물 기울기. 부합·상회면 할인율은 남고, 하회여도 장기물 하락은 제한될 수 있음</w:t>
+              <w:t>노근창은 장비 주문을 계속 말하라. 이춘광은 외국인이 정치가 고른 입지를 디스카운트로 듣는다.</w:t>
             </w:r>
           </w:p>
         </w:tc>
@@ -2357,7 +4467,7 @@
         </w:trPr>
         <w:tc>
           <w:tcPr>
-            <w:tcW w:type="dxa" w:w="1020"/>
+            <w:tcW w:type="dxa" w:w="2041"/>
             <w:shd w:val="clear" w:color="auto" w:fill="F7F9FC"/>
             <w:tcMar>
               <w:top w:w="60" w:type="dxa"/>
@@ -2380,13 +4490,13 @@
                 <w:color w:val="1A1A1A"/>
                 <w:sz w:val="19"/>
               </w:rPr>
-              <w:t>2</w:t>
-            </w:r>
-          </w:p>
-        </w:tc>
-        <w:tc>
-          <w:tcPr>
-            <w:tcW w:type="dxa" w:w="2948"/>
+              <w:t>10월 FOMC</w:t>
+            </w:r>
+          </w:p>
+        </w:tc>
+        <w:tc>
+          <w:tcPr>
+            <w:tcW w:type="dxa" w:w="7937"/>
             <w:shd w:val="clear" w:color="auto" w:fill="F7F9FC"/>
             <w:tcMar>
               <w:top w:w="60" w:type="dxa"/>
@@ -2398,7 +4508,7 @@
           <w:p>
             <w:pPr>
               <w:spacing w:before="0" w:after="0" w:line="269" w:lineRule="auto"/>
-              <w:jc w:val="center"/>
+              <w:jc w:val="left"/>
             </w:pPr>
             <w:r/>
             <w:r>
@@ -2409,36 +4519,7 @@
                 <w:color w:val="1A1A1A"/>
                 <w:sz w:val="19"/>
               </w:rPr>
-              <w:t>국장 되돌림</w:t>
-            </w:r>
-          </w:p>
-        </w:tc>
-        <w:tc>
-          <w:tcPr>
-            <w:tcW w:type="dxa" w:w="6009"/>
-            <w:shd w:val="clear" w:color="auto" w:fill="F7F9FC"/>
-            <w:tcMar>
-              <w:top w:w="60" w:type="dxa"/>
-              <w:left w:w="80" w:type="dxa"/>
-              <w:bottom w:w="60" w:type="dxa"/>
-              <w:right w:w="80" w:type="dxa"/>
-            </w:tcMar>
-          </w:tcPr>
-          <w:p>
-            <w:pPr>
-              <w:spacing w:before="0" w:after="0" w:line="269" w:lineRule="auto"/>
-              <w:jc w:val="center"/>
-            </w:pPr>
-            <w:r/>
-            <w:r>
-              <w:rPr>
-                <w:rFonts w:ascii="맑은 고딕" w:hAnsi="맑은 고딕" w:eastAsia="맑은 고딕"/>
-                <w:b w:val="0"/>
-                <w:i w:val="0"/>
-                <w:color w:val="1A1A1A"/>
-                <w:sz w:val="19"/>
-              </w:rPr>
-              <w:t>6,600 박스와 11일선 위로 복귀하면 보수 모드를 거둠. 복귀 실패는 6,000을 열어 둠</w:t>
+              <w:t>이춘광은 인상 뒤 12월 동결. 노근창은 유가 급등이 없으면 동결. 이주현은 큰 CPI 상회가 없으면 동결이 다수. 셋의 공통은 9월이 보험이었다는 점, 지금부터 영원히 동결은 아니라는 점.</w:t>
             </w:r>
           </w:p>
         </w:tc>
@@ -2449,7 +4530,7 @@
         </w:trPr>
         <w:tc>
           <w:tcPr>
-            <w:tcW w:type="dxa" w:w="1020"/>
+            <w:tcW w:type="dxa" w:w="2041"/>
             <w:shd w:val="clear" w:color="auto" w:fill="FFFFFF"/>
             <w:tcMar>
               <w:top w:w="60" w:type="dxa"/>
@@ -2472,13 +4553,13 @@
                 <w:color w:val="1A1A1A"/>
                 <w:sz w:val="19"/>
               </w:rPr>
-              <w:t>3</w:t>
-            </w:r>
-          </w:p>
-        </w:tc>
-        <w:tc>
-          <w:tcPr>
-            <w:tcW w:type="dxa" w:w="2948"/>
+              <w:t>릭 라이더</w:t>
+            </w:r>
+          </w:p>
+        </w:tc>
+        <w:tc>
+          <w:tcPr>
+            <w:tcW w:type="dxa" w:w="7937"/>
             <w:shd w:val="clear" w:color="auto" w:fill="FFFFFF"/>
             <w:tcMar>
               <w:top w:w="60" w:type="dxa"/>
@@ -2490,7 +4571,7 @@
           <w:p>
             <w:pPr>
               <w:spacing w:before="0" w:after="0" w:line="269" w:lineRule="auto"/>
-              <w:jc w:val="center"/>
+              <w:jc w:val="left"/>
             </w:pPr>
             <w:r/>
             <w:r>
@@ -2501,36 +4582,7 @@
                 <w:color w:val="1A1A1A"/>
                 <w:sz w:val="19"/>
               </w:rPr>
-              <w:t>이번 주 TSMC 달러 실적</w:t>
-            </w:r>
-          </w:p>
-        </w:tc>
-        <w:tc>
-          <w:tcPr>
-            <w:tcW w:type="dxa" w:w="6009"/>
-            <w:shd w:val="clear" w:color="auto" w:fill="FFFFFF"/>
-            <w:tcMar>
-              <w:top w:w="60" w:type="dxa"/>
-              <w:left w:w="80" w:type="dxa"/>
-              <w:bottom w:w="60" w:type="dxa"/>
-              <w:right w:w="80" w:type="dxa"/>
-            </w:tcMar>
-          </w:tcPr>
-          <w:p>
-            <w:pPr>
-              <w:spacing w:before="0" w:after="0" w:line="269" w:lineRule="auto"/>
-              <w:jc w:val="center"/>
-            </w:pPr>
-            <w:r/>
-            <w:r>
-              <w:rPr>
-                <w:rFonts w:ascii="맑은 고딕" w:hAnsi="맑은 고딕" w:eastAsia="맑은 고딕"/>
-                <w:b w:val="0"/>
-                <w:i w:val="0"/>
-                <w:color w:val="1A1A1A"/>
-                <w:sz w:val="19"/>
-              </w:rPr>
-              <w:t>가이던스 상단 13.9%. 가속기 수요를 중복 없이 확인하는 자리</w:t>
+              <w:t>아픈 쪽의 읽기: 최대 채권 하우스가 아프다. 이춘광의 읽기: 정책 풋이 말해질 수 있게 됐다. 본인 입에서 YCC는 나오지 않았다. 진행은 ‘누구 좋으라고’를 붙인다.</w:t>
             </w:r>
           </w:p>
         </w:tc>
@@ -2541,7 +4593,7 @@
         </w:trPr>
         <w:tc>
           <w:tcPr>
-            <w:tcW w:type="dxa" w:w="1020"/>
+            <w:tcW w:type="dxa" w:w="2041"/>
             <w:shd w:val="clear" w:color="auto" w:fill="F7F9FC"/>
             <w:tcMar>
               <w:top w:w="60" w:type="dxa"/>
@@ -2564,13 +4616,13 @@
                 <w:color w:val="1A1A1A"/>
                 <w:sz w:val="19"/>
               </w:rPr>
-              <w:t>4</w:t>
-            </w:r>
-          </w:p>
-        </w:tc>
-        <w:tc>
-          <w:tcPr>
-            <w:tcW w:type="dxa" w:w="2948"/>
+              <w:t>채권이 싼 구간</w:t>
+            </w:r>
+          </w:p>
+        </w:tc>
+        <w:tc>
+          <w:tcPr>
+            <w:tcW w:type="dxa" w:w="7937"/>
             <w:shd w:val="clear" w:color="auto" w:fill="F7F9FC"/>
             <w:tcMar>
               <w:top w:w="60" w:type="dxa"/>
@@ -2582,7 +4634,7 @@
           <w:p>
             <w:pPr>
               <w:spacing w:before="0" w:after="0" w:line="269" w:lineRule="auto"/>
-              <w:jc w:val="center"/>
+              <w:jc w:val="left"/>
             </w:pPr>
             <w:r/>
             <w:r>
@@ -2593,36 +4645,7 @@
                 <w:color w:val="1A1A1A"/>
                 <w:sz w:val="19"/>
               </w:rPr>
-              <w:t>10월 말 하이퍼스케일러</w:t>
-            </w:r>
-          </w:p>
-        </w:tc>
-        <w:tc>
-          <w:tcPr>
-            <w:tcW w:type="dxa" w:w="6009"/>
-            <w:shd w:val="clear" w:color="auto" w:fill="F7F9FC"/>
-            <w:tcMar>
-              <w:top w:w="60" w:type="dxa"/>
-              <w:left w:w="80" w:type="dxa"/>
-              <w:bottom w:w="60" w:type="dxa"/>
-              <w:right w:w="80" w:type="dxa"/>
-            </w:tcMar>
-          </w:tcPr>
-          <w:p>
-            <w:pPr>
-              <w:spacing w:before="0" w:after="0" w:line="269" w:lineRule="auto"/>
-              <w:jc w:val="center"/>
-            </w:pPr>
-            <w:r/>
-            <w:r>
-              <w:rPr>
-                <w:rFonts w:ascii="맑은 고딕" w:hAnsi="맑은 고딕" w:eastAsia="맑은 고딕"/>
-                <w:b w:val="0"/>
-                <w:i w:val="0"/>
-                <w:color w:val="1A1A1A"/>
-                <w:sz w:val="19"/>
-              </w:rPr>
-              <w:t>프리캐시플로, 선수금, 2년 뒤 부킹. 삼성 실적보다 수요의 돈줄</w:t>
+              <w:t>살 수 있는 영역. 주식에서는 같은 시각에 자금이 빠진다. 진행은 금리 하락 환영조차 안전자산 도피로 의심한다. 풀이 다른 돈이다.</w:t>
             </w:r>
           </w:p>
         </w:tc>
@@ -2633,7 +4656,7 @@
         </w:trPr>
         <w:tc>
           <w:tcPr>
-            <w:tcW w:type="dxa" w:w="1020"/>
+            <w:tcW w:type="dxa" w:w="2041"/>
             <w:shd w:val="clear" w:color="auto" w:fill="FFFFFF"/>
             <w:tcMar>
               <w:top w:w="60" w:type="dxa"/>
@@ -2656,13 +4679,13 @@
                 <w:color w:val="1A1A1A"/>
                 <w:sz w:val="19"/>
               </w:rPr>
-              <w:t>5</w:t>
-            </w:r>
-          </w:p>
-        </w:tc>
-        <w:tc>
-          <w:tcPr>
-            <w:tcW w:type="dxa" w:w="2948"/>
+              <w:t>YCC</w:t>
+            </w:r>
+          </w:p>
+        </w:tc>
+        <w:tc>
+          <w:tcPr>
+            <w:tcW w:type="dxa" w:w="7937"/>
             <w:shd w:val="clear" w:color="auto" w:fill="FFFFFF"/>
             <w:tcMar>
               <w:top w:w="60" w:type="dxa"/>
@@ -2674,7 +4697,617 @@
           <w:p>
             <w:pPr>
               <w:spacing w:before="0" w:after="0" w:line="269" w:lineRule="auto"/>
+              <w:jc w:val="left"/>
+            </w:pPr>
+            <w:r/>
+            <w:r>
+              <w:rPr>
+                <w:rFonts w:ascii="맑은 고딕" w:hAnsi="맑은 고딕" w:eastAsia="맑은 고딕"/>
+                <w:b w:val="0"/>
+                <w:i w:val="0"/>
+                <w:color w:val="1A1A1A"/>
+                <w:sz w:val="19"/>
+              </w:rPr>
+              <w:t>진행: 무너지기 전의 개입은 이미 들어간 사람의 고통을 나눈다. 이춘광: 트위스트가 앞이고, YCC·QE는 2022년 물가를 재연한다.</w:t>
+            </w:r>
+          </w:p>
+        </w:tc>
+      </w:tr>
+      <w:tr>
+        <w:trPr>
+          <w:cantSplit/>
+        </w:trPr>
+        <w:tc>
+          <w:tcPr>
+            <w:tcW w:type="dxa" w:w="2041"/>
+            <w:shd w:val="clear" w:color="auto" w:fill="F7F9FC"/>
+            <w:tcMar>
+              <w:top w:w="60" w:type="dxa"/>
+              <w:left w:w="80" w:type="dxa"/>
+              <w:bottom w:w="60" w:type="dxa"/>
+              <w:right w:w="80" w:type="dxa"/>
+            </w:tcMar>
+          </w:tcPr>
+          <w:p>
+            <w:pPr>
+              <w:spacing w:before="0" w:after="0" w:line="269" w:lineRule="auto"/>
+              <w:jc w:val="left"/>
+            </w:pPr>
+            <w:r/>
+            <w:r>
+              <w:rPr>
+                <w:rFonts w:ascii="맑은 고딕" w:hAnsi="맑은 고딕" w:eastAsia="맑은 고딕"/>
+                <w:b/>
+                <w:i w:val="0"/>
+                <w:color w:val="1A1A1A"/>
+                <w:sz w:val="19"/>
+              </w:rPr>
+              <w:t>국장 탈출은 지능순</w:t>
+            </w:r>
+          </w:p>
+        </w:tc>
+        <w:tc>
+          <w:tcPr>
+            <w:tcW w:type="dxa" w:w="7937"/>
+            <w:shd w:val="clear" w:color="auto" w:fill="F7F9FC"/>
+            <w:tcMar>
+              <w:top w:w="60" w:type="dxa"/>
+              <w:left w:w="80" w:type="dxa"/>
+              <w:bottom w:w="60" w:type="dxa"/>
+              <w:right w:w="80" w:type="dxa"/>
+            </w:tcMar>
+          </w:tcPr>
+          <w:p>
+            <w:pPr>
+              <w:spacing w:before="0" w:after="0" w:line="269" w:lineRule="auto"/>
+              <w:jc w:val="left"/>
+            </w:pPr>
+            <w:r/>
+            <w:r>
+              <w:rPr>
+                <w:rFonts w:ascii="맑은 고딕" w:hAnsi="맑은 고딕" w:eastAsia="맑은 고딕"/>
+                <w:b w:val="0"/>
+                <w:i w:val="0"/>
+                <w:color w:val="1A1A1A"/>
+                <w:sz w:val="19"/>
+              </w:rPr>
+              <w:t>바닥 근처의 말버릇. 동시에, 미국으로 가도 같은 AI 복합체면 등급이 오르지 않는다.</w:t>
+            </w:r>
+          </w:p>
+        </w:tc>
+      </w:tr>
+      <w:tr>
+        <w:trPr>
+          <w:cantSplit/>
+        </w:trPr>
+        <w:tc>
+          <w:tcPr>
+            <w:tcW w:type="dxa" w:w="2041"/>
+            <w:shd w:val="clear" w:color="auto" w:fill="FFFFFF"/>
+            <w:tcMar>
+              <w:top w:w="60" w:type="dxa"/>
+              <w:left w:w="80" w:type="dxa"/>
+              <w:bottom w:w="60" w:type="dxa"/>
+              <w:right w:w="80" w:type="dxa"/>
+            </w:tcMar>
+          </w:tcPr>
+          <w:p>
+            <w:pPr>
+              <w:spacing w:before="0" w:after="0" w:line="269" w:lineRule="auto"/>
+              <w:jc w:val="left"/>
+            </w:pPr>
+            <w:r/>
+            <w:r>
+              <w:rPr>
+                <w:rFonts w:ascii="맑은 고딕" w:hAnsi="맑은 고딕" w:eastAsia="맑은 고딕"/>
+                <w:b/>
+                <w:i w:val="0"/>
+                <w:color w:val="1A1A1A"/>
+                <w:sz w:val="19"/>
+              </w:rPr>
+              <w:t>삼성 24.5만·27만</w:t>
+            </w:r>
+          </w:p>
+        </w:tc>
+        <w:tc>
+          <w:tcPr>
+            <w:tcW w:type="dxa" w:w="7937"/>
+            <w:shd w:val="clear" w:color="auto" w:fill="FFFFFF"/>
+            <w:tcMar>
+              <w:top w:w="60" w:type="dxa"/>
+              <w:left w:w="80" w:type="dxa"/>
+              <w:bottom w:w="60" w:type="dxa"/>
+              <w:right w:w="80" w:type="dxa"/>
+            </w:tcMar>
+          </w:tcPr>
+          <w:p>
+            <w:pPr>
+              <w:spacing w:before="0" w:after="0" w:line="269" w:lineRule="auto"/>
+              <w:jc w:val="left"/>
+            </w:pPr>
+            <w:r/>
+            <w:r>
+              <w:rPr>
+                <w:rFonts w:ascii="맑은 고딕" w:hAnsi="맑은 고딕" w:eastAsia="맑은 고딕"/>
+                <w:b w:val="0"/>
+                <w:i w:val="0"/>
+                <w:color w:val="1A1A1A"/>
+                <w:sz w:val="19"/>
+              </w:rPr>
+              <w:t>27만 원 아래라 먹을 게 없다. 24.5만 원은 바이백이 끝나 자동 지지가 아니다. 22~23만 원은 여유 현금의 스케줄이다.</w:t>
+            </w:r>
+          </w:p>
+        </w:tc>
+      </w:tr>
+      <w:tr>
+        <w:trPr>
+          <w:cantSplit/>
+        </w:trPr>
+        <w:tc>
+          <w:tcPr>
+            <w:tcW w:type="dxa" w:w="2041"/>
+            <w:shd w:val="clear" w:color="auto" w:fill="F7F9FC"/>
+            <w:tcMar>
+              <w:top w:w="60" w:type="dxa"/>
+              <w:left w:w="80" w:type="dxa"/>
+              <w:bottom w:w="60" w:type="dxa"/>
+              <w:right w:w="80" w:type="dxa"/>
+            </w:tcMar>
+          </w:tcPr>
+          <w:p>
+            <w:pPr>
+              <w:spacing w:before="0" w:after="0" w:line="269" w:lineRule="auto"/>
+              <w:jc w:val="left"/>
+            </w:pPr>
+            <w:r/>
+            <w:r>
+              <w:rPr>
+                <w:rFonts w:ascii="맑은 고딕" w:hAnsi="맑은 고딕" w:eastAsia="맑은 고딕"/>
+                <w:b/>
+                <w:i w:val="0"/>
+                <w:color w:val="1A1A1A"/>
+                <w:sz w:val="19"/>
+              </w:rPr>
+              <w:t>2021년, 다 팔자</w:t>
+            </w:r>
+          </w:p>
+        </w:tc>
+        <w:tc>
+          <w:tcPr>
+            <w:tcW w:type="dxa" w:w="7937"/>
+            <w:shd w:val="clear" w:color="auto" w:fill="F7F9FC"/>
+            <w:tcMar>
+              <w:top w:w="60" w:type="dxa"/>
+              <w:left w:w="80" w:type="dxa"/>
+              <w:bottom w:w="60" w:type="dxa"/>
+              <w:right w:w="80" w:type="dxa"/>
+            </w:tcMar>
+          </w:tcPr>
+          <w:p>
+            <w:pPr>
+              <w:spacing w:before="0" w:after="0" w:line="269" w:lineRule="auto"/>
+              <w:jc w:val="left"/>
+            </w:pPr>
+            <w:r/>
+            <w:r>
+              <w:rPr>
+                <w:rFonts w:ascii="맑은 고딕" w:hAnsi="맑은 고딕" w:eastAsia="맑은 고딕"/>
+                <w:b w:val="0"/>
+                <w:i w:val="0"/>
+                <w:color w:val="1A1A1A"/>
+                <w:sz w:val="19"/>
+              </w:rPr>
+              <w:t>그 문장을 지금 붙이지 않는다. AI·전력의 성장은 살아 있고, 시험은 기다리는 돈을 댈 수 있는가이다.</w:t>
+            </w:r>
+          </w:p>
+        </w:tc>
+      </w:tr>
+      <w:tr>
+        <w:trPr>
+          <w:cantSplit/>
+        </w:trPr>
+        <w:tc>
+          <w:tcPr>
+            <w:tcW w:type="dxa" w:w="2041"/>
+            <w:shd w:val="clear" w:color="auto" w:fill="FFFFFF"/>
+            <w:tcMar>
+              <w:top w:w="60" w:type="dxa"/>
+              <w:left w:w="80" w:type="dxa"/>
+              <w:bottom w:w="60" w:type="dxa"/>
+              <w:right w:w="80" w:type="dxa"/>
+            </w:tcMar>
+          </w:tcPr>
+          <w:p>
+            <w:pPr>
+              <w:spacing w:before="0" w:after="0" w:line="269" w:lineRule="auto"/>
+              <w:jc w:val="left"/>
+            </w:pPr>
+            <w:r/>
+            <w:r>
+              <w:rPr>
+                <w:rFonts w:ascii="맑은 고딕" w:hAnsi="맑은 고딕" w:eastAsia="맑은 고딕"/>
+                <w:b/>
+                <w:i w:val="0"/>
+                <w:color w:val="1A1A1A"/>
+                <w:sz w:val="19"/>
+              </w:rPr>
+              <w:t>4분기 84%</w:t>
+            </w:r>
+          </w:p>
+        </w:tc>
+        <w:tc>
+          <w:tcPr>
+            <w:tcW w:type="dxa" w:w="7937"/>
+            <w:shd w:val="clear" w:color="auto" w:fill="FFFFFF"/>
+            <w:tcMar>
+              <w:top w:w="60" w:type="dxa"/>
+              <w:left w:w="80" w:type="dxa"/>
+              <w:bottom w:w="60" w:type="dxa"/>
+              <w:right w:w="80" w:type="dxa"/>
+            </w:tcMar>
+          </w:tcPr>
+          <w:p>
+            <w:pPr>
+              <w:spacing w:before="0" w:after="0" w:line="269" w:lineRule="auto"/>
+              <w:jc w:val="left"/>
+            </w:pPr>
+            <w:r/>
+            <w:r>
+              <w:rPr>
+                <w:rFonts w:ascii="맑은 고딕" w:hAnsi="맑은 고딕" w:eastAsia="맑은 고딕"/>
+                <w:b w:val="0"/>
+                <w:i w:val="0"/>
+                <w:color w:val="1A1A1A"/>
+                <w:sz w:val="19"/>
+              </w:rPr>
+              <w:t>박병창이 인용한다. 레임덕은 새 국면이라, 그 통계로 하락을 사지 않는다.</w:t>
+            </w:r>
+          </w:p>
+        </w:tc>
+      </w:tr>
+      <w:tr>
+        <w:trPr>
+          <w:cantSplit/>
+        </w:trPr>
+        <w:tc>
+          <w:tcPr>
+            <w:tcW w:type="dxa" w:w="2041"/>
+            <w:shd w:val="clear" w:color="auto" w:fill="F7F9FC"/>
+            <w:tcMar>
+              <w:top w:w="60" w:type="dxa"/>
+              <w:left w:w="80" w:type="dxa"/>
+              <w:bottom w:w="60" w:type="dxa"/>
+              <w:right w:w="80" w:type="dxa"/>
+            </w:tcMar>
+          </w:tcPr>
+          <w:p>
+            <w:pPr>
+              <w:spacing w:before="0" w:after="0" w:line="269" w:lineRule="auto"/>
+              <w:jc w:val="left"/>
+            </w:pPr>
+            <w:r/>
+            <w:r>
+              <w:rPr>
+                <w:rFonts w:ascii="맑은 고딕" w:hAnsi="맑은 고딕" w:eastAsia="맑은 고딕"/>
+                <w:b/>
+                <w:i w:val="0"/>
+                <w:color w:val="1A1A1A"/>
+                <w:sz w:val="19"/>
+              </w:rPr>
+              <w:t>자산주가 오름</w:t>
+            </w:r>
+          </w:p>
+        </w:tc>
+        <w:tc>
+          <w:tcPr>
+            <w:tcW w:type="dxa" w:w="7937"/>
+            <w:shd w:val="clear" w:color="auto" w:fill="F7F9FC"/>
+            <w:tcMar>
+              <w:top w:w="60" w:type="dxa"/>
+              <w:left w:w="80" w:type="dxa"/>
+              <w:bottom w:w="60" w:type="dxa"/>
+              <w:right w:w="80" w:type="dxa"/>
+            </w:tcMar>
+          </w:tcPr>
+          <w:p>
+            <w:pPr>
+              <w:spacing w:before="0" w:after="0" w:line="269" w:lineRule="auto"/>
+              <w:jc w:val="left"/>
+            </w:pPr>
+            <w:r/>
+            <w:r>
+              <w:rPr>
+                <w:rFonts w:ascii="맑은 고딕" w:hAnsi="맑은 고딕" w:eastAsia="맑은 고딕"/>
+                <w:b w:val="0"/>
+                <w:i w:val="0"/>
+                <w:color w:val="1A1A1A"/>
+                <w:sz w:val="19"/>
+              </w:rPr>
+              <w:t>실적이 좋아서 오르는 그림이 아니다. 강세의 끝, 세척의 초입에 ‘죽어도 땅이 준다’는 심리다.</w:t>
+            </w:r>
+          </w:p>
+        </w:tc>
+      </w:tr>
+      <w:tr>
+        <w:trPr>
+          <w:cantSplit/>
+        </w:trPr>
+        <w:tc>
+          <w:tcPr>
+            <w:tcW w:type="dxa" w:w="2041"/>
+            <w:shd w:val="clear" w:color="auto" w:fill="FFFFFF"/>
+            <w:tcMar>
+              <w:top w:w="60" w:type="dxa"/>
+              <w:left w:w="80" w:type="dxa"/>
+              <w:bottom w:w="60" w:type="dxa"/>
+              <w:right w:w="80" w:type="dxa"/>
+            </w:tcMar>
+          </w:tcPr>
+          <w:p>
+            <w:pPr>
+              <w:spacing w:before="0" w:after="0" w:line="269" w:lineRule="auto"/>
+              <w:jc w:val="left"/>
+            </w:pPr>
+            <w:r/>
+            <w:r>
+              <w:rPr>
+                <w:rFonts w:ascii="맑은 고딕" w:hAnsi="맑은 고딕" w:eastAsia="맑은 고딕"/>
+                <w:b/>
+                <w:i w:val="0"/>
+                <w:color w:val="1A1A1A"/>
+                <w:sz w:val="19"/>
+              </w:rPr>
+              <w:t>회사채 스프레드</w:t>
+            </w:r>
+          </w:p>
+        </w:tc>
+        <w:tc>
+          <w:tcPr>
+            <w:tcW w:type="dxa" w:w="7937"/>
+            <w:shd w:val="clear" w:color="auto" w:fill="FFFFFF"/>
+            <w:tcMar>
+              <w:top w:w="60" w:type="dxa"/>
+              <w:left w:w="80" w:type="dxa"/>
+              <w:bottom w:w="60" w:type="dxa"/>
+              <w:right w:w="80" w:type="dxa"/>
+            </w:tcMar>
+          </w:tcPr>
+          <w:p>
+            <w:pPr>
+              <w:spacing w:before="0" w:after="0" w:line="269" w:lineRule="auto"/>
+              <w:jc w:val="left"/>
+            </w:pPr>
+            <w:r/>
+            <w:r>
+              <w:rPr>
+                <w:rFonts w:ascii="맑은 고딕" w:hAnsi="맑은 고딕" w:eastAsia="맑은 고딕"/>
+                <w:b w:val="0"/>
+                <w:i w:val="0"/>
+                <w:color w:val="1A1A1A"/>
+                <w:sz w:val="19"/>
+              </w:rPr>
+              <w:t>국채 금리를 밀어 올린 원인. 동시에 신용 수요가 살아 있다는 증거.</w:t>
+            </w:r>
+          </w:p>
+        </w:tc>
+      </w:tr>
+      <w:tr>
+        <w:trPr>
+          <w:cantSplit/>
+        </w:trPr>
+        <w:tc>
+          <w:tcPr>
+            <w:tcW w:type="dxa" w:w="2041"/>
+            <w:shd w:val="clear" w:color="auto" w:fill="F7F9FC"/>
+            <w:tcMar>
+              <w:top w:w="60" w:type="dxa"/>
+              <w:left w:w="80" w:type="dxa"/>
+              <w:bottom w:w="60" w:type="dxa"/>
+              <w:right w:w="80" w:type="dxa"/>
+            </w:tcMar>
+          </w:tcPr>
+          <w:p>
+            <w:pPr>
+              <w:spacing w:before="0" w:after="0" w:line="269" w:lineRule="auto"/>
+              <w:jc w:val="left"/>
+            </w:pPr>
+            <w:r/>
+            <w:r>
+              <w:rPr>
+                <w:rFonts w:ascii="맑은 고딕" w:hAnsi="맑은 고딕" w:eastAsia="맑은 고딕"/>
+                <w:b/>
+                <w:i w:val="0"/>
+                <w:color w:val="1A1A1A"/>
+                <w:sz w:val="19"/>
+              </w:rPr>
+              <w:t>재무부 바이백</w:t>
+            </w:r>
+          </w:p>
+        </w:tc>
+        <w:tc>
+          <w:tcPr>
+            <w:tcW w:type="dxa" w:w="7937"/>
+            <w:shd w:val="clear" w:color="auto" w:fill="F7F9FC"/>
+            <w:tcMar>
+              <w:top w:w="60" w:type="dxa"/>
+              <w:left w:w="80" w:type="dxa"/>
+              <w:bottom w:w="60" w:type="dxa"/>
+              <w:right w:w="80" w:type="dxa"/>
+            </w:tcMar>
+          </w:tcPr>
+          <w:p>
+            <w:pPr>
+              <w:spacing w:before="0" w:after="0" w:line="269" w:lineRule="auto"/>
+              <w:jc w:val="left"/>
+            </w:pPr>
+            <w:r/>
+            <w:r>
+              <w:rPr>
+                <w:rFonts w:ascii="맑은 고딕" w:hAnsi="맑은 고딕" w:eastAsia="맑은 고딕"/>
+                <w:b w:val="0"/>
+                <w:i w:val="0"/>
+                <w:color w:val="1A1A1A"/>
+                <w:sz w:val="19"/>
+              </w:rPr>
+              <w:t>이춘광: 외면하지 않겠다는 신호, 규모는 7월 해외 매도보다 작다. 진행: 베센트는 장기물 끝을 놓쳤다.</w:t>
+            </w:r>
+          </w:p>
+        </w:tc>
+      </w:tr>
+    </w:tbl>
+    <w:p>
+      <w:pPr>
+        <w:spacing w:after="160" w:before="40"/>
+      </w:pPr>
+    </w:p>
+    <w:p>
+      <w:pPr>
+        <w:spacing w:before="200" w:after="80"/>
+        <w:keepNext/>
+      </w:pPr>
+      <w:r>
+        <w:rPr>
+          <w:rFonts w:ascii="맑은 고딕" w:hAnsi="맑은 고딕" w:eastAsia="맑은 고딕"/>
+          <w:b/>
+          <w:i w:val="0"/>
+          <w:color w:val="1E407C"/>
+          <w:sz w:val="26"/>
+        </w:rPr>
+        <w:t>화자가 보라고 한 자리</w:t>
+      </w:r>
+    </w:p>
+    <w:tbl>
+      <w:tblPr>
+        <w:tblW w:type="auto" w:w="0"/>
+        <w:jc w:val="center"/>
+        <w:tblLayout w:type="autofit"/>
+        <w:tblLook w:firstColumn="1" w:firstRow="1" w:lastColumn="0" w:lastRow="0" w:noHBand="0" w:noVBand="1" w:val="04A0"/>
+        <w:tblBorders>
+          <w:top w:val="single" w:sz="4" w:space="0" w:color="D5DCE6"/>
+          <w:left w:val="single" w:sz="4" w:space="0" w:color="D5DCE6"/>
+          <w:bottom w:val="single" w:sz="4" w:space="0" w:color="D5DCE6"/>
+          <w:right w:val="single" w:sz="4" w:space="0" w:color="D5DCE6"/>
+          <w:insideH w:val="single" w:sz="4" w:space="0" w:color="D5DCE6"/>
+          <w:insideV w:val="single" w:sz="4" w:space="0" w:color="D5DCE6"/>
+        </w:tblBorders>
+      </w:tblPr>
+      <w:tblGrid>
+        <w:gridCol w:w="5046"/>
+        <w:gridCol w:w="5046"/>
+      </w:tblGrid>
+      <w:tr>
+        <w:trPr>
+          <w:cantSplit/>
+        </w:trPr>
+        <w:tc>
+          <w:tcPr>
+            <w:tcW w:type="dxa" w:w="2494"/>
+            <w:shd w:val="clear" w:color="auto" w:fill="0F2043"/>
+            <w:tcMar>
+              <w:top w:w="60" w:type="dxa"/>
+              <w:left w:w="80" w:type="dxa"/>
+              <w:bottom w:w="60" w:type="dxa"/>
+              <w:right w:w="80" w:type="dxa"/>
+            </w:tcMar>
+          </w:tcPr>
+          <w:p>
+            <w:pPr>
+              <w:spacing w:before="0" w:after="0" w:line="269" w:lineRule="auto"/>
               <w:jc w:val="center"/>
+              <w:keepNext/>
+            </w:pPr>
+            <w:r/>
+            <w:r>
+              <w:rPr>
+                <w:rFonts w:ascii="맑은 고딕" w:hAnsi="맑은 고딕" w:eastAsia="맑은 고딕"/>
+                <w:b/>
+                <w:i w:val="0"/>
+                <w:color w:val="FFFFFF"/>
+                <w:sz w:val="19"/>
+              </w:rPr>
+              <w:t>자리</w:t>
+            </w:r>
+          </w:p>
+        </w:tc>
+        <w:tc>
+          <w:tcPr>
+            <w:tcW w:type="dxa" w:w="7483"/>
+            <w:shd w:val="clear" w:color="auto" w:fill="0F2043"/>
+            <w:tcMar>
+              <w:top w:w="60" w:type="dxa"/>
+              <w:left w:w="80" w:type="dxa"/>
+              <w:bottom w:w="60" w:type="dxa"/>
+              <w:right w:w="80" w:type="dxa"/>
+            </w:tcMar>
+          </w:tcPr>
+          <w:p>
+            <w:pPr>
+              <w:spacing w:before="0" w:after="0" w:line="269" w:lineRule="auto"/>
+              <w:jc w:val="center"/>
+              <w:keepNext/>
+            </w:pPr>
+            <w:r/>
+            <w:r>
+              <w:rPr>
+                <w:rFonts w:ascii="맑은 고딕" w:hAnsi="맑은 고딕" w:eastAsia="맑은 고딕"/>
+                <w:b/>
+                <w:i w:val="0"/>
+                <w:color w:val="FFFFFF"/>
+                <w:sz w:val="19"/>
+              </w:rPr>
+              <w:t>화자가 거기 둔 말</w:t>
+            </w:r>
+          </w:p>
+        </w:tc>
+      </w:tr>
+      <w:tr>
+        <w:trPr>
+          <w:cantSplit/>
+        </w:trPr>
+        <w:tc>
+          <w:tcPr>
+            <w:tcW w:type="dxa" w:w="2494"/>
+            <w:shd w:val="clear" w:color="auto" w:fill="FFFFFF"/>
+            <w:tcMar>
+              <w:top w:w="60" w:type="dxa"/>
+              <w:left w:w="80" w:type="dxa"/>
+              <w:bottom w:w="60" w:type="dxa"/>
+              <w:right w:w="80" w:type="dxa"/>
+            </w:tcMar>
+          </w:tcPr>
+          <w:p>
+            <w:pPr>
+              <w:spacing w:before="0" w:after="0" w:line="269" w:lineRule="auto"/>
+              <w:jc w:val="left"/>
+            </w:pPr>
+            <w:r/>
+            <w:r>
+              <w:rPr>
+                <w:rFonts w:ascii="맑은 고딕" w:hAnsi="맑은 고딕" w:eastAsia="맑은 고딕"/>
+                <w:b/>
+                <w:i w:val="0"/>
+                <w:color w:val="1A1A1A"/>
+                <w:sz w:val="19"/>
+              </w:rPr>
+              <w:t>14일 밤, 9월 CPI</w:t>
+            </w:r>
+          </w:p>
+        </w:tc>
+        <w:tc>
+          <w:tcPr>
+            <w:tcW w:type="dxa" w:w="7483"/>
+            <w:shd w:val="clear" w:color="auto" w:fill="FFFFFF"/>
+            <w:tcMar>
+              <w:top w:w="60" w:type="dxa"/>
+              <w:left w:w="80" w:type="dxa"/>
+              <w:bottom w:w="60" w:type="dxa"/>
+              <w:right w:w="80" w:type="dxa"/>
+            </w:tcMar>
+          </w:tcPr>
+          <w:p>
+            <w:pPr>
+              <w:spacing w:before="0" w:after="0" w:line="269" w:lineRule="auto"/>
+              <w:jc w:val="left"/>
             </w:pPr>
             <w:r/>
             <w:r>
@@ -2685,13 +5318,81 @@
                 <w:color w:val="1A1A1A"/>
                 <w:sz w:val="19"/>
               </w:rPr>
-              <w:t>10/27~28 FOMC</w:t>
-            </w:r>
-          </w:p>
-        </w:tc>
-        <w:tc>
-          <w:tcPr>
-            <w:tcW w:type="dxa" w:w="6009"/>
+              <w:t>10년물 기울기. 부합·상회면 할인율은 남고, 하회여도 실질금리가 버티면 장기물 하락은 제한될 수 있다.</w:t>
+            </w:r>
+          </w:p>
+        </w:tc>
+      </w:tr>
+      <w:tr>
+        <w:trPr>
+          <w:cantSplit/>
+        </w:trPr>
+        <w:tc>
+          <w:tcPr>
+            <w:tcW w:type="dxa" w:w="2494"/>
+            <w:shd w:val="clear" w:color="auto" w:fill="F7F9FC"/>
+            <w:tcMar>
+              <w:top w:w="60" w:type="dxa"/>
+              <w:left w:w="80" w:type="dxa"/>
+              <w:bottom w:w="60" w:type="dxa"/>
+              <w:right w:w="80" w:type="dxa"/>
+            </w:tcMar>
+          </w:tcPr>
+          <w:p>
+            <w:pPr>
+              <w:spacing w:before="0" w:after="0" w:line="269" w:lineRule="auto"/>
+              <w:jc w:val="left"/>
+            </w:pPr>
+            <w:r/>
+            <w:r>
+              <w:rPr>
+                <w:rFonts w:ascii="맑은 고딕" w:hAnsi="맑은 고딕" w:eastAsia="맑은 고딕"/>
+                <w:b/>
+                <w:i w:val="0"/>
+                <w:color w:val="1A1A1A"/>
+                <w:sz w:val="19"/>
+              </w:rPr>
+              <w:t>국장의 되돌림</w:t>
+            </w:r>
+          </w:p>
+        </w:tc>
+        <w:tc>
+          <w:tcPr>
+            <w:tcW w:type="dxa" w:w="7483"/>
+            <w:shd w:val="clear" w:color="auto" w:fill="F7F9FC"/>
+            <w:tcMar>
+              <w:top w:w="60" w:type="dxa"/>
+              <w:left w:w="80" w:type="dxa"/>
+              <w:bottom w:w="60" w:type="dxa"/>
+              <w:right w:w="80" w:type="dxa"/>
+            </w:tcMar>
+          </w:tcPr>
+          <w:p>
+            <w:pPr>
+              <w:spacing w:before="0" w:after="0" w:line="269" w:lineRule="auto"/>
+              <w:jc w:val="left"/>
+            </w:pPr>
+            <w:r/>
+            <w:r>
+              <w:rPr>
+                <w:rFonts w:ascii="맑은 고딕" w:hAnsi="맑은 고딕" w:eastAsia="맑은 고딕"/>
+                <w:b w:val="0"/>
+                <w:i w:val="0"/>
+                <w:color w:val="1A1A1A"/>
+                <w:sz w:val="19"/>
+              </w:rPr>
+              <w:t>6,600과 11일선 위로 돌아오면 보수 모드를 거둔다. 복귀가 실패하면 6,000이 열려 있다. 결심의 자리는 당일이 아니라 이 되돌림이다.</w:t>
+            </w:r>
+          </w:p>
+        </w:tc>
+      </w:tr>
+      <w:tr>
+        <w:trPr>
+          <w:cantSplit/>
+        </w:trPr>
+        <w:tc>
+          <w:tcPr>
+            <w:tcW w:type="dxa" w:w="2494"/>
             <w:shd w:val="clear" w:color="auto" w:fill="FFFFFF"/>
             <w:tcMar>
               <w:top w:w="60" w:type="dxa"/>
@@ -2703,7 +5404,36 @@
           <w:p>
             <w:pPr>
               <w:spacing w:before="0" w:after="0" w:line="269" w:lineRule="auto"/>
-              <w:jc w:val="center"/>
+              <w:jc w:val="left"/>
+            </w:pPr>
+            <w:r/>
+            <w:r>
+              <w:rPr>
+                <w:rFonts w:ascii="맑은 고딕" w:hAnsi="맑은 고딕" w:eastAsia="맑은 고딕"/>
+                <w:b/>
+                <w:i w:val="0"/>
+                <w:color w:val="1A1A1A"/>
+                <w:sz w:val="19"/>
+              </w:rPr>
+              <w:t>이번 주 TSMC</w:t>
+            </w:r>
+          </w:p>
+        </w:tc>
+        <w:tc>
+          <w:tcPr>
+            <w:tcW w:type="dxa" w:w="7483"/>
+            <w:shd w:val="clear" w:color="auto" w:fill="FFFFFF"/>
+            <w:tcMar>
+              <w:top w:w="60" w:type="dxa"/>
+              <w:left w:w="80" w:type="dxa"/>
+              <w:bottom w:w="60" w:type="dxa"/>
+              <w:right w:w="80" w:type="dxa"/>
+            </w:tcMar>
+          </w:tcPr>
+          <w:p>
+            <w:pPr>
+              <w:spacing w:before="0" w:after="0" w:line="269" w:lineRule="auto"/>
+              <w:jc w:val="left"/>
             </w:pPr>
             <w:r/>
             <w:r>
@@ -2714,7 +5444,259 @@
                 <w:color w:val="1A1A1A"/>
                 <w:sz w:val="19"/>
               </w:rPr>
-              <w:t>보험 인상을 마무리하는 문장인지, 한 번 더인지. 확률은 동결 우세, 시각은 분열</w:t>
+              <w:t>달러 기준, 가이던스 상단 13.9%. 가속기 수요를 중복 없이 보는 자리. 12일과 15일이 방송에 같이 나왔으니 달력을 확인한다.</w:t>
+            </w:r>
+          </w:p>
+        </w:tc>
+      </w:tr>
+      <w:tr>
+        <w:trPr>
+          <w:cantSplit/>
+        </w:trPr>
+        <w:tc>
+          <w:tcPr>
+            <w:tcW w:type="dxa" w:w="2494"/>
+            <w:shd w:val="clear" w:color="auto" w:fill="F7F9FC"/>
+            <w:tcMar>
+              <w:top w:w="60" w:type="dxa"/>
+              <w:left w:w="80" w:type="dxa"/>
+              <w:bottom w:w="60" w:type="dxa"/>
+              <w:right w:w="80" w:type="dxa"/>
+            </w:tcMar>
+          </w:tcPr>
+          <w:p>
+            <w:pPr>
+              <w:spacing w:before="0" w:after="0" w:line="269" w:lineRule="auto"/>
+              <w:jc w:val="left"/>
+            </w:pPr>
+            <w:r/>
+            <w:r>
+              <w:rPr>
+                <w:rFonts w:ascii="맑은 고딕" w:hAnsi="맑은 고딕" w:eastAsia="맑은 고딕"/>
+                <w:b/>
+                <w:i w:val="0"/>
+                <w:color w:val="1A1A1A"/>
+                <w:sz w:val="19"/>
+              </w:rPr>
+              <w:t>10월 말 하이퍼스케일러</w:t>
+            </w:r>
+          </w:p>
+        </w:tc>
+        <w:tc>
+          <w:tcPr>
+            <w:tcW w:type="dxa" w:w="7483"/>
+            <w:shd w:val="clear" w:color="auto" w:fill="F7F9FC"/>
+            <w:tcMar>
+              <w:top w:w="60" w:type="dxa"/>
+              <w:left w:w="80" w:type="dxa"/>
+              <w:bottom w:w="60" w:type="dxa"/>
+              <w:right w:w="80" w:type="dxa"/>
+            </w:tcMar>
+          </w:tcPr>
+          <w:p>
+            <w:pPr>
+              <w:spacing w:before="0" w:after="0" w:line="269" w:lineRule="auto"/>
+              <w:jc w:val="left"/>
+            </w:pPr>
+            <w:r/>
+            <w:r>
+              <w:rPr>
+                <w:rFonts w:ascii="맑은 고딕" w:hAnsi="맑은 고딕" w:eastAsia="맑은 고딕"/>
+                <w:b w:val="0"/>
+                <w:i w:val="0"/>
+                <w:color w:val="1A1A1A"/>
+                <w:sz w:val="19"/>
+              </w:rPr>
+              <w:t>프리캐시플로, 선수금, 2년 뒤 부킹. 삼성 실적보다 수요의 돈줄.</w:t>
+            </w:r>
+          </w:p>
+        </w:tc>
+      </w:tr>
+      <w:tr>
+        <w:trPr>
+          <w:cantSplit/>
+        </w:trPr>
+        <w:tc>
+          <w:tcPr>
+            <w:tcW w:type="dxa" w:w="2494"/>
+            <w:shd w:val="clear" w:color="auto" w:fill="FFFFFF"/>
+            <w:tcMar>
+              <w:top w:w="60" w:type="dxa"/>
+              <w:left w:w="80" w:type="dxa"/>
+              <w:bottom w:w="60" w:type="dxa"/>
+              <w:right w:w="80" w:type="dxa"/>
+            </w:tcMar>
+          </w:tcPr>
+          <w:p>
+            <w:pPr>
+              <w:spacing w:before="0" w:after="0" w:line="269" w:lineRule="auto"/>
+              <w:jc w:val="left"/>
+            </w:pPr>
+            <w:r/>
+            <w:r>
+              <w:rPr>
+                <w:rFonts w:ascii="맑은 고딕" w:hAnsi="맑은 고딕" w:eastAsia="맑은 고딕"/>
+                <w:b/>
+                <w:i w:val="0"/>
+                <w:color w:val="1A1A1A"/>
+                <w:sz w:val="19"/>
+              </w:rPr>
+              <w:t>10월 27~28일 FOMC</w:t>
+            </w:r>
+          </w:p>
+        </w:tc>
+        <w:tc>
+          <w:tcPr>
+            <w:tcW w:type="dxa" w:w="7483"/>
+            <w:shd w:val="clear" w:color="auto" w:fill="FFFFFF"/>
+            <w:tcMar>
+              <w:top w:w="60" w:type="dxa"/>
+              <w:left w:w="80" w:type="dxa"/>
+              <w:bottom w:w="60" w:type="dxa"/>
+              <w:right w:w="80" w:type="dxa"/>
+            </w:tcMar>
+          </w:tcPr>
+          <w:p>
+            <w:pPr>
+              <w:spacing w:before="0" w:after="0" w:line="269" w:lineRule="auto"/>
+              <w:jc w:val="left"/>
+            </w:pPr>
+            <w:r/>
+            <w:r>
+              <w:rPr>
+                <w:rFonts w:ascii="맑은 고딕" w:hAnsi="맑은 고딕" w:eastAsia="맑은 고딕"/>
+                <w:b w:val="0"/>
+                <w:i w:val="0"/>
+                <w:color w:val="1A1A1A"/>
+                <w:sz w:val="19"/>
+              </w:rPr>
+              <w:t>보험 인상을 마무리하는 문장인지, 한 번 더인지. 확률은 동결이 우세하고, 시각은 이춘광·노근창·이주현이 갈린다.</w:t>
+            </w:r>
+          </w:p>
+        </w:tc>
+      </w:tr>
+      <w:tr>
+        <w:trPr>
+          <w:cantSplit/>
+        </w:trPr>
+        <w:tc>
+          <w:tcPr>
+            <w:tcW w:type="dxa" w:w="2494"/>
+            <w:shd w:val="clear" w:color="auto" w:fill="F7F9FC"/>
+            <w:tcMar>
+              <w:top w:w="60" w:type="dxa"/>
+              <w:left w:w="80" w:type="dxa"/>
+              <w:bottom w:w="60" w:type="dxa"/>
+              <w:right w:w="80" w:type="dxa"/>
+            </w:tcMar>
+          </w:tcPr>
+          <w:p>
+            <w:pPr>
+              <w:spacing w:before="0" w:after="0" w:line="269" w:lineRule="auto"/>
+              <w:jc w:val="left"/>
+            </w:pPr>
+            <w:r/>
+            <w:r>
+              <w:rPr>
+                <w:rFonts w:ascii="맑은 고딕" w:hAnsi="맑은 고딕" w:eastAsia="맑은 고딕"/>
+                <w:b/>
+                <w:i w:val="0"/>
+                <w:color w:val="1A1A1A"/>
+                <w:sz w:val="19"/>
+              </w:rPr>
+              <w:t>중순, 8월 TIC</w:t>
+            </w:r>
+          </w:p>
+        </w:tc>
+        <w:tc>
+          <w:tcPr>
+            <w:tcW w:type="dxa" w:w="7483"/>
+            <w:shd w:val="clear" w:color="auto" w:fill="F7F9FC"/>
+            <w:tcMar>
+              <w:top w:w="60" w:type="dxa"/>
+              <w:left w:w="80" w:type="dxa"/>
+              <w:bottom w:w="60" w:type="dxa"/>
+              <w:right w:w="80" w:type="dxa"/>
+            </w:tcMar>
+          </w:tcPr>
+          <w:p>
+            <w:pPr>
+              <w:spacing w:before="0" w:after="0" w:line="269" w:lineRule="auto"/>
+              <w:jc w:val="left"/>
+            </w:pPr>
+            <w:r/>
+            <w:r>
+              <w:rPr>
+                <w:rFonts w:ascii="맑은 고딕" w:hAnsi="맑은 고딕" w:eastAsia="맑은 고딕"/>
+                <w:b w:val="0"/>
+                <w:i w:val="0"/>
+                <w:color w:val="1A1A1A"/>
+                <w:sz w:val="19"/>
+              </w:rPr>
+              <w:t>7월 1,200억 달러 순매도의 다음 달.</w:t>
+            </w:r>
+          </w:p>
+        </w:tc>
+      </w:tr>
+      <w:tr>
+        <w:trPr>
+          <w:cantSplit/>
+        </w:trPr>
+        <w:tc>
+          <w:tcPr>
+            <w:tcW w:type="dxa" w:w="2494"/>
+            <w:shd w:val="clear" w:color="auto" w:fill="FFFFFF"/>
+            <w:tcMar>
+              <w:top w:w="60" w:type="dxa"/>
+              <w:left w:w="80" w:type="dxa"/>
+              <w:bottom w:w="60" w:type="dxa"/>
+              <w:right w:w="80" w:type="dxa"/>
+            </w:tcMar>
+          </w:tcPr>
+          <w:p>
+            <w:pPr>
+              <w:spacing w:before="0" w:after="0" w:line="269" w:lineRule="auto"/>
+              <w:jc w:val="left"/>
+            </w:pPr>
+            <w:r/>
+            <w:r>
+              <w:rPr>
+                <w:rFonts w:ascii="맑은 고딕" w:hAnsi="맑은 고딕" w:eastAsia="맑은 고딕"/>
+                <w:b/>
+                <w:i w:val="0"/>
+                <w:color w:val="1A1A1A"/>
+                <w:sz w:val="19"/>
+              </w:rPr>
+              <w:t>12월 24일</w:t>
+            </w:r>
+          </w:p>
+        </w:tc>
+        <w:tc>
+          <w:tcPr>
+            <w:tcW w:type="dxa" w:w="7483"/>
+            <w:shd w:val="clear" w:color="auto" w:fill="FFFFFF"/>
+            <w:tcMar>
+              <w:top w:w="60" w:type="dxa"/>
+              <w:left w:w="80" w:type="dxa"/>
+              <w:bottom w:w="60" w:type="dxa"/>
+              <w:right w:w="80" w:type="dxa"/>
+            </w:tcMar>
+          </w:tcPr>
+          <w:p>
+            <w:pPr>
+              <w:spacing w:before="0" w:after="0" w:line="269" w:lineRule="auto"/>
+              <w:jc w:val="left"/>
+            </w:pPr>
+            <w:r/>
+            <w:r>
+              <w:rPr>
+                <w:rFonts w:ascii="맑은 고딕" w:hAnsi="맑은 고딕" w:eastAsia="맑은 고딕"/>
+                <w:b w:val="0"/>
+                <w:i w:val="0"/>
+                <w:color w:val="1A1A1A"/>
+                <w:sz w:val="19"/>
+              </w:rPr>
+              <w:t>목요일. 달력은 일요일 외에 빨간 날이 없고, 진행은 그 공백에 집중해서 달리자는 톤을 얹는다.</w:t>
             </w:r>
           </w:p>
         </w:tc>
@@ -2738,7 +5720,7 @@
           <w:color w:val="1A1A1A"/>
           <w:sz w:val="22"/>
         </w:rPr>
-        <w:t>마린솔루션의 목표주가 31만 원, Goltens 15배, 벙커링 BEP는 이 순서 밖에 있습니다. 오늘 지수를 방어하는 재료가 아니고, 떠 있는 배의 정비 매출을 보는 자리입니다.</w:t>
+        <w:t>마린솔루션의 31만 원, Goltens 15배, 벙커링 손익분기는 이 달력 밖에 있습니다. 오늘 지수를 방어하는 재료가 아니고, 떠 있는 배의 정비 매출을 보는 자리입니다.</w:t>
       </w:r>
     </w:p>
     <w:p>

</xml_diff>